<commit_message>
change font of Features List.docx to Segoe UI
</commit_message>
<xml_diff>
--- a/Documents/Features List.docx
+++ b/Documents/Features List.docx
@@ -6,6 +6,7 @@
       <w:pPr>
         <w:jc w:val="center"/>
         <w:rPr>
+          <w:rFonts w:ascii="Segoe UI" w:hAnsi="Segoe UI" w:cs="Segoe UI"/>
           <w:sz w:val="40"/>
           <w:lang w:val="en-US"/>
         </w:rPr>
@@ -13,6 +14,7 @@
       <w:proofErr w:type="spellStart"/>
       <w:r>
         <w:rPr>
+          <w:rFonts w:ascii="Segoe UI" w:hAnsi="Segoe UI" w:cs="Segoe UI"/>
           <w:sz w:val="40"/>
           <w:lang w:val="en-US"/>
         </w:rPr>
@@ -21,6 +23,7 @@
       <w:proofErr w:type="spellEnd"/>
       <w:r>
         <w:rPr>
+          <w:rFonts w:ascii="Segoe UI" w:hAnsi="Segoe UI" w:cs="Segoe UI"/>
           <w:sz w:val="40"/>
           <w:lang w:val="en-US"/>
         </w:rPr>
@@ -30,6 +33,7 @@
       <w:proofErr w:type="gramStart"/>
       <w:r>
         <w:rPr>
+          <w:rFonts w:ascii="Segoe UI" w:hAnsi="Segoe UI" w:cs="Segoe UI"/>
           <w:sz w:val="40"/>
           <w:lang w:val="en-US"/>
         </w:rPr>
@@ -39,6 +43,7 @@
       <w:proofErr w:type="gramEnd"/>
       <w:r>
         <w:rPr>
+          <w:rFonts w:ascii="Segoe UI" w:hAnsi="Segoe UI" w:cs="Segoe UI"/>
           <w:sz w:val="40"/>
           <w:lang w:val="en-US"/>
         </w:rPr>
@@ -47,6 +52,7 @@
       <w:proofErr w:type="spellStart"/>
       <w:r>
         <w:rPr>
+          <w:rFonts w:ascii="Segoe UI" w:hAnsi="Segoe UI" w:cs="Segoe UI"/>
           <w:sz w:val="40"/>
           <w:lang w:val="en-US"/>
         </w:rPr>
@@ -55,6 +61,7 @@
       <w:proofErr w:type="spellEnd"/>
       <w:r>
         <w:rPr>
+          <w:rFonts w:ascii="Segoe UI" w:hAnsi="Segoe UI" w:cs="Segoe UI"/>
           <w:sz w:val="40"/>
           <w:lang w:val="en-US"/>
         </w:rPr>
@@ -63,6 +70,7 @@
       <w:proofErr w:type="spellStart"/>
       <w:r>
         <w:rPr>
+          <w:rFonts w:ascii="Segoe UI" w:hAnsi="Segoe UI" w:cs="Segoe UI"/>
           <w:sz w:val="40"/>
           <w:lang w:val="en-US"/>
         </w:rPr>
@@ -74,6 +82,7 @@
       <w:pPr>
         <w:jc w:val="center"/>
         <w:rPr>
+          <w:rFonts w:ascii="Segoe UI" w:hAnsi="Segoe UI" w:cs="Segoe UI"/>
           <w:sz w:val="34"/>
           <w:lang w:val="en-US"/>
         </w:rPr>
@@ -81,6 +90,7 @@
       <w:proofErr w:type="spellStart"/>
       <w:r>
         <w:rPr>
+          <w:rFonts w:ascii="Segoe UI" w:hAnsi="Segoe UI" w:cs="Segoe UI"/>
           <w:sz w:val="34"/>
           <w:lang w:val="en-US"/>
         </w:rPr>
@@ -89,6 +99,7 @@
       <w:proofErr w:type="spellEnd"/>
       <w:r>
         <w:rPr>
+          <w:rFonts w:ascii="Segoe UI" w:hAnsi="Segoe UI" w:cs="Segoe UI"/>
           <w:sz w:val="34"/>
           <w:lang w:val="en-US"/>
         </w:rPr>
@@ -97,6 +108,7 @@
       <w:proofErr w:type="spellStart"/>
       <w:r>
         <w:rPr>
+          <w:rFonts w:ascii="Segoe UI" w:hAnsi="Segoe UI" w:cs="Segoe UI"/>
           <w:sz w:val="34"/>
           <w:lang w:val="en-US"/>
         </w:rPr>
@@ -105,6 +117,7 @@
       <w:proofErr w:type="spellEnd"/>
       <w:r>
         <w:rPr>
+          <w:rFonts w:ascii="Segoe UI" w:hAnsi="Segoe UI" w:cs="Segoe UI"/>
           <w:sz w:val="34"/>
           <w:lang w:val="en-US"/>
         </w:rPr>
@@ -114,21 +127,26 @@
     <w:p>
       <w:pPr>
         <w:rPr>
+          <w:rFonts w:ascii="Segoe UI" w:hAnsi="Segoe UI" w:cs="Segoe UI"/>
           <w:sz w:val="34"/>
           <w:lang w:val="en-US"/>
         </w:rPr>
       </w:pPr>
+      <w:bookmarkStart w:id="0" w:name="_GoBack"/>
+      <w:bookmarkEnd w:id="0"/>
     </w:p>
     <w:p>
       <w:pPr>
         <w:rPr>
-          <w:sz w:val="24"/>
-          <w:lang w:val="en-US"/>
-        </w:rPr>
-      </w:pPr>
-      <w:proofErr w:type="spellStart"/>
-      <w:r>
-        <w:rPr>
+          <w:rFonts w:ascii="Segoe UI" w:hAnsi="Segoe UI" w:cs="Segoe UI"/>
+          <w:sz w:val="24"/>
+          <w:lang w:val="en-US"/>
+        </w:rPr>
+      </w:pPr>
+      <w:proofErr w:type="spellStart"/>
+      <w:r>
+        <w:rPr>
+          <w:rFonts w:ascii="Segoe UI" w:hAnsi="Segoe UI" w:cs="Segoe UI"/>
           <w:sz w:val="24"/>
           <w:lang w:val="en-US"/>
         </w:rPr>
@@ -137,14 +155,16 @@
       <w:proofErr w:type="spellEnd"/>
       <w:r>
         <w:rPr>
-          <w:sz w:val="24"/>
-          <w:lang w:val="en-US"/>
-        </w:rPr>
-        <w:t xml:space="preserve"> </w:t>
-      </w:r>
-      <w:proofErr w:type="spellStart"/>
-      <w:r>
-        <w:rPr>
+          <w:rFonts w:ascii="Segoe UI" w:hAnsi="Segoe UI" w:cs="Segoe UI"/>
+          <w:sz w:val="24"/>
+          <w:lang w:val="en-US"/>
+        </w:rPr>
+        <w:t xml:space="preserve"> </w:t>
+      </w:r>
+      <w:proofErr w:type="spellStart"/>
+      <w:r>
+        <w:rPr>
+          <w:rFonts w:ascii="Segoe UI" w:hAnsi="Segoe UI" w:cs="Segoe UI"/>
           <w:sz w:val="24"/>
           <w:lang w:val="en-US"/>
         </w:rPr>
@@ -153,14 +173,16 @@
       <w:proofErr w:type="spellEnd"/>
       <w:r>
         <w:rPr>
-          <w:sz w:val="24"/>
-          <w:lang w:val="en-US"/>
-        </w:rPr>
-        <w:t xml:space="preserve"> </w:t>
-      </w:r>
-      <w:proofErr w:type="spellStart"/>
-      <w:r>
-        <w:rPr>
+          <w:rFonts w:ascii="Segoe UI" w:hAnsi="Segoe UI" w:cs="Segoe UI"/>
+          <w:sz w:val="24"/>
+          <w:lang w:val="en-US"/>
+        </w:rPr>
+        <w:t xml:space="preserve"> </w:t>
+      </w:r>
+      <w:proofErr w:type="spellStart"/>
+      <w:r>
+        <w:rPr>
+          <w:rFonts w:ascii="Segoe UI" w:hAnsi="Segoe UI" w:cs="Segoe UI"/>
           <w:sz w:val="24"/>
           <w:lang w:val="en-US"/>
         </w:rPr>
@@ -169,14 +191,16 @@
       <w:proofErr w:type="spellEnd"/>
       <w:r>
         <w:rPr>
-          <w:sz w:val="24"/>
-          <w:lang w:val="en-US"/>
-        </w:rPr>
-        <w:t xml:space="preserve"> </w:t>
-      </w:r>
-      <w:proofErr w:type="spellStart"/>
-      <w:r>
-        <w:rPr>
+          <w:rFonts w:ascii="Segoe UI" w:hAnsi="Segoe UI" w:cs="Segoe UI"/>
+          <w:sz w:val="24"/>
+          <w:lang w:val="en-US"/>
+        </w:rPr>
+        <w:t xml:space="preserve"> </w:t>
+      </w:r>
+      <w:proofErr w:type="spellStart"/>
+      <w:r>
+        <w:rPr>
+          <w:rFonts w:ascii="Segoe UI" w:hAnsi="Segoe UI" w:cs="Segoe UI"/>
           <w:sz w:val="24"/>
           <w:lang w:val="en-US"/>
         </w:rPr>
@@ -185,14 +209,16 @@
       <w:proofErr w:type="spellEnd"/>
       <w:r>
         <w:rPr>
-          <w:sz w:val="24"/>
-          <w:lang w:val="en-US"/>
-        </w:rPr>
-        <w:t xml:space="preserve"> </w:t>
-      </w:r>
-      <w:proofErr w:type="spellStart"/>
-      <w:r>
-        <w:rPr>
+          <w:rFonts w:ascii="Segoe UI" w:hAnsi="Segoe UI" w:cs="Segoe UI"/>
+          <w:sz w:val="24"/>
+          <w:lang w:val="en-US"/>
+        </w:rPr>
+        <w:t xml:space="preserve"> </w:t>
+      </w:r>
+      <w:proofErr w:type="spellStart"/>
+      <w:r>
+        <w:rPr>
+          <w:rFonts w:ascii="Segoe UI" w:hAnsi="Segoe UI" w:cs="Segoe UI"/>
           <w:sz w:val="24"/>
           <w:lang w:val="en-US"/>
         </w:rPr>
@@ -201,14 +227,16 @@
       <w:proofErr w:type="spellEnd"/>
       <w:r>
         <w:rPr>
-          <w:sz w:val="24"/>
-          <w:lang w:val="en-US"/>
-        </w:rPr>
-        <w:t xml:space="preserve"> </w:t>
-      </w:r>
-      <w:proofErr w:type="spellStart"/>
-      <w:r>
-        <w:rPr>
+          <w:rFonts w:ascii="Segoe UI" w:hAnsi="Segoe UI" w:cs="Segoe UI"/>
+          <w:sz w:val="24"/>
+          <w:lang w:val="en-US"/>
+        </w:rPr>
+        <w:t xml:space="preserve"> </w:t>
+      </w:r>
+      <w:proofErr w:type="spellStart"/>
+      <w:r>
+        <w:rPr>
+          <w:rFonts w:ascii="Segoe UI" w:hAnsi="Segoe UI" w:cs="Segoe UI"/>
           <w:sz w:val="24"/>
           <w:lang w:val="en-US"/>
         </w:rPr>
@@ -217,14 +245,16 @@
       <w:proofErr w:type="spellEnd"/>
       <w:r>
         <w:rPr>
-          <w:sz w:val="24"/>
-          <w:lang w:val="en-US"/>
-        </w:rPr>
-        <w:t xml:space="preserve"> </w:t>
-      </w:r>
-      <w:proofErr w:type="spellStart"/>
-      <w:r>
-        <w:rPr>
+          <w:rFonts w:ascii="Segoe UI" w:hAnsi="Segoe UI" w:cs="Segoe UI"/>
+          <w:sz w:val="24"/>
+          <w:lang w:val="en-US"/>
+        </w:rPr>
+        <w:t xml:space="preserve"> </w:t>
+      </w:r>
+      <w:proofErr w:type="spellStart"/>
+      <w:r>
+        <w:rPr>
+          <w:rFonts w:ascii="Segoe UI" w:hAnsi="Segoe UI" w:cs="Segoe UI"/>
           <w:sz w:val="24"/>
           <w:lang w:val="en-US"/>
         </w:rPr>
@@ -233,14 +263,16 @@
       <w:proofErr w:type="spellEnd"/>
       <w:r>
         <w:rPr>
-          <w:sz w:val="24"/>
-          <w:lang w:val="en-US"/>
-        </w:rPr>
-        <w:t xml:space="preserve"> </w:t>
-      </w:r>
-      <w:proofErr w:type="spellStart"/>
-      <w:r>
-        <w:rPr>
+          <w:rFonts w:ascii="Segoe UI" w:hAnsi="Segoe UI" w:cs="Segoe UI"/>
+          <w:sz w:val="24"/>
+          <w:lang w:val="en-US"/>
+        </w:rPr>
+        <w:t xml:space="preserve"> </w:t>
+      </w:r>
+      <w:proofErr w:type="spellStart"/>
+      <w:r>
+        <w:rPr>
+          <w:rFonts w:ascii="Segoe UI" w:hAnsi="Segoe UI" w:cs="Segoe UI"/>
           <w:sz w:val="24"/>
           <w:lang w:val="en-US"/>
         </w:rPr>
@@ -249,14 +281,16 @@
       <w:proofErr w:type="spellEnd"/>
       <w:r>
         <w:rPr>
-          <w:sz w:val="24"/>
-          <w:lang w:val="en-US"/>
-        </w:rPr>
-        <w:t xml:space="preserve"> </w:t>
-      </w:r>
-      <w:proofErr w:type="spellStart"/>
-      <w:r>
-        <w:rPr>
+          <w:rFonts w:ascii="Segoe UI" w:hAnsi="Segoe UI" w:cs="Segoe UI"/>
+          <w:sz w:val="24"/>
+          <w:lang w:val="en-US"/>
+        </w:rPr>
+        <w:t xml:space="preserve"> </w:t>
+      </w:r>
+      <w:proofErr w:type="spellStart"/>
+      <w:r>
+        <w:rPr>
+          <w:rFonts w:ascii="Segoe UI" w:hAnsi="Segoe UI" w:cs="Segoe UI"/>
           <w:sz w:val="24"/>
           <w:lang w:val="en-US"/>
         </w:rPr>
@@ -265,14 +299,16 @@
       <w:proofErr w:type="spellEnd"/>
       <w:r>
         <w:rPr>
-          <w:sz w:val="24"/>
-          <w:lang w:val="en-US"/>
-        </w:rPr>
-        <w:t xml:space="preserve"> </w:t>
-      </w:r>
-      <w:proofErr w:type="spellStart"/>
-      <w:r>
-        <w:rPr>
+          <w:rFonts w:ascii="Segoe UI" w:hAnsi="Segoe UI" w:cs="Segoe UI"/>
+          <w:sz w:val="24"/>
+          <w:lang w:val="en-US"/>
+        </w:rPr>
+        <w:t xml:space="preserve"> </w:t>
+      </w:r>
+      <w:proofErr w:type="spellStart"/>
+      <w:r>
+        <w:rPr>
+          <w:rFonts w:ascii="Segoe UI" w:hAnsi="Segoe UI" w:cs="Segoe UI"/>
           <w:sz w:val="24"/>
           <w:lang w:val="en-US"/>
         </w:rPr>
@@ -288,13 +324,15 @@
           <w:numId w:val="3"/>
         </w:numPr>
         <w:rPr>
-          <w:sz w:val="24"/>
-          <w:lang w:val="en-US"/>
-        </w:rPr>
-      </w:pPr>
-      <w:proofErr w:type="spellStart"/>
-      <w:r>
-        <w:rPr>
+          <w:rFonts w:ascii="Segoe UI" w:hAnsi="Segoe UI" w:cs="Segoe UI"/>
+          <w:sz w:val="24"/>
+          <w:lang w:val="en-US"/>
+        </w:rPr>
+      </w:pPr>
+      <w:proofErr w:type="spellStart"/>
+      <w:r>
+        <w:rPr>
+          <w:rFonts w:ascii="Segoe UI" w:hAnsi="Segoe UI" w:cs="Segoe UI"/>
           <w:sz w:val="24"/>
           <w:u w:val="single"/>
           <w:lang w:val="en-US"/>
@@ -304,6 +342,7 @@
       <w:proofErr w:type="spellEnd"/>
       <w:r>
         <w:rPr>
+          <w:rFonts w:ascii="Segoe UI" w:hAnsi="Segoe UI" w:cs="Segoe UI"/>
           <w:sz w:val="24"/>
           <w:u w:val="single"/>
           <w:lang w:val="en-US"/>
@@ -313,6 +352,7 @@
       <w:proofErr w:type="spellStart"/>
       <w:r>
         <w:rPr>
+          <w:rFonts w:ascii="Segoe UI" w:hAnsi="Segoe UI" w:cs="Segoe UI"/>
           <w:sz w:val="24"/>
           <w:u w:val="single"/>
           <w:lang w:val="en-US"/>
@@ -322,6 +362,7 @@
       <w:proofErr w:type="spellEnd"/>
       <w:r>
         <w:rPr>
+          <w:rFonts w:ascii="Segoe UI" w:hAnsi="Segoe UI" w:cs="Segoe UI"/>
           <w:sz w:val="24"/>
           <w:u w:val="single"/>
           <w:lang w:val="en-US"/>
@@ -331,6 +372,7 @@
       <w:proofErr w:type="spellStart"/>
       <w:r>
         <w:rPr>
+          <w:rFonts w:ascii="Segoe UI" w:hAnsi="Segoe UI" w:cs="Segoe UI"/>
           <w:sz w:val="24"/>
           <w:u w:val="single"/>
           <w:lang w:val="en-US"/>
@@ -340,6 +382,7 @@
       <w:proofErr w:type="spellEnd"/>
       <w:r>
         <w:rPr>
+          <w:rFonts w:ascii="Segoe UI" w:hAnsi="Segoe UI" w:cs="Segoe UI"/>
           <w:sz w:val="24"/>
           <w:u w:val="single"/>
           <w:lang w:val="en-US"/>
@@ -355,6 +398,7 @@
           <w:numId w:val="2"/>
         </w:numPr>
         <w:rPr>
+          <w:rFonts w:ascii="Segoe UI" w:hAnsi="Segoe UI" w:cs="Segoe UI"/>
           <w:sz w:val="24"/>
           <w:u w:val="single"/>
           <w:lang w:val="en-US"/>
@@ -362,6 +406,7 @@
       </w:pPr>
       <w:r>
         <w:rPr>
+          <w:rFonts w:ascii="Segoe UI" w:hAnsi="Segoe UI" w:cs="Segoe UI"/>
           <w:sz w:val="24"/>
           <w:lang w:val="en-US"/>
         </w:rPr>
@@ -376,6 +421,7 @@
           <w:numId w:val="2"/>
         </w:numPr>
         <w:rPr>
+          <w:rFonts w:ascii="Segoe UI" w:hAnsi="Segoe UI" w:cs="Segoe UI"/>
           <w:sz w:val="24"/>
           <w:u w:val="single"/>
           <w:lang w:val="en-US"/>
@@ -384,6 +430,7 @@
       <w:proofErr w:type="spellStart"/>
       <w:r>
         <w:rPr>
+          <w:rFonts w:ascii="Segoe UI" w:hAnsi="Segoe UI" w:cs="Segoe UI"/>
           <w:sz w:val="24"/>
           <w:lang w:val="en-US"/>
         </w:rPr>
@@ -392,14 +439,16 @@
       <w:proofErr w:type="spellEnd"/>
       <w:r>
         <w:rPr>
-          <w:sz w:val="24"/>
-          <w:lang w:val="en-US"/>
-        </w:rPr>
-        <w:t xml:space="preserve"> </w:t>
-      </w:r>
-      <w:proofErr w:type="spellStart"/>
-      <w:r>
-        <w:rPr>
+          <w:rFonts w:ascii="Segoe UI" w:hAnsi="Segoe UI" w:cs="Segoe UI"/>
+          <w:sz w:val="24"/>
+          <w:lang w:val="en-US"/>
+        </w:rPr>
+        <w:t xml:space="preserve"> </w:t>
+      </w:r>
+      <w:proofErr w:type="spellStart"/>
+      <w:r>
+        <w:rPr>
+          <w:rFonts w:ascii="Segoe UI" w:hAnsi="Segoe UI" w:cs="Segoe UI"/>
           <w:sz w:val="24"/>
           <w:lang w:val="en-US"/>
         </w:rPr>
@@ -408,14 +457,16 @@
       <w:proofErr w:type="spellEnd"/>
       <w:r>
         <w:rPr>
-          <w:sz w:val="24"/>
-          <w:lang w:val="en-US"/>
-        </w:rPr>
-        <w:t xml:space="preserve"> </w:t>
-      </w:r>
-      <w:proofErr w:type="spellStart"/>
-      <w:r>
-        <w:rPr>
+          <w:rFonts w:ascii="Segoe UI" w:hAnsi="Segoe UI" w:cs="Segoe UI"/>
+          <w:sz w:val="24"/>
+          <w:lang w:val="en-US"/>
+        </w:rPr>
+        <w:t xml:space="preserve"> </w:t>
+      </w:r>
+      <w:proofErr w:type="spellStart"/>
+      <w:r>
+        <w:rPr>
+          <w:rFonts w:ascii="Segoe UI" w:hAnsi="Segoe UI" w:cs="Segoe UI"/>
           <w:sz w:val="24"/>
           <w:lang w:val="en-US"/>
         </w:rPr>
@@ -424,14 +475,16 @@
       <w:proofErr w:type="spellEnd"/>
       <w:r>
         <w:rPr>
-          <w:sz w:val="24"/>
-          <w:lang w:val="en-US"/>
-        </w:rPr>
-        <w:t xml:space="preserve"> </w:t>
-      </w:r>
-      <w:proofErr w:type="spellStart"/>
-      <w:r>
-        <w:rPr>
+          <w:rFonts w:ascii="Segoe UI" w:hAnsi="Segoe UI" w:cs="Segoe UI"/>
+          <w:sz w:val="24"/>
+          <w:lang w:val="en-US"/>
+        </w:rPr>
+        <w:t xml:space="preserve"> </w:t>
+      </w:r>
+      <w:proofErr w:type="spellStart"/>
+      <w:r>
+        <w:rPr>
+          <w:rFonts w:ascii="Segoe UI" w:hAnsi="Segoe UI" w:cs="Segoe UI"/>
           <w:sz w:val="24"/>
           <w:lang w:val="en-US"/>
         </w:rPr>
@@ -447,6 +500,7 @@
           <w:numId w:val="2"/>
         </w:numPr>
         <w:rPr>
+          <w:rFonts w:ascii="Segoe UI" w:hAnsi="Segoe UI" w:cs="Segoe UI"/>
           <w:sz w:val="24"/>
           <w:u w:val="single"/>
           <w:lang w:val="en-US"/>
@@ -455,6 +509,7 @@
       <w:proofErr w:type="spellStart"/>
       <w:r>
         <w:rPr>
+          <w:rFonts w:ascii="Segoe UI" w:hAnsi="Segoe UI" w:cs="Segoe UI"/>
           <w:sz w:val="24"/>
           <w:lang w:val="en-US"/>
         </w:rPr>
@@ -463,14 +518,16 @@
       <w:proofErr w:type="spellEnd"/>
       <w:r>
         <w:rPr>
-          <w:sz w:val="24"/>
-          <w:lang w:val="en-US"/>
-        </w:rPr>
-        <w:t xml:space="preserve"> </w:t>
-      </w:r>
-      <w:proofErr w:type="spellStart"/>
-      <w:r>
-        <w:rPr>
+          <w:rFonts w:ascii="Segoe UI" w:hAnsi="Segoe UI" w:cs="Segoe UI"/>
+          <w:sz w:val="24"/>
+          <w:lang w:val="en-US"/>
+        </w:rPr>
+        <w:t xml:space="preserve"> </w:t>
+      </w:r>
+      <w:proofErr w:type="spellStart"/>
+      <w:r>
+        <w:rPr>
+          <w:rFonts w:ascii="Segoe UI" w:hAnsi="Segoe UI" w:cs="Segoe UI"/>
           <w:sz w:val="24"/>
           <w:lang w:val="en-US"/>
         </w:rPr>
@@ -479,14 +536,16 @@
       <w:proofErr w:type="spellEnd"/>
       <w:r>
         <w:rPr>
-          <w:sz w:val="24"/>
-          <w:lang w:val="en-US"/>
-        </w:rPr>
-        <w:t xml:space="preserve"> </w:t>
-      </w:r>
-      <w:proofErr w:type="spellStart"/>
-      <w:r>
-        <w:rPr>
+          <w:rFonts w:ascii="Segoe UI" w:hAnsi="Segoe UI" w:cs="Segoe UI"/>
+          <w:sz w:val="24"/>
+          <w:lang w:val="en-US"/>
+        </w:rPr>
+        <w:t xml:space="preserve"> </w:t>
+      </w:r>
+      <w:proofErr w:type="spellStart"/>
+      <w:r>
+        <w:rPr>
+          <w:rFonts w:ascii="Segoe UI" w:hAnsi="Segoe UI" w:cs="Segoe UI"/>
           <w:sz w:val="24"/>
           <w:lang w:val="en-US"/>
         </w:rPr>
@@ -495,14 +554,16 @@
       <w:proofErr w:type="spellEnd"/>
       <w:r>
         <w:rPr>
-          <w:sz w:val="24"/>
-          <w:lang w:val="en-US"/>
-        </w:rPr>
-        <w:t xml:space="preserve"> </w:t>
-      </w:r>
-      <w:proofErr w:type="spellStart"/>
-      <w:r>
-        <w:rPr>
+          <w:rFonts w:ascii="Segoe UI" w:hAnsi="Segoe UI" w:cs="Segoe UI"/>
+          <w:sz w:val="24"/>
+          <w:lang w:val="en-US"/>
+        </w:rPr>
+        <w:t xml:space="preserve"> </w:t>
+      </w:r>
+      <w:proofErr w:type="spellStart"/>
+      <w:r>
+        <w:rPr>
+          <w:rFonts w:ascii="Segoe UI" w:hAnsi="Segoe UI" w:cs="Segoe UI"/>
           <w:sz w:val="24"/>
           <w:lang w:val="en-US"/>
         </w:rPr>
@@ -511,14 +572,16 @@
       <w:proofErr w:type="spellEnd"/>
       <w:r>
         <w:rPr>
-          <w:sz w:val="24"/>
-          <w:lang w:val="en-US"/>
-        </w:rPr>
-        <w:t xml:space="preserve"> </w:t>
-      </w:r>
-      <w:proofErr w:type="spellStart"/>
-      <w:r>
-        <w:rPr>
+          <w:rFonts w:ascii="Segoe UI" w:hAnsi="Segoe UI" w:cs="Segoe UI"/>
+          <w:sz w:val="24"/>
+          <w:lang w:val="en-US"/>
+        </w:rPr>
+        <w:t xml:space="preserve"> </w:t>
+      </w:r>
+      <w:proofErr w:type="spellStart"/>
+      <w:r>
+        <w:rPr>
+          <w:rFonts w:ascii="Segoe UI" w:hAnsi="Segoe UI" w:cs="Segoe UI"/>
           <w:sz w:val="24"/>
           <w:lang w:val="en-US"/>
         </w:rPr>
@@ -527,6 +590,7 @@
       <w:proofErr w:type="spellEnd"/>
       <w:r>
         <w:rPr>
+          <w:rFonts w:ascii="Segoe UI" w:hAnsi="Segoe UI" w:cs="Segoe UI"/>
           <w:sz w:val="24"/>
           <w:lang w:val="en-US"/>
         </w:rPr>
@@ -535,6 +599,7 @@
       <w:proofErr w:type="spellStart"/>
       <w:r>
         <w:rPr>
+          <w:rFonts w:ascii="Segoe UI" w:hAnsi="Segoe UI" w:cs="Segoe UI"/>
           <w:sz w:val="24"/>
           <w:lang w:val="en-US"/>
         </w:rPr>
@@ -550,6 +615,7 @@
           <w:numId w:val="2"/>
         </w:numPr>
         <w:rPr>
+          <w:rFonts w:ascii="Segoe UI" w:hAnsi="Segoe UI" w:cs="Segoe UI"/>
           <w:sz w:val="24"/>
           <w:u w:val="single"/>
           <w:lang w:val="en-US"/>
@@ -558,6 +624,7 @@
       <w:proofErr w:type="spellStart"/>
       <w:r>
         <w:rPr>
+          <w:rFonts w:ascii="Segoe UI" w:hAnsi="Segoe UI" w:cs="Segoe UI"/>
           <w:sz w:val="24"/>
           <w:lang w:val="en-US"/>
         </w:rPr>
@@ -566,14 +633,16 @@
       <w:proofErr w:type="spellEnd"/>
       <w:r>
         <w:rPr>
-          <w:sz w:val="24"/>
-          <w:lang w:val="en-US"/>
-        </w:rPr>
-        <w:t xml:space="preserve"> </w:t>
-      </w:r>
-      <w:proofErr w:type="spellStart"/>
-      <w:r>
-        <w:rPr>
+          <w:rFonts w:ascii="Segoe UI" w:hAnsi="Segoe UI" w:cs="Segoe UI"/>
+          <w:sz w:val="24"/>
+          <w:lang w:val="en-US"/>
+        </w:rPr>
+        <w:t xml:space="preserve"> </w:t>
+      </w:r>
+      <w:proofErr w:type="spellStart"/>
+      <w:r>
+        <w:rPr>
+          <w:rFonts w:ascii="Segoe UI" w:hAnsi="Segoe UI" w:cs="Segoe UI"/>
           <w:sz w:val="24"/>
           <w:lang w:val="en-US"/>
         </w:rPr>
@@ -582,14 +651,16 @@
       <w:proofErr w:type="spellEnd"/>
       <w:r>
         <w:rPr>
-          <w:sz w:val="24"/>
-          <w:lang w:val="en-US"/>
-        </w:rPr>
-        <w:t xml:space="preserve"> </w:t>
-      </w:r>
-      <w:proofErr w:type="spellStart"/>
-      <w:r>
-        <w:rPr>
+          <w:rFonts w:ascii="Segoe UI" w:hAnsi="Segoe UI" w:cs="Segoe UI"/>
+          <w:sz w:val="24"/>
+          <w:lang w:val="en-US"/>
+        </w:rPr>
+        <w:t xml:space="preserve"> </w:t>
+      </w:r>
+      <w:proofErr w:type="spellStart"/>
+      <w:r>
+        <w:rPr>
+          <w:rFonts w:ascii="Segoe UI" w:hAnsi="Segoe UI" w:cs="Segoe UI"/>
           <w:sz w:val="24"/>
           <w:lang w:val="en-US"/>
         </w:rPr>
@@ -598,21 +669,21 @@
       <w:proofErr w:type="spellEnd"/>
       <w:r>
         <w:rPr>
-          <w:sz w:val="24"/>
-          <w:lang w:val="en-US"/>
-        </w:rPr>
-        <w:t xml:space="preserve"> </w:t>
-      </w:r>
-      <w:proofErr w:type="spellStart"/>
-      <w:r>
-        <w:rPr>
+          <w:rFonts w:ascii="Segoe UI" w:hAnsi="Segoe UI" w:cs="Segoe UI"/>
+          <w:sz w:val="24"/>
+          <w:lang w:val="en-US"/>
+        </w:rPr>
+        <w:t xml:space="preserve"> </w:t>
+      </w:r>
+      <w:proofErr w:type="spellStart"/>
+      <w:r>
+        <w:rPr>
+          <w:rFonts w:ascii="Segoe UI" w:hAnsi="Segoe UI" w:cs="Segoe UI"/>
           <w:sz w:val="24"/>
           <w:lang w:val="en-US"/>
         </w:rPr>
         <w:t>hàng</w:t>
       </w:r>
-      <w:bookmarkStart w:id="0" w:name="_GoBack"/>
-      <w:bookmarkEnd w:id="0"/>
       <w:proofErr w:type="spellEnd"/>
     </w:p>
     <w:p>
@@ -623,6 +694,7 @@
           <w:numId w:val="2"/>
         </w:numPr>
         <w:rPr>
+          <w:rFonts w:ascii="Segoe UI" w:hAnsi="Segoe UI" w:cs="Segoe UI"/>
           <w:sz w:val="24"/>
           <w:u w:val="single"/>
           <w:lang w:val="en-US"/>
@@ -631,6 +703,7 @@
       <w:proofErr w:type="spellStart"/>
       <w:r>
         <w:rPr>
+          <w:rFonts w:ascii="Segoe UI" w:hAnsi="Segoe UI" w:cs="Segoe UI"/>
           <w:sz w:val="24"/>
           <w:lang w:val="en-US"/>
         </w:rPr>
@@ -639,14 +712,16 @@
       <w:proofErr w:type="spellEnd"/>
       <w:r>
         <w:rPr>
-          <w:sz w:val="24"/>
-          <w:lang w:val="en-US"/>
-        </w:rPr>
-        <w:t xml:space="preserve"> </w:t>
-      </w:r>
-      <w:proofErr w:type="spellStart"/>
-      <w:r>
-        <w:rPr>
+          <w:rFonts w:ascii="Segoe UI" w:hAnsi="Segoe UI" w:cs="Segoe UI"/>
+          <w:sz w:val="24"/>
+          <w:lang w:val="en-US"/>
+        </w:rPr>
+        <w:t xml:space="preserve"> </w:t>
+      </w:r>
+      <w:proofErr w:type="spellStart"/>
+      <w:r>
+        <w:rPr>
+          <w:rFonts w:ascii="Segoe UI" w:hAnsi="Segoe UI" w:cs="Segoe UI"/>
           <w:sz w:val="24"/>
           <w:lang w:val="en-US"/>
         </w:rPr>
@@ -655,14 +730,16 @@
       <w:proofErr w:type="spellEnd"/>
       <w:r>
         <w:rPr>
-          <w:sz w:val="24"/>
-          <w:lang w:val="en-US"/>
-        </w:rPr>
-        <w:t xml:space="preserve"> </w:t>
-      </w:r>
-      <w:proofErr w:type="spellStart"/>
-      <w:r>
-        <w:rPr>
+          <w:rFonts w:ascii="Segoe UI" w:hAnsi="Segoe UI" w:cs="Segoe UI"/>
+          <w:sz w:val="24"/>
+          <w:lang w:val="en-US"/>
+        </w:rPr>
+        <w:t xml:space="preserve"> </w:t>
+      </w:r>
+      <w:proofErr w:type="spellStart"/>
+      <w:r>
+        <w:rPr>
+          <w:rFonts w:ascii="Segoe UI" w:hAnsi="Segoe UI" w:cs="Segoe UI"/>
           <w:sz w:val="24"/>
           <w:lang w:val="en-US"/>
         </w:rPr>
@@ -671,14 +748,16 @@
       <w:proofErr w:type="spellEnd"/>
       <w:r>
         <w:rPr>
-          <w:sz w:val="24"/>
-          <w:lang w:val="en-US"/>
-        </w:rPr>
-        <w:t xml:space="preserve"> </w:t>
-      </w:r>
-      <w:proofErr w:type="spellStart"/>
-      <w:r>
-        <w:rPr>
+          <w:rFonts w:ascii="Segoe UI" w:hAnsi="Segoe UI" w:cs="Segoe UI"/>
+          <w:sz w:val="24"/>
+          <w:lang w:val="en-US"/>
+        </w:rPr>
+        <w:t xml:space="preserve"> </w:t>
+      </w:r>
+      <w:proofErr w:type="spellStart"/>
+      <w:r>
+        <w:rPr>
+          <w:rFonts w:ascii="Segoe UI" w:hAnsi="Segoe UI" w:cs="Segoe UI"/>
           <w:sz w:val="24"/>
           <w:lang w:val="en-US"/>
         </w:rPr>
@@ -694,6 +773,7 @@
           <w:numId w:val="2"/>
         </w:numPr>
         <w:rPr>
+          <w:rFonts w:ascii="Segoe UI" w:hAnsi="Segoe UI" w:cs="Segoe UI"/>
           <w:sz w:val="24"/>
           <w:u w:val="single"/>
           <w:lang w:val="en-US"/>
@@ -702,6 +782,7 @@
       <w:proofErr w:type="spellStart"/>
       <w:r>
         <w:rPr>
+          <w:rFonts w:ascii="Segoe UI" w:hAnsi="Segoe UI" w:cs="Segoe UI"/>
           <w:sz w:val="24"/>
           <w:lang w:val="en-US"/>
         </w:rPr>
@@ -710,14 +791,16 @@
       <w:proofErr w:type="spellEnd"/>
       <w:r>
         <w:rPr>
-          <w:sz w:val="24"/>
-          <w:lang w:val="en-US"/>
-        </w:rPr>
-        <w:t xml:space="preserve"> </w:t>
-      </w:r>
-      <w:proofErr w:type="spellStart"/>
-      <w:r>
-        <w:rPr>
+          <w:rFonts w:ascii="Segoe UI" w:hAnsi="Segoe UI" w:cs="Segoe UI"/>
+          <w:sz w:val="24"/>
+          <w:lang w:val="en-US"/>
+        </w:rPr>
+        <w:t xml:space="preserve"> </w:t>
+      </w:r>
+      <w:proofErr w:type="spellStart"/>
+      <w:r>
+        <w:rPr>
+          <w:rFonts w:ascii="Segoe UI" w:hAnsi="Segoe UI" w:cs="Segoe UI"/>
           <w:sz w:val="24"/>
           <w:lang w:val="en-US"/>
         </w:rPr>
@@ -726,14 +809,16 @@
       <w:proofErr w:type="spellEnd"/>
       <w:r>
         <w:rPr>
-          <w:sz w:val="24"/>
-          <w:lang w:val="en-US"/>
-        </w:rPr>
-        <w:t xml:space="preserve"> </w:t>
-      </w:r>
-      <w:proofErr w:type="spellStart"/>
-      <w:r>
-        <w:rPr>
+          <w:rFonts w:ascii="Segoe UI" w:hAnsi="Segoe UI" w:cs="Segoe UI"/>
+          <w:sz w:val="24"/>
+          <w:lang w:val="en-US"/>
+        </w:rPr>
+        <w:t xml:space="preserve"> </w:t>
+      </w:r>
+      <w:proofErr w:type="spellStart"/>
+      <w:r>
+        <w:rPr>
+          <w:rFonts w:ascii="Segoe UI" w:hAnsi="Segoe UI" w:cs="Segoe UI"/>
           <w:sz w:val="24"/>
           <w:lang w:val="en-US"/>
         </w:rPr>
@@ -742,14 +827,16 @@
       <w:proofErr w:type="spellEnd"/>
       <w:r>
         <w:rPr>
-          <w:sz w:val="24"/>
-          <w:lang w:val="en-US"/>
-        </w:rPr>
-        <w:t xml:space="preserve"> </w:t>
-      </w:r>
-      <w:proofErr w:type="spellStart"/>
-      <w:r>
-        <w:rPr>
+          <w:rFonts w:ascii="Segoe UI" w:hAnsi="Segoe UI" w:cs="Segoe UI"/>
+          <w:sz w:val="24"/>
+          <w:lang w:val="en-US"/>
+        </w:rPr>
+        <w:t xml:space="preserve"> </w:t>
+      </w:r>
+      <w:proofErr w:type="spellStart"/>
+      <w:r>
+        <w:rPr>
+          <w:rFonts w:ascii="Segoe UI" w:hAnsi="Segoe UI" w:cs="Segoe UI"/>
           <w:sz w:val="24"/>
           <w:lang w:val="en-US"/>
         </w:rPr>
@@ -758,14 +845,16 @@
       <w:proofErr w:type="spellEnd"/>
       <w:r>
         <w:rPr>
-          <w:sz w:val="24"/>
-          <w:lang w:val="en-US"/>
-        </w:rPr>
-        <w:t xml:space="preserve"> </w:t>
-      </w:r>
-      <w:proofErr w:type="spellStart"/>
-      <w:r>
-        <w:rPr>
+          <w:rFonts w:ascii="Segoe UI" w:hAnsi="Segoe UI" w:cs="Segoe UI"/>
+          <w:sz w:val="24"/>
+          <w:lang w:val="en-US"/>
+        </w:rPr>
+        <w:t xml:space="preserve"> </w:t>
+      </w:r>
+      <w:proofErr w:type="spellStart"/>
+      <w:r>
+        <w:rPr>
+          <w:rFonts w:ascii="Segoe UI" w:hAnsi="Segoe UI" w:cs="Segoe UI"/>
           <w:sz w:val="24"/>
           <w:lang w:val="en-US"/>
         </w:rPr>
@@ -774,6 +863,7 @@
       <w:proofErr w:type="spellEnd"/>
       <w:r>
         <w:rPr>
+          <w:rFonts w:ascii="Segoe UI" w:hAnsi="Segoe UI" w:cs="Segoe UI"/>
           <w:sz w:val="24"/>
           <w:lang w:val="en-US"/>
         </w:rPr>
@@ -782,6 +872,7 @@
       <w:proofErr w:type="spellStart"/>
       <w:r>
         <w:rPr>
+          <w:rFonts w:ascii="Segoe UI" w:hAnsi="Segoe UI" w:cs="Segoe UI"/>
           <w:sz w:val="24"/>
           <w:lang w:val="en-US"/>
         </w:rPr>
@@ -797,6 +888,7 @@
           <w:numId w:val="2"/>
         </w:numPr>
         <w:rPr>
+          <w:rFonts w:ascii="Segoe UI" w:hAnsi="Segoe UI" w:cs="Segoe UI"/>
           <w:sz w:val="24"/>
           <w:u w:val="single"/>
           <w:lang w:val="en-US"/>
@@ -805,6 +897,7 @@
       <w:proofErr w:type="spellStart"/>
       <w:r>
         <w:rPr>
+          <w:rFonts w:ascii="Segoe UI" w:hAnsi="Segoe UI" w:cs="Segoe UI"/>
           <w:sz w:val="24"/>
           <w:lang w:val="en-US"/>
         </w:rPr>
@@ -813,14 +906,16 @@
       <w:proofErr w:type="spellEnd"/>
       <w:r>
         <w:rPr>
-          <w:sz w:val="24"/>
-          <w:lang w:val="en-US"/>
-        </w:rPr>
-        <w:t xml:space="preserve"> </w:t>
-      </w:r>
-      <w:proofErr w:type="spellStart"/>
-      <w:r>
-        <w:rPr>
+          <w:rFonts w:ascii="Segoe UI" w:hAnsi="Segoe UI" w:cs="Segoe UI"/>
+          <w:sz w:val="24"/>
+          <w:lang w:val="en-US"/>
+        </w:rPr>
+        <w:t xml:space="preserve"> </w:t>
+      </w:r>
+      <w:proofErr w:type="spellStart"/>
+      <w:r>
+        <w:rPr>
+          <w:rFonts w:ascii="Segoe UI" w:hAnsi="Segoe UI" w:cs="Segoe UI"/>
           <w:sz w:val="24"/>
           <w:lang w:val="en-US"/>
         </w:rPr>
@@ -829,14 +924,16 @@
       <w:proofErr w:type="spellEnd"/>
       <w:r>
         <w:rPr>
-          <w:sz w:val="24"/>
-          <w:lang w:val="en-US"/>
-        </w:rPr>
-        <w:t xml:space="preserve"> </w:t>
-      </w:r>
-      <w:proofErr w:type="spellStart"/>
-      <w:r>
-        <w:rPr>
+          <w:rFonts w:ascii="Segoe UI" w:hAnsi="Segoe UI" w:cs="Segoe UI"/>
+          <w:sz w:val="24"/>
+          <w:lang w:val="en-US"/>
+        </w:rPr>
+        <w:t xml:space="preserve"> </w:t>
+      </w:r>
+      <w:proofErr w:type="spellStart"/>
+      <w:r>
+        <w:rPr>
+          <w:rFonts w:ascii="Segoe UI" w:hAnsi="Segoe UI" w:cs="Segoe UI"/>
           <w:sz w:val="24"/>
           <w:lang w:val="en-US"/>
         </w:rPr>
@@ -845,14 +942,16 @@
       <w:proofErr w:type="spellEnd"/>
       <w:r>
         <w:rPr>
-          <w:sz w:val="24"/>
-          <w:lang w:val="en-US"/>
-        </w:rPr>
-        <w:t xml:space="preserve"> </w:t>
-      </w:r>
-      <w:proofErr w:type="spellStart"/>
-      <w:r>
-        <w:rPr>
+          <w:rFonts w:ascii="Segoe UI" w:hAnsi="Segoe UI" w:cs="Segoe UI"/>
+          <w:sz w:val="24"/>
+          <w:lang w:val="en-US"/>
+        </w:rPr>
+        <w:t xml:space="preserve"> </w:t>
+      </w:r>
+      <w:proofErr w:type="spellStart"/>
+      <w:r>
+        <w:rPr>
+          <w:rFonts w:ascii="Segoe UI" w:hAnsi="Segoe UI" w:cs="Segoe UI"/>
           <w:sz w:val="24"/>
           <w:lang w:val="en-US"/>
         </w:rPr>
@@ -861,14 +960,16 @@
       <w:proofErr w:type="spellEnd"/>
       <w:r>
         <w:rPr>
-          <w:sz w:val="24"/>
-          <w:lang w:val="en-US"/>
-        </w:rPr>
-        <w:t xml:space="preserve"> </w:t>
-      </w:r>
-      <w:proofErr w:type="spellStart"/>
-      <w:r>
-        <w:rPr>
+          <w:rFonts w:ascii="Segoe UI" w:hAnsi="Segoe UI" w:cs="Segoe UI"/>
+          <w:sz w:val="24"/>
+          <w:lang w:val="en-US"/>
+        </w:rPr>
+        <w:t xml:space="preserve"> </w:t>
+      </w:r>
+      <w:proofErr w:type="spellStart"/>
+      <w:r>
+        <w:rPr>
+          <w:rFonts w:ascii="Segoe UI" w:hAnsi="Segoe UI" w:cs="Segoe UI"/>
           <w:sz w:val="24"/>
           <w:lang w:val="en-US"/>
         </w:rPr>
@@ -877,14 +978,16 @@
       <w:proofErr w:type="spellEnd"/>
       <w:r>
         <w:rPr>
-          <w:sz w:val="24"/>
-          <w:lang w:val="en-US"/>
-        </w:rPr>
-        <w:t xml:space="preserve"> </w:t>
-      </w:r>
-      <w:proofErr w:type="spellStart"/>
-      <w:r>
-        <w:rPr>
+          <w:rFonts w:ascii="Segoe UI" w:hAnsi="Segoe UI" w:cs="Segoe UI"/>
+          <w:sz w:val="24"/>
+          <w:lang w:val="en-US"/>
+        </w:rPr>
+        <w:t xml:space="preserve"> </w:t>
+      </w:r>
+      <w:proofErr w:type="spellStart"/>
+      <w:r>
+        <w:rPr>
+          <w:rFonts w:ascii="Segoe UI" w:hAnsi="Segoe UI" w:cs="Segoe UI"/>
           <w:sz w:val="24"/>
           <w:lang w:val="en-US"/>
         </w:rPr>
@@ -900,6 +1003,7 @@
           <w:numId w:val="2"/>
         </w:numPr>
         <w:rPr>
+          <w:rFonts w:ascii="Segoe UI" w:hAnsi="Segoe UI" w:cs="Segoe UI"/>
           <w:sz w:val="24"/>
           <w:u w:val="single"/>
           <w:lang w:val="en-US"/>
@@ -908,6 +1012,7 @@
       <w:proofErr w:type="spellStart"/>
       <w:r>
         <w:rPr>
+          <w:rFonts w:ascii="Segoe UI" w:hAnsi="Segoe UI" w:cs="Segoe UI"/>
           <w:sz w:val="24"/>
           <w:lang w:val="en-US"/>
         </w:rPr>
@@ -916,6 +1021,7 @@
       <w:proofErr w:type="spellEnd"/>
       <w:r>
         <w:rPr>
+          <w:rFonts w:ascii="Segoe UI" w:hAnsi="Segoe UI" w:cs="Segoe UI"/>
           <w:sz w:val="24"/>
           <w:lang w:val="en-US"/>
         </w:rPr>
@@ -924,6 +1030,7 @@
       <w:proofErr w:type="spellStart"/>
       <w:r>
         <w:rPr>
+          <w:rFonts w:ascii="Segoe UI" w:hAnsi="Segoe UI" w:cs="Segoe UI"/>
           <w:sz w:val="24"/>
           <w:lang w:val="en-US"/>
         </w:rPr>
@@ -932,14 +1039,16 @@
       <w:proofErr w:type="spellEnd"/>
       <w:r>
         <w:rPr>
-          <w:sz w:val="24"/>
-          <w:lang w:val="en-US"/>
-        </w:rPr>
-        <w:t xml:space="preserve"> </w:t>
-      </w:r>
-      <w:proofErr w:type="spellStart"/>
-      <w:r>
-        <w:rPr>
+          <w:rFonts w:ascii="Segoe UI" w:hAnsi="Segoe UI" w:cs="Segoe UI"/>
+          <w:sz w:val="24"/>
+          <w:lang w:val="en-US"/>
+        </w:rPr>
+        <w:t xml:space="preserve"> </w:t>
+      </w:r>
+      <w:proofErr w:type="spellStart"/>
+      <w:r>
+        <w:rPr>
+          <w:rFonts w:ascii="Segoe UI" w:hAnsi="Segoe UI" w:cs="Segoe UI"/>
           <w:sz w:val="24"/>
           <w:lang w:val="en-US"/>
         </w:rPr>
@@ -948,14 +1057,16 @@
       <w:proofErr w:type="spellEnd"/>
       <w:r>
         <w:rPr>
-          <w:sz w:val="24"/>
-          <w:lang w:val="en-US"/>
-        </w:rPr>
-        <w:t xml:space="preserve"> </w:t>
-      </w:r>
-      <w:proofErr w:type="spellStart"/>
-      <w:r>
-        <w:rPr>
+          <w:rFonts w:ascii="Segoe UI" w:hAnsi="Segoe UI" w:cs="Segoe UI"/>
+          <w:sz w:val="24"/>
+          <w:lang w:val="en-US"/>
+        </w:rPr>
+        <w:t xml:space="preserve"> </w:t>
+      </w:r>
+      <w:proofErr w:type="spellStart"/>
+      <w:r>
+        <w:rPr>
+          <w:rFonts w:ascii="Segoe UI" w:hAnsi="Segoe UI" w:cs="Segoe UI"/>
           <w:sz w:val="24"/>
           <w:lang w:val="en-US"/>
         </w:rPr>
@@ -964,6 +1075,7 @@
       <w:proofErr w:type="spellEnd"/>
       <w:r>
         <w:rPr>
+          <w:rFonts w:ascii="Segoe UI" w:hAnsi="Segoe UI" w:cs="Segoe UI"/>
           <w:sz w:val="24"/>
           <w:lang w:val="en-US"/>
         </w:rPr>
@@ -972,6 +1084,7 @@
       <w:proofErr w:type="spellStart"/>
       <w:r>
         <w:rPr>
+          <w:rFonts w:ascii="Segoe UI" w:hAnsi="Segoe UI" w:cs="Segoe UI"/>
           <w:sz w:val="24"/>
           <w:lang w:val="en-US"/>
         </w:rPr>
@@ -980,14 +1093,16 @@
       <w:proofErr w:type="spellEnd"/>
       <w:r>
         <w:rPr>
-          <w:sz w:val="24"/>
-          <w:lang w:val="en-US"/>
-        </w:rPr>
-        <w:t xml:space="preserve"> </w:t>
-      </w:r>
-      <w:proofErr w:type="spellStart"/>
-      <w:r>
-        <w:rPr>
+          <w:rFonts w:ascii="Segoe UI" w:hAnsi="Segoe UI" w:cs="Segoe UI"/>
+          <w:sz w:val="24"/>
+          <w:lang w:val="en-US"/>
+        </w:rPr>
+        <w:t xml:space="preserve"> </w:t>
+      </w:r>
+      <w:proofErr w:type="spellStart"/>
+      <w:r>
+        <w:rPr>
+          <w:rFonts w:ascii="Segoe UI" w:hAnsi="Segoe UI" w:cs="Segoe UI"/>
           <w:sz w:val="24"/>
           <w:lang w:val="en-US"/>
         </w:rPr>
@@ -1003,6 +1118,7 @@
           <w:numId w:val="2"/>
         </w:numPr>
         <w:rPr>
+          <w:rFonts w:ascii="Segoe UI" w:hAnsi="Segoe UI" w:cs="Segoe UI"/>
           <w:sz w:val="24"/>
           <w:u w:val="single"/>
           <w:lang w:val="en-US"/>
@@ -1011,6 +1127,7 @@
       <w:proofErr w:type="spellStart"/>
       <w:r>
         <w:rPr>
+          <w:rFonts w:ascii="Segoe UI" w:hAnsi="Segoe UI" w:cs="Segoe UI"/>
           <w:sz w:val="24"/>
           <w:lang w:val="en-US"/>
         </w:rPr>
@@ -1019,14 +1136,16 @@
       <w:proofErr w:type="spellEnd"/>
       <w:r>
         <w:rPr>
-          <w:sz w:val="24"/>
-          <w:lang w:val="en-US"/>
-        </w:rPr>
-        <w:t xml:space="preserve"> </w:t>
-      </w:r>
-      <w:proofErr w:type="spellStart"/>
-      <w:r>
-        <w:rPr>
+          <w:rFonts w:ascii="Segoe UI" w:hAnsi="Segoe UI" w:cs="Segoe UI"/>
+          <w:sz w:val="24"/>
+          <w:lang w:val="en-US"/>
+        </w:rPr>
+        <w:t xml:space="preserve"> </w:t>
+      </w:r>
+      <w:proofErr w:type="spellStart"/>
+      <w:r>
+        <w:rPr>
+          <w:rFonts w:ascii="Segoe UI" w:hAnsi="Segoe UI" w:cs="Segoe UI"/>
           <w:sz w:val="24"/>
           <w:lang w:val="en-US"/>
         </w:rPr>
@@ -1035,14 +1154,16 @@
       <w:proofErr w:type="spellEnd"/>
       <w:r>
         <w:rPr>
-          <w:sz w:val="24"/>
-          <w:lang w:val="en-US"/>
-        </w:rPr>
-        <w:t xml:space="preserve"> </w:t>
-      </w:r>
-      <w:proofErr w:type="spellStart"/>
-      <w:r>
-        <w:rPr>
+          <w:rFonts w:ascii="Segoe UI" w:hAnsi="Segoe UI" w:cs="Segoe UI"/>
+          <w:sz w:val="24"/>
+          <w:lang w:val="en-US"/>
+        </w:rPr>
+        <w:t xml:space="preserve"> </w:t>
+      </w:r>
+      <w:proofErr w:type="spellStart"/>
+      <w:r>
+        <w:rPr>
+          <w:rFonts w:ascii="Segoe UI" w:hAnsi="Segoe UI" w:cs="Segoe UI"/>
           <w:sz w:val="24"/>
           <w:lang w:val="en-US"/>
         </w:rPr>
@@ -1051,6 +1172,7 @@
       <w:proofErr w:type="spellEnd"/>
       <w:r>
         <w:rPr>
+          <w:rFonts w:ascii="Segoe UI" w:hAnsi="Segoe UI" w:cs="Segoe UI"/>
           <w:sz w:val="24"/>
           <w:lang w:val="en-US"/>
         </w:rPr>
@@ -1059,6 +1181,7 @@
       <w:proofErr w:type="spellStart"/>
       <w:r>
         <w:rPr>
+          <w:rFonts w:ascii="Segoe UI" w:hAnsi="Segoe UI" w:cs="Segoe UI"/>
           <w:sz w:val="24"/>
           <w:lang w:val="en-US"/>
         </w:rPr>
@@ -1067,14 +1190,16 @@
       <w:proofErr w:type="spellEnd"/>
       <w:r>
         <w:rPr>
-          <w:sz w:val="24"/>
-          <w:lang w:val="en-US"/>
-        </w:rPr>
-        <w:t xml:space="preserve"> </w:t>
-      </w:r>
-      <w:proofErr w:type="spellStart"/>
-      <w:r>
-        <w:rPr>
+          <w:rFonts w:ascii="Segoe UI" w:hAnsi="Segoe UI" w:cs="Segoe UI"/>
+          <w:sz w:val="24"/>
+          <w:lang w:val="en-US"/>
+        </w:rPr>
+        <w:t xml:space="preserve"> </w:t>
+      </w:r>
+      <w:proofErr w:type="spellStart"/>
+      <w:r>
+        <w:rPr>
+          <w:rFonts w:ascii="Segoe UI" w:hAnsi="Segoe UI" w:cs="Segoe UI"/>
           <w:sz w:val="24"/>
           <w:lang w:val="en-US"/>
         </w:rPr>
@@ -1083,14 +1208,16 @@
       <w:proofErr w:type="spellEnd"/>
       <w:r>
         <w:rPr>
-          <w:sz w:val="24"/>
-          <w:lang w:val="en-US"/>
-        </w:rPr>
-        <w:t xml:space="preserve"> </w:t>
-      </w:r>
-      <w:proofErr w:type="spellStart"/>
-      <w:r>
-        <w:rPr>
+          <w:rFonts w:ascii="Segoe UI" w:hAnsi="Segoe UI" w:cs="Segoe UI"/>
+          <w:sz w:val="24"/>
+          <w:lang w:val="en-US"/>
+        </w:rPr>
+        <w:t xml:space="preserve"> </w:t>
+      </w:r>
+      <w:proofErr w:type="spellStart"/>
+      <w:r>
+        <w:rPr>
+          <w:rFonts w:ascii="Segoe UI" w:hAnsi="Segoe UI" w:cs="Segoe UI"/>
           <w:sz w:val="24"/>
           <w:lang w:val="en-US"/>
         </w:rPr>
@@ -1099,14 +1226,16 @@
       <w:proofErr w:type="spellEnd"/>
       <w:r>
         <w:rPr>
-          <w:sz w:val="24"/>
-          <w:lang w:val="en-US"/>
-        </w:rPr>
-        <w:t xml:space="preserve"> </w:t>
-      </w:r>
-      <w:proofErr w:type="spellStart"/>
-      <w:r>
-        <w:rPr>
+          <w:rFonts w:ascii="Segoe UI" w:hAnsi="Segoe UI" w:cs="Segoe UI"/>
+          <w:sz w:val="24"/>
+          <w:lang w:val="en-US"/>
+        </w:rPr>
+        <w:t xml:space="preserve"> </w:t>
+      </w:r>
+      <w:proofErr w:type="spellStart"/>
+      <w:r>
+        <w:rPr>
+          <w:rFonts w:ascii="Segoe UI" w:hAnsi="Segoe UI" w:cs="Segoe UI"/>
           <w:sz w:val="24"/>
           <w:lang w:val="en-US"/>
         </w:rPr>
@@ -1115,14 +1244,16 @@
       <w:proofErr w:type="spellEnd"/>
       <w:r>
         <w:rPr>
-          <w:sz w:val="24"/>
-          <w:lang w:val="en-US"/>
-        </w:rPr>
-        <w:t xml:space="preserve"> </w:t>
-      </w:r>
-      <w:proofErr w:type="spellStart"/>
-      <w:r>
-        <w:rPr>
+          <w:rFonts w:ascii="Segoe UI" w:hAnsi="Segoe UI" w:cs="Segoe UI"/>
+          <w:sz w:val="24"/>
+          <w:lang w:val="en-US"/>
+        </w:rPr>
+        <w:t xml:space="preserve"> </w:t>
+      </w:r>
+      <w:proofErr w:type="spellStart"/>
+      <w:r>
+        <w:rPr>
+          <w:rFonts w:ascii="Segoe UI" w:hAnsi="Segoe UI" w:cs="Segoe UI"/>
           <w:sz w:val="24"/>
           <w:lang w:val="en-US"/>
         </w:rPr>
@@ -1131,14 +1262,16 @@
       <w:proofErr w:type="spellEnd"/>
       <w:r>
         <w:rPr>
-          <w:sz w:val="24"/>
-          <w:lang w:val="en-US"/>
-        </w:rPr>
-        <w:t xml:space="preserve"> </w:t>
-      </w:r>
-      <w:proofErr w:type="spellStart"/>
-      <w:r>
-        <w:rPr>
+          <w:rFonts w:ascii="Segoe UI" w:hAnsi="Segoe UI" w:cs="Segoe UI"/>
+          <w:sz w:val="24"/>
+          <w:lang w:val="en-US"/>
+        </w:rPr>
+        <w:t xml:space="preserve"> </w:t>
+      </w:r>
+      <w:proofErr w:type="spellStart"/>
+      <w:r>
+        <w:rPr>
+          <w:rFonts w:ascii="Segoe UI" w:hAnsi="Segoe UI" w:cs="Segoe UI"/>
           <w:sz w:val="24"/>
           <w:lang w:val="en-US"/>
         </w:rPr>
@@ -1147,14 +1280,16 @@
       <w:proofErr w:type="spellEnd"/>
       <w:r>
         <w:rPr>
-          <w:sz w:val="24"/>
-          <w:lang w:val="en-US"/>
-        </w:rPr>
-        <w:t xml:space="preserve"> </w:t>
-      </w:r>
-      <w:proofErr w:type="spellStart"/>
-      <w:r>
-        <w:rPr>
+          <w:rFonts w:ascii="Segoe UI" w:hAnsi="Segoe UI" w:cs="Segoe UI"/>
+          <w:sz w:val="24"/>
+          <w:lang w:val="en-US"/>
+        </w:rPr>
+        <w:t xml:space="preserve"> </w:t>
+      </w:r>
+      <w:proofErr w:type="spellStart"/>
+      <w:r>
+        <w:rPr>
+          <w:rFonts w:ascii="Segoe UI" w:hAnsi="Segoe UI" w:cs="Segoe UI"/>
           <w:sz w:val="24"/>
           <w:lang w:val="en-US"/>
         </w:rPr>
@@ -1163,14 +1298,16 @@
       <w:proofErr w:type="spellEnd"/>
       <w:r>
         <w:rPr>
-          <w:sz w:val="24"/>
-          <w:lang w:val="en-US"/>
-        </w:rPr>
-        <w:t xml:space="preserve"> </w:t>
-      </w:r>
-      <w:proofErr w:type="spellStart"/>
-      <w:r>
-        <w:rPr>
+          <w:rFonts w:ascii="Segoe UI" w:hAnsi="Segoe UI" w:cs="Segoe UI"/>
+          <w:sz w:val="24"/>
+          <w:lang w:val="en-US"/>
+        </w:rPr>
+        <w:t xml:space="preserve"> </w:t>
+      </w:r>
+      <w:proofErr w:type="spellStart"/>
+      <w:r>
+        <w:rPr>
+          <w:rFonts w:ascii="Segoe UI" w:hAnsi="Segoe UI" w:cs="Segoe UI"/>
           <w:sz w:val="24"/>
           <w:lang w:val="en-US"/>
         </w:rPr>
@@ -1179,14 +1316,16 @@
       <w:proofErr w:type="spellEnd"/>
       <w:r>
         <w:rPr>
-          <w:sz w:val="24"/>
-          <w:lang w:val="en-US"/>
-        </w:rPr>
-        <w:t xml:space="preserve"> </w:t>
-      </w:r>
-      <w:proofErr w:type="spellStart"/>
-      <w:r>
-        <w:rPr>
+          <w:rFonts w:ascii="Segoe UI" w:hAnsi="Segoe UI" w:cs="Segoe UI"/>
+          <w:sz w:val="24"/>
+          <w:lang w:val="en-US"/>
+        </w:rPr>
+        <w:t xml:space="preserve"> </w:t>
+      </w:r>
+      <w:proofErr w:type="spellStart"/>
+      <w:r>
+        <w:rPr>
+          <w:rFonts w:ascii="Segoe UI" w:hAnsi="Segoe UI" w:cs="Segoe UI"/>
           <w:sz w:val="24"/>
           <w:lang w:val="en-US"/>
         </w:rPr>
@@ -1195,14 +1334,16 @@
       <w:proofErr w:type="spellEnd"/>
       <w:r>
         <w:rPr>
-          <w:sz w:val="24"/>
-          <w:lang w:val="en-US"/>
-        </w:rPr>
-        <w:t xml:space="preserve"> </w:t>
-      </w:r>
-      <w:proofErr w:type="spellStart"/>
-      <w:r>
-        <w:rPr>
+          <w:rFonts w:ascii="Segoe UI" w:hAnsi="Segoe UI" w:cs="Segoe UI"/>
+          <w:sz w:val="24"/>
+          <w:lang w:val="en-US"/>
+        </w:rPr>
+        <w:t xml:space="preserve"> </w:t>
+      </w:r>
+      <w:proofErr w:type="spellStart"/>
+      <w:r>
+        <w:rPr>
+          <w:rFonts w:ascii="Segoe UI" w:hAnsi="Segoe UI" w:cs="Segoe UI"/>
           <w:sz w:val="24"/>
           <w:lang w:val="en-US"/>
         </w:rPr>
@@ -1211,6 +1352,7 @@
       <w:proofErr w:type="spellEnd"/>
       <w:r>
         <w:rPr>
+          <w:rFonts w:ascii="Segoe UI" w:hAnsi="Segoe UI" w:cs="Segoe UI"/>
           <w:sz w:val="24"/>
           <w:lang w:val="en-US"/>
         </w:rPr>
@@ -1219,6 +1361,7 @@
       <w:proofErr w:type="spellStart"/>
       <w:r>
         <w:rPr>
+          <w:rFonts w:ascii="Segoe UI" w:hAnsi="Segoe UI" w:cs="Segoe UI"/>
           <w:sz w:val="24"/>
           <w:lang w:val="en-US"/>
         </w:rPr>
@@ -1227,14 +1370,16 @@
       <w:proofErr w:type="spellEnd"/>
       <w:r>
         <w:rPr>
-          <w:sz w:val="24"/>
-          <w:lang w:val="en-US"/>
-        </w:rPr>
-        <w:t xml:space="preserve"> </w:t>
-      </w:r>
-      <w:proofErr w:type="spellStart"/>
-      <w:r>
-        <w:rPr>
+          <w:rFonts w:ascii="Segoe UI" w:hAnsi="Segoe UI" w:cs="Segoe UI"/>
+          <w:sz w:val="24"/>
+          <w:lang w:val="en-US"/>
+        </w:rPr>
+        <w:t xml:space="preserve"> </w:t>
+      </w:r>
+      <w:proofErr w:type="spellStart"/>
+      <w:r>
+        <w:rPr>
+          <w:rFonts w:ascii="Segoe UI" w:hAnsi="Segoe UI" w:cs="Segoe UI"/>
           <w:sz w:val="24"/>
           <w:lang w:val="en-US"/>
         </w:rPr>
@@ -1243,14 +1388,16 @@
       <w:proofErr w:type="spellEnd"/>
       <w:r>
         <w:rPr>
-          <w:sz w:val="24"/>
-          <w:lang w:val="en-US"/>
-        </w:rPr>
-        <w:t xml:space="preserve"> </w:t>
-      </w:r>
-      <w:proofErr w:type="spellStart"/>
-      <w:r>
-        <w:rPr>
+          <w:rFonts w:ascii="Segoe UI" w:hAnsi="Segoe UI" w:cs="Segoe UI"/>
+          <w:sz w:val="24"/>
+          <w:lang w:val="en-US"/>
+        </w:rPr>
+        <w:t xml:space="preserve"> </w:t>
+      </w:r>
+      <w:proofErr w:type="spellStart"/>
+      <w:r>
+        <w:rPr>
+          <w:rFonts w:ascii="Segoe UI" w:hAnsi="Segoe UI" w:cs="Segoe UI"/>
           <w:sz w:val="24"/>
           <w:lang w:val="en-US"/>
         </w:rPr>
@@ -1259,14 +1406,16 @@
       <w:proofErr w:type="spellEnd"/>
       <w:r>
         <w:rPr>
-          <w:sz w:val="24"/>
-          <w:lang w:val="en-US"/>
-        </w:rPr>
-        <w:t xml:space="preserve"> </w:t>
-      </w:r>
-      <w:proofErr w:type="spellStart"/>
-      <w:r>
-        <w:rPr>
+          <w:rFonts w:ascii="Segoe UI" w:hAnsi="Segoe UI" w:cs="Segoe UI"/>
+          <w:sz w:val="24"/>
+          <w:lang w:val="en-US"/>
+        </w:rPr>
+        <w:t xml:space="preserve"> </w:t>
+      </w:r>
+      <w:proofErr w:type="spellStart"/>
+      <w:r>
+        <w:rPr>
+          <w:rFonts w:ascii="Segoe UI" w:hAnsi="Segoe UI" w:cs="Segoe UI"/>
           <w:sz w:val="24"/>
           <w:lang w:val="en-US"/>
         </w:rPr>
@@ -1275,14 +1424,16 @@
       <w:proofErr w:type="spellEnd"/>
       <w:r>
         <w:rPr>
-          <w:sz w:val="24"/>
-          <w:lang w:val="en-US"/>
-        </w:rPr>
-        <w:t xml:space="preserve"> </w:t>
-      </w:r>
-      <w:proofErr w:type="spellStart"/>
-      <w:r>
-        <w:rPr>
+          <w:rFonts w:ascii="Segoe UI" w:hAnsi="Segoe UI" w:cs="Segoe UI"/>
+          <w:sz w:val="24"/>
+          <w:lang w:val="en-US"/>
+        </w:rPr>
+        <w:t xml:space="preserve"> </w:t>
+      </w:r>
+      <w:proofErr w:type="spellStart"/>
+      <w:r>
+        <w:rPr>
+          <w:rFonts w:ascii="Segoe UI" w:hAnsi="Segoe UI" w:cs="Segoe UI"/>
           <w:sz w:val="24"/>
           <w:lang w:val="en-US"/>
         </w:rPr>
@@ -1291,14 +1442,16 @@
       <w:proofErr w:type="spellEnd"/>
       <w:r>
         <w:rPr>
-          <w:sz w:val="24"/>
-          <w:lang w:val="en-US"/>
-        </w:rPr>
-        <w:t xml:space="preserve"> </w:t>
-      </w:r>
-      <w:proofErr w:type="spellStart"/>
-      <w:r>
-        <w:rPr>
+          <w:rFonts w:ascii="Segoe UI" w:hAnsi="Segoe UI" w:cs="Segoe UI"/>
+          <w:sz w:val="24"/>
+          <w:lang w:val="en-US"/>
+        </w:rPr>
+        <w:t xml:space="preserve"> </w:t>
+      </w:r>
+      <w:proofErr w:type="spellStart"/>
+      <w:r>
+        <w:rPr>
+          <w:rFonts w:ascii="Segoe UI" w:hAnsi="Segoe UI" w:cs="Segoe UI"/>
           <w:sz w:val="24"/>
           <w:lang w:val="en-US"/>
         </w:rPr>
@@ -1314,6 +1467,7 @@
           <w:numId w:val="2"/>
         </w:numPr>
         <w:rPr>
+          <w:rFonts w:ascii="Segoe UI" w:hAnsi="Segoe UI" w:cs="Segoe UI"/>
           <w:sz w:val="24"/>
           <w:u w:val="single"/>
           <w:lang w:val="en-US"/>
@@ -1322,6 +1476,7 @@
       <w:proofErr w:type="spellStart"/>
       <w:r>
         <w:rPr>
+          <w:rFonts w:ascii="Segoe UI" w:hAnsi="Segoe UI" w:cs="Segoe UI"/>
           <w:sz w:val="24"/>
           <w:lang w:val="en-US"/>
         </w:rPr>
@@ -1330,14 +1485,16 @@
       <w:proofErr w:type="spellEnd"/>
       <w:r>
         <w:rPr>
-          <w:sz w:val="24"/>
-          <w:lang w:val="en-US"/>
-        </w:rPr>
-        <w:t xml:space="preserve"> </w:t>
-      </w:r>
-      <w:proofErr w:type="spellStart"/>
-      <w:r>
-        <w:rPr>
+          <w:rFonts w:ascii="Segoe UI" w:hAnsi="Segoe UI" w:cs="Segoe UI"/>
+          <w:sz w:val="24"/>
+          <w:lang w:val="en-US"/>
+        </w:rPr>
+        <w:t xml:space="preserve"> </w:t>
+      </w:r>
+      <w:proofErr w:type="spellStart"/>
+      <w:r>
+        <w:rPr>
+          <w:rFonts w:ascii="Segoe UI" w:hAnsi="Segoe UI" w:cs="Segoe UI"/>
           <w:sz w:val="24"/>
           <w:lang w:val="en-US"/>
         </w:rPr>
@@ -1346,14 +1503,16 @@
       <w:proofErr w:type="spellEnd"/>
       <w:r>
         <w:rPr>
-          <w:sz w:val="24"/>
-          <w:lang w:val="en-US"/>
-        </w:rPr>
-        <w:t xml:space="preserve"> </w:t>
-      </w:r>
-      <w:proofErr w:type="spellStart"/>
-      <w:r>
-        <w:rPr>
+          <w:rFonts w:ascii="Segoe UI" w:hAnsi="Segoe UI" w:cs="Segoe UI"/>
+          <w:sz w:val="24"/>
+          <w:lang w:val="en-US"/>
+        </w:rPr>
+        <w:t xml:space="preserve"> </w:t>
+      </w:r>
+      <w:proofErr w:type="spellStart"/>
+      <w:r>
+        <w:rPr>
+          <w:rFonts w:ascii="Segoe UI" w:hAnsi="Segoe UI" w:cs="Segoe UI"/>
           <w:sz w:val="24"/>
           <w:lang w:val="en-US"/>
         </w:rPr>
@@ -1362,14 +1521,16 @@
       <w:proofErr w:type="spellEnd"/>
       <w:r>
         <w:rPr>
-          <w:sz w:val="24"/>
-          <w:lang w:val="en-US"/>
-        </w:rPr>
-        <w:t xml:space="preserve"> </w:t>
-      </w:r>
-      <w:proofErr w:type="spellStart"/>
-      <w:r>
-        <w:rPr>
+          <w:rFonts w:ascii="Segoe UI" w:hAnsi="Segoe UI" w:cs="Segoe UI"/>
+          <w:sz w:val="24"/>
+          <w:lang w:val="en-US"/>
+        </w:rPr>
+        <w:t xml:space="preserve"> </w:t>
+      </w:r>
+      <w:proofErr w:type="spellStart"/>
+      <w:r>
+        <w:rPr>
+          <w:rFonts w:ascii="Segoe UI" w:hAnsi="Segoe UI" w:cs="Segoe UI"/>
           <w:sz w:val="24"/>
           <w:lang w:val="en-US"/>
         </w:rPr>
@@ -1378,6 +1539,7 @@
       <w:proofErr w:type="spellEnd"/>
       <w:r>
         <w:rPr>
+          <w:rFonts w:ascii="Segoe UI" w:hAnsi="Segoe UI" w:cs="Segoe UI"/>
           <w:sz w:val="24"/>
           <w:lang w:val="en-US"/>
         </w:rPr>
@@ -1386,6 +1548,7 @@
       <w:proofErr w:type="spellStart"/>
       <w:r>
         <w:rPr>
+          <w:rFonts w:ascii="Segoe UI" w:hAnsi="Segoe UI" w:cs="Segoe UI"/>
           <w:sz w:val="24"/>
           <w:lang w:val="en-US"/>
         </w:rPr>
@@ -1394,14 +1557,16 @@
       <w:proofErr w:type="spellEnd"/>
       <w:r>
         <w:rPr>
-          <w:sz w:val="24"/>
-          <w:lang w:val="en-US"/>
-        </w:rPr>
-        <w:t xml:space="preserve"> </w:t>
-      </w:r>
-      <w:proofErr w:type="spellStart"/>
-      <w:r>
-        <w:rPr>
+          <w:rFonts w:ascii="Segoe UI" w:hAnsi="Segoe UI" w:cs="Segoe UI"/>
+          <w:sz w:val="24"/>
+          <w:lang w:val="en-US"/>
+        </w:rPr>
+        <w:t xml:space="preserve"> </w:t>
+      </w:r>
+      <w:proofErr w:type="spellStart"/>
+      <w:r>
+        <w:rPr>
+          <w:rFonts w:ascii="Segoe UI" w:hAnsi="Segoe UI" w:cs="Segoe UI"/>
           <w:sz w:val="24"/>
           <w:lang w:val="en-US"/>
         </w:rPr>
@@ -1410,14 +1575,16 @@
       <w:proofErr w:type="spellEnd"/>
       <w:r>
         <w:rPr>
-          <w:sz w:val="24"/>
-          <w:lang w:val="en-US"/>
-        </w:rPr>
-        <w:t xml:space="preserve"> </w:t>
-      </w:r>
-      <w:proofErr w:type="spellStart"/>
-      <w:r>
-        <w:rPr>
+          <w:rFonts w:ascii="Segoe UI" w:hAnsi="Segoe UI" w:cs="Segoe UI"/>
+          <w:sz w:val="24"/>
+          <w:lang w:val="en-US"/>
+        </w:rPr>
+        <w:t xml:space="preserve"> </w:t>
+      </w:r>
+      <w:proofErr w:type="spellStart"/>
+      <w:r>
+        <w:rPr>
+          <w:rFonts w:ascii="Segoe UI" w:hAnsi="Segoe UI" w:cs="Segoe UI"/>
           <w:sz w:val="24"/>
           <w:lang w:val="en-US"/>
         </w:rPr>
@@ -1426,14 +1593,16 @@
       <w:proofErr w:type="spellEnd"/>
       <w:r>
         <w:rPr>
-          <w:sz w:val="24"/>
-          <w:lang w:val="en-US"/>
-        </w:rPr>
-        <w:t xml:space="preserve"> </w:t>
-      </w:r>
-      <w:proofErr w:type="spellStart"/>
-      <w:r>
-        <w:rPr>
+          <w:rFonts w:ascii="Segoe UI" w:hAnsi="Segoe UI" w:cs="Segoe UI"/>
+          <w:sz w:val="24"/>
+          <w:lang w:val="en-US"/>
+        </w:rPr>
+        <w:t xml:space="preserve"> </w:t>
+      </w:r>
+      <w:proofErr w:type="spellStart"/>
+      <w:r>
+        <w:rPr>
+          <w:rFonts w:ascii="Segoe UI" w:hAnsi="Segoe UI" w:cs="Segoe UI"/>
           <w:sz w:val="24"/>
           <w:lang w:val="en-US"/>
         </w:rPr>
@@ -1442,14 +1611,16 @@
       <w:proofErr w:type="spellEnd"/>
       <w:r>
         <w:rPr>
-          <w:sz w:val="24"/>
-          <w:lang w:val="en-US"/>
-        </w:rPr>
-        <w:t xml:space="preserve"> </w:t>
-      </w:r>
-      <w:proofErr w:type="spellStart"/>
-      <w:r>
-        <w:rPr>
+          <w:rFonts w:ascii="Segoe UI" w:hAnsi="Segoe UI" w:cs="Segoe UI"/>
+          <w:sz w:val="24"/>
+          <w:lang w:val="en-US"/>
+        </w:rPr>
+        <w:t xml:space="preserve"> </w:t>
+      </w:r>
+      <w:proofErr w:type="spellStart"/>
+      <w:r>
+        <w:rPr>
+          <w:rFonts w:ascii="Segoe UI" w:hAnsi="Segoe UI" w:cs="Segoe UI"/>
           <w:sz w:val="24"/>
           <w:lang w:val="en-US"/>
         </w:rPr>
@@ -1458,14 +1629,16 @@
       <w:proofErr w:type="spellEnd"/>
       <w:r>
         <w:rPr>
-          <w:sz w:val="24"/>
-          <w:lang w:val="en-US"/>
-        </w:rPr>
-        <w:t xml:space="preserve"> </w:t>
-      </w:r>
-      <w:proofErr w:type="spellStart"/>
-      <w:r>
-        <w:rPr>
+          <w:rFonts w:ascii="Segoe UI" w:hAnsi="Segoe UI" w:cs="Segoe UI"/>
+          <w:sz w:val="24"/>
+          <w:lang w:val="en-US"/>
+        </w:rPr>
+        <w:t xml:space="preserve"> </w:t>
+      </w:r>
+      <w:proofErr w:type="spellStart"/>
+      <w:r>
+        <w:rPr>
+          <w:rFonts w:ascii="Segoe UI" w:hAnsi="Segoe UI" w:cs="Segoe UI"/>
           <w:sz w:val="24"/>
           <w:lang w:val="en-US"/>
         </w:rPr>
@@ -1474,6 +1647,7 @@
       <w:proofErr w:type="spellEnd"/>
       <w:r>
         <w:rPr>
+          <w:rFonts w:ascii="Segoe UI" w:hAnsi="Segoe UI" w:cs="Segoe UI"/>
           <w:sz w:val="24"/>
           <w:lang w:val="en-US"/>
         </w:rPr>
@@ -1488,6 +1662,7 @@
           <w:numId w:val="2"/>
         </w:numPr>
         <w:rPr>
+          <w:rFonts w:ascii="Segoe UI" w:hAnsi="Segoe UI" w:cs="Segoe UI"/>
           <w:sz w:val="24"/>
           <w:u w:val="single"/>
           <w:lang w:val="en-US"/>
@@ -1496,6 +1671,7 @@
       <w:proofErr w:type="spellStart"/>
       <w:r>
         <w:rPr>
+          <w:rFonts w:ascii="Segoe UI" w:hAnsi="Segoe UI" w:cs="Segoe UI"/>
           <w:sz w:val="24"/>
           <w:lang w:val="en-US"/>
         </w:rPr>
@@ -1504,14 +1680,16 @@
       <w:proofErr w:type="spellEnd"/>
       <w:r>
         <w:rPr>
-          <w:sz w:val="24"/>
-          <w:lang w:val="en-US"/>
-        </w:rPr>
-        <w:t xml:space="preserve"> </w:t>
-      </w:r>
-      <w:proofErr w:type="spellStart"/>
-      <w:r>
-        <w:rPr>
+          <w:rFonts w:ascii="Segoe UI" w:hAnsi="Segoe UI" w:cs="Segoe UI"/>
+          <w:sz w:val="24"/>
+          <w:lang w:val="en-US"/>
+        </w:rPr>
+        <w:t xml:space="preserve"> </w:t>
+      </w:r>
+      <w:proofErr w:type="spellStart"/>
+      <w:r>
+        <w:rPr>
+          <w:rFonts w:ascii="Segoe UI" w:hAnsi="Segoe UI" w:cs="Segoe UI"/>
           <w:sz w:val="24"/>
           <w:lang w:val="en-US"/>
         </w:rPr>
@@ -1520,6 +1698,7 @@
       <w:proofErr w:type="spellEnd"/>
       <w:r>
         <w:rPr>
+          <w:rFonts w:ascii="Segoe UI" w:hAnsi="Segoe UI" w:cs="Segoe UI"/>
           <w:sz w:val="24"/>
           <w:lang w:val="en-US"/>
         </w:rPr>
@@ -1528,6 +1707,7 @@
       <w:proofErr w:type="spellStart"/>
       <w:r>
         <w:rPr>
+          <w:rFonts w:ascii="Segoe UI" w:hAnsi="Segoe UI" w:cs="Segoe UI"/>
           <w:sz w:val="24"/>
           <w:lang w:val="en-US"/>
         </w:rPr>
@@ -1536,14 +1716,16 @@
       <w:proofErr w:type="spellEnd"/>
       <w:r>
         <w:rPr>
-          <w:sz w:val="24"/>
-          <w:lang w:val="en-US"/>
-        </w:rPr>
-        <w:t xml:space="preserve"> </w:t>
-      </w:r>
-      <w:proofErr w:type="spellStart"/>
-      <w:r>
-        <w:rPr>
+          <w:rFonts w:ascii="Segoe UI" w:hAnsi="Segoe UI" w:cs="Segoe UI"/>
+          <w:sz w:val="24"/>
+          <w:lang w:val="en-US"/>
+        </w:rPr>
+        <w:t xml:space="preserve"> </w:t>
+      </w:r>
+      <w:proofErr w:type="spellStart"/>
+      <w:r>
+        <w:rPr>
+          <w:rFonts w:ascii="Segoe UI" w:hAnsi="Segoe UI" w:cs="Segoe UI"/>
           <w:sz w:val="24"/>
           <w:lang w:val="en-US"/>
         </w:rPr>
@@ -1552,14 +1734,16 @@
       <w:proofErr w:type="spellEnd"/>
       <w:r>
         <w:rPr>
-          <w:sz w:val="24"/>
-          <w:lang w:val="en-US"/>
-        </w:rPr>
-        <w:t xml:space="preserve"> </w:t>
-      </w:r>
-      <w:proofErr w:type="spellStart"/>
-      <w:r>
-        <w:rPr>
+          <w:rFonts w:ascii="Segoe UI" w:hAnsi="Segoe UI" w:cs="Segoe UI"/>
+          <w:sz w:val="24"/>
+          <w:lang w:val="en-US"/>
+        </w:rPr>
+        <w:t xml:space="preserve"> </w:t>
+      </w:r>
+      <w:proofErr w:type="spellStart"/>
+      <w:r>
+        <w:rPr>
+          <w:rFonts w:ascii="Segoe UI" w:hAnsi="Segoe UI" w:cs="Segoe UI"/>
           <w:sz w:val="24"/>
           <w:lang w:val="en-US"/>
         </w:rPr>
@@ -1568,14 +1752,16 @@
       <w:proofErr w:type="spellEnd"/>
       <w:r>
         <w:rPr>
-          <w:sz w:val="24"/>
-          <w:lang w:val="en-US"/>
-        </w:rPr>
-        <w:t xml:space="preserve"> </w:t>
-      </w:r>
-      <w:proofErr w:type="spellStart"/>
-      <w:r>
-        <w:rPr>
+          <w:rFonts w:ascii="Segoe UI" w:hAnsi="Segoe UI" w:cs="Segoe UI"/>
+          <w:sz w:val="24"/>
+          <w:lang w:val="en-US"/>
+        </w:rPr>
+        <w:t xml:space="preserve"> </w:t>
+      </w:r>
+      <w:proofErr w:type="spellStart"/>
+      <w:r>
+        <w:rPr>
+          <w:rFonts w:ascii="Segoe UI" w:hAnsi="Segoe UI" w:cs="Segoe UI"/>
           <w:sz w:val="24"/>
           <w:lang w:val="en-US"/>
         </w:rPr>
@@ -1584,14 +1770,16 @@
       <w:proofErr w:type="spellEnd"/>
       <w:r>
         <w:rPr>
-          <w:sz w:val="24"/>
-          <w:lang w:val="en-US"/>
-        </w:rPr>
-        <w:t xml:space="preserve"> </w:t>
-      </w:r>
-      <w:proofErr w:type="spellStart"/>
-      <w:r>
-        <w:rPr>
+          <w:rFonts w:ascii="Segoe UI" w:hAnsi="Segoe UI" w:cs="Segoe UI"/>
+          <w:sz w:val="24"/>
+          <w:lang w:val="en-US"/>
+        </w:rPr>
+        <w:t xml:space="preserve"> </w:t>
+      </w:r>
+      <w:proofErr w:type="spellStart"/>
+      <w:r>
+        <w:rPr>
+          <w:rFonts w:ascii="Segoe UI" w:hAnsi="Segoe UI" w:cs="Segoe UI"/>
           <w:sz w:val="24"/>
           <w:lang w:val="en-US"/>
         </w:rPr>
@@ -1600,6 +1788,7 @@
       <w:proofErr w:type="spellEnd"/>
       <w:r>
         <w:rPr>
+          <w:rFonts w:ascii="Segoe UI" w:hAnsi="Segoe UI" w:cs="Segoe UI"/>
           <w:sz w:val="24"/>
           <w:lang w:val="en-US"/>
         </w:rPr>
@@ -1608,6 +1797,7 @@
       <w:proofErr w:type="spellStart"/>
       <w:r>
         <w:rPr>
+          <w:rFonts w:ascii="Segoe UI" w:hAnsi="Segoe UI" w:cs="Segoe UI"/>
           <w:sz w:val="24"/>
           <w:lang w:val="en-US"/>
         </w:rPr>
@@ -1616,14 +1806,16 @@
       <w:proofErr w:type="spellEnd"/>
       <w:r>
         <w:rPr>
-          <w:sz w:val="24"/>
-          <w:lang w:val="en-US"/>
-        </w:rPr>
-        <w:t xml:space="preserve"> </w:t>
-      </w:r>
-      <w:proofErr w:type="spellStart"/>
-      <w:r>
-        <w:rPr>
+          <w:rFonts w:ascii="Segoe UI" w:hAnsi="Segoe UI" w:cs="Segoe UI"/>
+          <w:sz w:val="24"/>
+          <w:lang w:val="en-US"/>
+        </w:rPr>
+        <w:t xml:space="preserve"> </w:t>
+      </w:r>
+      <w:proofErr w:type="spellStart"/>
+      <w:r>
+        <w:rPr>
+          <w:rFonts w:ascii="Segoe UI" w:hAnsi="Segoe UI" w:cs="Segoe UI"/>
           <w:sz w:val="24"/>
           <w:lang w:val="en-US"/>
         </w:rPr>
@@ -1632,14 +1824,16 @@
       <w:proofErr w:type="spellEnd"/>
       <w:r>
         <w:rPr>
-          <w:sz w:val="24"/>
-          <w:lang w:val="en-US"/>
-        </w:rPr>
-        <w:t xml:space="preserve"> </w:t>
-      </w:r>
-      <w:proofErr w:type="spellStart"/>
-      <w:r>
-        <w:rPr>
+          <w:rFonts w:ascii="Segoe UI" w:hAnsi="Segoe UI" w:cs="Segoe UI"/>
+          <w:sz w:val="24"/>
+          <w:lang w:val="en-US"/>
+        </w:rPr>
+        <w:t xml:space="preserve"> </w:t>
+      </w:r>
+      <w:proofErr w:type="spellStart"/>
+      <w:r>
+        <w:rPr>
+          <w:rFonts w:ascii="Segoe UI" w:hAnsi="Segoe UI" w:cs="Segoe UI"/>
           <w:sz w:val="24"/>
           <w:lang w:val="en-US"/>
         </w:rPr>
@@ -1648,14 +1842,16 @@
       <w:proofErr w:type="spellEnd"/>
       <w:r>
         <w:rPr>
-          <w:sz w:val="24"/>
-          <w:lang w:val="en-US"/>
-        </w:rPr>
-        <w:t xml:space="preserve"> </w:t>
-      </w:r>
-      <w:proofErr w:type="spellStart"/>
-      <w:r>
-        <w:rPr>
+          <w:rFonts w:ascii="Segoe UI" w:hAnsi="Segoe UI" w:cs="Segoe UI"/>
+          <w:sz w:val="24"/>
+          <w:lang w:val="en-US"/>
+        </w:rPr>
+        <w:t xml:space="preserve"> </w:t>
+      </w:r>
+      <w:proofErr w:type="spellStart"/>
+      <w:r>
+        <w:rPr>
+          <w:rFonts w:ascii="Segoe UI" w:hAnsi="Segoe UI" w:cs="Segoe UI"/>
           <w:sz w:val="24"/>
           <w:lang w:val="en-US"/>
         </w:rPr>
@@ -1664,14 +1860,16 @@
       <w:proofErr w:type="spellEnd"/>
       <w:r>
         <w:rPr>
-          <w:sz w:val="24"/>
-          <w:lang w:val="en-US"/>
-        </w:rPr>
-        <w:t xml:space="preserve"> </w:t>
-      </w:r>
-      <w:proofErr w:type="spellStart"/>
-      <w:r>
-        <w:rPr>
+          <w:rFonts w:ascii="Segoe UI" w:hAnsi="Segoe UI" w:cs="Segoe UI"/>
+          <w:sz w:val="24"/>
+          <w:lang w:val="en-US"/>
+        </w:rPr>
+        <w:t xml:space="preserve"> </w:t>
+      </w:r>
+      <w:proofErr w:type="spellStart"/>
+      <w:r>
+        <w:rPr>
+          <w:rFonts w:ascii="Segoe UI" w:hAnsi="Segoe UI" w:cs="Segoe UI"/>
           <w:sz w:val="24"/>
           <w:lang w:val="en-US"/>
         </w:rPr>
@@ -1687,6 +1885,7 @@
           <w:numId w:val="3"/>
         </w:numPr>
         <w:rPr>
+          <w:rFonts w:ascii="Segoe UI" w:hAnsi="Segoe UI" w:cs="Segoe UI"/>
           <w:sz w:val="24"/>
           <w:u w:val="single"/>
           <w:lang w:val="en-US"/>
@@ -1695,6 +1894,7 @@
       <w:proofErr w:type="spellStart"/>
       <w:r>
         <w:rPr>
+          <w:rFonts w:ascii="Segoe UI" w:hAnsi="Segoe UI" w:cs="Segoe UI"/>
           <w:sz w:val="24"/>
           <w:u w:val="single"/>
           <w:lang w:val="en-US"/>
@@ -1704,6 +1904,7 @@
       <w:proofErr w:type="spellEnd"/>
       <w:r>
         <w:rPr>
+          <w:rFonts w:ascii="Segoe UI" w:hAnsi="Segoe UI" w:cs="Segoe UI"/>
           <w:sz w:val="24"/>
           <w:u w:val="single"/>
           <w:lang w:val="en-US"/>
@@ -1713,6 +1914,7 @@
       <w:proofErr w:type="spellStart"/>
       <w:r>
         <w:rPr>
+          <w:rFonts w:ascii="Segoe UI" w:hAnsi="Segoe UI" w:cs="Segoe UI"/>
           <w:sz w:val="24"/>
           <w:u w:val="single"/>
           <w:lang w:val="en-US"/>
@@ -1722,6 +1924,7 @@
       <w:proofErr w:type="spellEnd"/>
       <w:r>
         <w:rPr>
+          <w:rFonts w:ascii="Segoe UI" w:hAnsi="Segoe UI" w:cs="Segoe UI"/>
           <w:sz w:val="24"/>
           <w:u w:val="single"/>
           <w:lang w:val="en-US"/>
@@ -1731,6 +1934,7 @@
       <w:proofErr w:type="spellStart"/>
       <w:r>
         <w:rPr>
+          <w:rFonts w:ascii="Segoe UI" w:hAnsi="Segoe UI" w:cs="Segoe UI"/>
           <w:sz w:val="24"/>
           <w:u w:val="single"/>
           <w:lang w:val="en-US"/>
@@ -1740,6 +1944,7 @@
       <w:proofErr w:type="spellEnd"/>
       <w:r>
         <w:rPr>
+          <w:rFonts w:ascii="Segoe UI" w:hAnsi="Segoe UI" w:cs="Segoe UI"/>
           <w:sz w:val="24"/>
           <w:u w:val="single"/>
           <w:lang w:val="en-US"/>
@@ -1749,6 +1954,7 @@
       <w:proofErr w:type="spellStart"/>
       <w:r>
         <w:rPr>
+          <w:rFonts w:ascii="Segoe UI" w:hAnsi="Segoe UI" w:cs="Segoe UI"/>
           <w:sz w:val="24"/>
           <w:u w:val="single"/>
           <w:lang w:val="en-US"/>
@@ -1758,6 +1964,7 @@
       <w:proofErr w:type="spellEnd"/>
       <w:r>
         <w:rPr>
+          <w:rFonts w:ascii="Segoe UI" w:hAnsi="Segoe UI" w:cs="Segoe UI"/>
           <w:sz w:val="24"/>
           <w:u w:val="single"/>
           <w:lang w:val="en-US"/>
@@ -1767,6 +1974,7 @@
       <w:proofErr w:type="spellStart"/>
       <w:r>
         <w:rPr>
+          <w:rFonts w:ascii="Segoe UI" w:hAnsi="Segoe UI" w:cs="Segoe UI"/>
           <w:sz w:val="24"/>
           <w:u w:val="single"/>
           <w:lang w:val="en-US"/>
@@ -1776,6 +1984,7 @@
       <w:proofErr w:type="spellEnd"/>
       <w:r>
         <w:rPr>
+          <w:rFonts w:ascii="Segoe UI" w:hAnsi="Segoe UI" w:cs="Segoe UI"/>
           <w:sz w:val="24"/>
           <w:u w:val="single"/>
           <w:lang w:val="en-US"/>
@@ -1791,6 +2000,7 @@
           <w:numId w:val="4"/>
         </w:numPr>
         <w:rPr>
+          <w:rFonts w:ascii="Segoe UI" w:hAnsi="Segoe UI" w:cs="Segoe UI"/>
           <w:sz w:val="24"/>
           <w:u w:val="single"/>
           <w:lang w:val="en-US"/>
@@ -1799,6 +2009,7 @@
       <w:proofErr w:type="spellStart"/>
       <w:r>
         <w:rPr>
+          <w:rFonts w:ascii="Segoe UI" w:hAnsi="Segoe UI" w:cs="Segoe UI"/>
           <w:sz w:val="24"/>
           <w:lang w:val="en-US"/>
         </w:rPr>
@@ -1807,14 +2018,16 @@
       <w:proofErr w:type="spellEnd"/>
       <w:r>
         <w:rPr>
-          <w:sz w:val="24"/>
-          <w:lang w:val="en-US"/>
-        </w:rPr>
-        <w:t xml:space="preserve"> </w:t>
-      </w:r>
-      <w:proofErr w:type="spellStart"/>
-      <w:r>
-        <w:rPr>
+          <w:rFonts w:ascii="Segoe UI" w:hAnsi="Segoe UI" w:cs="Segoe UI"/>
+          <w:sz w:val="24"/>
+          <w:lang w:val="en-US"/>
+        </w:rPr>
+        <w:t xml:space="preserve"> </w:t>
+      </w:r>
+      <w:proofErr w:type="spellStart"/>
+      <w:r>
+        <w:rPr>
+          <w:rFonts w:ascii="Segoe UI" w:hAnsi="Segoe UI" w:cs="Segoe UI"/>
           <w:sz w:val="24"/>
           <w:lang w:val="en-US"/>
         </w:rPr>
@@ -1823,14 +2036,16 @@
       <w:proofErr w:type="spellEnd"/>
       <w:r>
         <w:rPr>
-          <w:sz w:val="24"/>
-          <w:lang w:val="en-US"/>
-        </w:rPr>
-        <w:t xml:space="preserve"> </w:t>
-      </w:r>
-      <w:proofErr w:type="spellStart"/>
-      <w:r>
-        <w:rPr>
+          <w:rFonts w:ascii="Segoe UI" w:hAnsi="Segoe UI" w:cs="Segoe UI"/>
+          <w:sz w:val="24"/>
+          <w:lang w:val="en-US"/>
+        </w:rPr>
+        <w:t xml:space="preserve"> </w:t>
+      </w:r>
+      <w:proofErr w:type="spellStart"/>
+      <w:r>
+        <w:rPr>
+          <w:rFonts w:ascii="Segoe UI" w:hAnsi="Segoe UI" w:cs="Segoe UI"/>
           <w:sz w:val="24"/>
           <w:lang w:val="en-US"/>
         </w:rPr>
@@ -1839,14 +2054,16 @@
       <w:proofErr w:type="spellEnd"/>
       <w:r>
         <w:rPr>
-          <w:sz w:val="24"/>
-          <w:lang w:val="en-US"/>
-        </w:rPr>
-        <w:t xml:space="preserve"> </w:t>
-      </w:r>
-      <w:proofErr w:type="spellStart"/>
-      <w:r>
-        <w:rPr>
+          <w:rFonts w:ascii="Segoe UI" w:hAnsi="Segoe UI" w:cs="Segoe UI"/>
+          <w:sz w:val="24"/>
+          <w:lang w:val="en-US"/>
+        </w:rPr>
+        <w:t xml:space="preserve"> </w:t>
+      </w:r>
+      <w:proofErr w:type="spellStart"/>
+      <w:r>
+        <w:rPr>
+          <w:rFonts w:ascii="Segoe UI" w:hAnsi="Segoe UI" w:cs="Segoe UI"/>
           <w:sz w:val="24"/>
           <w:lang w:val="en-US"/>
         </w:rPr>
@@ -1855,14 +2072,16 @@
       <w:proofErr w:type="spellEnd"/>
       <w:r>
         <w:rPr>
-          <w:sz w:val="24"/>
-          <w:lang w:val="en-US"/>
-        </w:rPr>
-        <w:t xml:space="preserve"> </w:t>
-      </w:r>
-      <w:proofErr w:type="spellStart"/>
-      <w:r>
-        <w:rPr>
+          <w:rFonts w:ascii="Segoe UI" w:hAnsi="Segoe UI" w:cs="Segoe UI"/>
+          <w:sz w:val="24"/>
+          <w:lang w:val="en-US"/>
+        </w:rPr>
+        <w:t xml:space="preserve"> </w:t>
+      </w:r>
+      <w:proofErr w:type="spellStart"/>
+      <w:r>
+        <w:rPr>
+          <w:rFonts w:ascii="Segoe UI" w:hAnsi="Segoe UI" w:cs="Segoe UI"/>
           <w:sz w:val="24"/>
           <w:lang w:val="en-US"/>
         </w:rPr>
@@ -1871,14 +2090,16 @@
       <w:proofErr w:type="spellEnd"/>
       <w:r>
         <w:rPr>
-          <w:sz w:val="24"/>
-          <w:lang w:val="en-US"/>
-        </w:rPr>
-        <w:t xml:space="preserve"> </w:t>
-      </w:r>
-      <w:proofErr w:type="spellStart"/>
-      <w:r>
-        <w:rPr>
+          <w:rFonts w:ascii="Segoe UI" w:hAnsi="Segoe UI" w:cs="Segoe UI"/>
+          <w:sz w:val="24"/>
+          <w:lang w:val="en-US"/>
+        </w:rPr>
+        <w:t xml:space="preserve"> </w:t>
+      </w:r>
+      <w:proofErr w:type="spellStart"/>
+      <w:r>
+        <w:rPr>
+          <w:rFonts w:ascii="Segoe UI" w:hAnsi="Segoe UI" w:cs="Segoe UI"/>
           <w:sz w:val="24"/>
           <w:lang w:val="en-US"/>
         </w:rPr>
@@ -1887,6 +2108,7 @@
       <w:proofErr w:type="spellEnd"/>
       <w:r>
         <w:rPr>
+          <w:rFonts w:ascii="Segoe UI" w:hAnsi="Segoe UI" w:cs="Segoe UI"/>
           <w:sz w:val="24"/>
           <w:lang w:val="en-US"/>
         </w:rPr>
@@ -1895,6 +2117,7 @@
       <w:proofErr w:type="spellStart"/>
       <w:r>
         <w:rPr>
+          <w:rFonts w:ascii="Segoe UI" w:hAnsi="Segoe UI" w:cs="Segoe UI"/>
           <w:sz w:val="24"/>
           <w:lang w:val="en-US"/>
         </w:rPr>
@@ -1903,14 +2126,16 @@
       <w:proofErr w:type="spellEnd"/>
       <w:r>
         <w:rPr>
-          <w:sz w:val="24"/>
-          <w:lang w:val="en-US"/>
-        </w:rPr>
-        <w:t xml:space="preserve"> </w:t>
-      </w:r>
-      <w:proofErr w:type="spellStart"/>
-      <w:r>
-        <w:rPr>
+          <w:rFonts w:ascii="Segoe UI" w:hAnsi="Segoe UI" w:cs="Segoe UI"/>
+          <w:sz w:val="24"/>
+          <w:lang w:val="en-US"/>
+        </w:rPr>
+        <w:t xml:space="preserve"> </w:t>
+      </w:r>
+      <w:proofErr w:type="spellStart"/>
+      <w:r>
+        <w:rPr>
+          <w:rFonts w:ascii="Segoe UI" w:hAnsi="Segoe UI" w:cs="Segoe UI"/>
           <w:sz w:val="24"/>
           <w:lang w:val="en-US"/>
         </w:rPr>
@@ -1926,6 +2151,7 @@
           <w:numId w:val="4"/>
         </w:numPr>
         <w:rPr>
+          <w:rFonts w:ascii="Segoe UI" w:hAnsi="Segoe UI" w:cs="Segoe UI"/>
           <w:sz w:val="24"/>
           <w:u w:val="single"/>
           <w:lang w:val="en-US"/>
@@ -1934,6 +2160,7 @@
       <w:proofErr w:type="spellStart"/>
       <w:r>
         <w:rPr>
+          <w:rFonts w:ascii="Segoe UI" w:hAnsi="Segoe UI" w:cs="Segoe UI"/>
           <w:sz w:val="24"/>
           <w:lang w:val="en-US"/>
         </w:rPr>
@@ -1942,14 +2169,16 @@
       <w:proofErr w:type="spellEnd"/>
       <w:r>
         <w:rPr>
-          <w:sz w:val="24"/>
-          <w:lang w:val="en-US"/>
-        </w:rPr>
-        <w:t xml:space="preserve"> </w:t>
-      </w:r>
-      <w:proofErr w:type="spellStart"/>
-      <w:r>
-        <w:rPr>
+          <w:rFonts w:ascii="Segoe UI" w:hAnsi="Segoe UI" w:cs="Segoe UI"/>
+          <w:sz w:val="24"/>
+          <w:lang w:val="en-US"/>
+        </w:rPr>
+        <w:t xml:space="preserve"> </w:t>
+      </w:r>
+      <w:proofErr w:type="spellStart"/>
+      <w:r>
+        <w:rPr>
+          <w:rFonts w:ascii="Segoe UI" w:hAnsi="Segoe UI" w:cs="Segoe UI"/>
           <w:sz w:val="24"/>
           <w:lang w:val="en-US"/>
         </w:rPr>
@@ -1958,14 +2187,16 @@
       <w:proofErr w:type="spellEnd"/>
       <w:r>
         <w:rPr>
-          <w:sz w:val="24"/>
-          <w:lang w:val="en-US"/>
-        </w:rPr>
-        <w:t xml:space="preserve"> </w:t>
-      </w:r>
-      <w:proofErr w:type="spellStart"/>
-      <w:r>
-        <w:rPr>
+          <w:rFonts w:ascii="Segoe UI" w:hAnsi="Segoe UI" w:cs="Segoe UI"/>
+          <w:sz w:val="24"/>
+          <w:lang w:val="en-US"/>
+        </w:rPr>
+        <w:t xml:space="preserve"> </w:t>
+      </w:r>
+      <w:proofErr w:type="spellStart"/>
+      <w:r>
+        <w:rPr>
+          <w:rFonts w:ascii="Segoe UI" w:hAnsi="Segoe UI" w:cs="Segoe UI"/>
           <w:sz w:val="24"/>
           <w:lang w:val="en-US"/>
         </w:rPr>
@@ -1974,14 +2205,16 @@
       <w:proofErr w:type="spellEnd"/>
       <w:r>
         <w:rPr>
-          <w:sz w:val="24"/>
-          <w:lang w:val="en-US"/>
-        </w:rPr>
-        <w:t xml:space="preserve"> </w:t>
-      </w:r>
-      <w:proofErr w:type="spellStart"/>
-      <w:r>
-        <w:rPr>
+          <w:rFonts w:ascii="Segoe UI" w:hAnsi="Segoe UI" w:cs="Segoe UI"/>
+          <w:sz w:val="24"/>
+          <w:lang w:val="en-US"/>
+        </w:rPr>
+        <w:t xml:space="preserve"> </w:t>
+      </w:r>
+      <w:proofErr w:type="spellStart"/>
+      <w:r>
+        <w:rPr>
+          <w:rFonts w:ascii="Segoe UI" w:hAnsi="Segoe UI" w:cs="Segoe UI"/>
           <w:sz w:val="24"/>
           <w:lang w:val="en-US"/>
         </w:rPr>
@@ -1990,6 +2223,7 @@
       <w:proofErr w:type="spellEnd"/>
       <w:r>
         <w:rPr>
+          <w:rFonts w:ascii="Segoe UI" w:hAnsi="Segoe UI" w:cs="Segoe UI"/>
           <w:sz w:val="24"/>
           <w:lang w:val="en-US"/>
         </w:rPr>
@@ -1998,6 +2232,7 @@
       <w:proofErr w:type="spellStart"/>
       <w:r>
         <w:rPr>
+          <w:rFonts w:ascii="Segoe UI" w:hAnsi="Segoe UI" w:cs="Segoe UI"/>
           <w:sz w:val="24"/>
           <w:lang w:val="en-US"/>
         </w:rPr>
@@ -2006,14 +2241,16 @@
       <w:proofErr w:type="spellEnd"/>
       <w:r>
         <w:rPr>
-          <w:sz w:val="24"/>
-          <w:lang w:val="en-US"/>
-        </w:rPr>
-        <w:t xml:space="preserve"> </w:t>
-      </w:r>
-      <w:proofErr w:type="spellStart"/>
-      <w:r>
-        <w:rPr>
+          <w:rFonts w:ascii="Segoe UI" w:hAnsi="Segoe UI" w:cs="Segoe UI"/>
+          <w:sz w:val="24"/>
+          <w:lang w:val="en-US"/>
+        </w:rPr>
+        <w:t xml:space="preserve"> </w:t>
+      </w:r>
+      <w:proofErr w:type="spellStart"/>
+      <w:r>
+        <w:rPr>
+          <w:rFonts w:ascii="Segoe UI" w:hAnsi="Segoe UI" w:cs="Segoe UI"/>
           <w:sz w:val="24"/>
           <w:lang w:val="en-US"/>
         </w:rPr>
@@ -2022,14 +2259,16 @@
       <w:proofErr w:type="spellEnd"/>
       <w:r>
         <w:rPr>
-          <w:sz w:val="24"/>
-          <w:lang w:val="en-US"/>
-        </w:rPr>
-        <w:t xml:space="preserve"> </w:t>
-      </w:r>
-      <w:proofErr w:type="spellStart"/>
-      <w:r>
-        <w:rPr>
+          <w:rFonts w:ascii="Segoe UI" w:hAnsi="Segoe UI" w:cs="Segoe UI"/>
+          <w:sz w:val="24"/>
+          <w:lang w:val="en-US"/>
+        </w:rPr>
+        <w:t xml:space="preserve"> </w:t>
+      </w:r>
+      <w:proofErr w:type="spellStart"/>
+      <w:r>
+        <w:rPr>
+          <w:rFonts w:ascii="Segoe UI" w:hAnsi="Segoe UI" w:cs="Segoe UI"/>
           <w:sz w:val="24"/>
           <w:lang w:val="en-US"/>
         </w:rPr>
@@ -2038,14 +2277,16 @@
       <w:proofErr w:type="spellEnd"/>
       <w:r>
         <w:rPr>
-          <w:sz w:val="24"/>
-          <w:lang w:val="en-US"/>
-        </w:rPr>
-        <w:t xml:space="preserve"> </w:t>
-      </w:r>
-      <w:proofErr w:type="spellStart"/>
-      <w:r>
-        <w:rPr>
+          <w:rFonts w:ascii="Segoe UI" w:hAnsi="Segoe UI" w:cs="Segoe UI"/>
+          <w:sz w:val="24"/>
+          <w:lang w:val="en-US"/>
+        </w:rPr>
+        <w:t xml:space="preserve"> </w:t>
+      </w:r>
+      <w:proofErr w:type="spellStart"/>
+      <w:r>
+        <w:rPr>
+          <w:rFonts w:ascii="Segoe UI" w:hAnsi="Segoe UI" w:cs="Segoe UI"/>
           <w:sz w:val="24"/>
           <w:lang w:val="en-US"/>
         </w:rPr>
@@ -2054,14 +2295,16 @@
       <w:proofErr w:type="spellEnd"/>
       <w:r>
         <w:rPr>
-          <w:sz w:val="24"/>
-          <w:lang w:val="en-US"/>
-        </w:rPr>
-        <w:t xml:space="preserve"> </w:t>
-      </w:r>
-      <w:proofErr w:type="spellStart"/>
-      <w:r>
-        <w:rPr>
+          <w:rFonts w:ascii="Segoe UI" w:hAnsi="Segoe UI" w:cs="Segoe UI"/>
+          <w:sz w:val="24"/>
+          <w:lang w:val="en-US"/>
+        </w:rPr>
+        <w:t xml:space="preserve"> </w:t>
+      </w:r>
+      <w:proofErr w:type="spellStart"/>
+      <w:r>
+        <w:rPr>
+          <w:rFonts w:ascii="Segoe UI" w:hAnsi="Segoe UI" w:cs="Segoe UI"/>
           <w:sz w:val="24"/>
           <w:lang w:val="en-US"/>
         </w:rPr>
@@ -2070,6 +2313,7 @@
       <w:proofErr w:type="spellEnd"/>
       <w:r>
         <w:rPr>
+          <w:rFonts w:ascii="Segoe UI" w:hAnsi="Segoe UI" w:cs="Segoe UI"/>
           <w:sz w:val="24"/>
           <w:lang w:val="en-US"/>
         </w:rPr>
@@ -2078,6 +2322,7 @@
       <w:proofErr w:type="spellStart"/>
       <w:r>
         <w:rPr>
+          <w:rFonts w:ascii="Segoe UI" w:hAnsi="Segoe UI" w:cs="Segoe UI"/>
           <w:sz w:val="24"/>
           <w:lang w:val="en-US"/>
         </w:rPr>
@@ -2086,14 +2331,16 @@
       <w:proofErr w:type="spellEnd"/>
       <w:r>
         <w:rPr>
-          <w:sz w:val="24"/>
-          <w:lang w:val="en-US"/>
-        </w:rPr>
-        <w:t xml:space="preserve"> </w:t>
-      </w:r>
-      <w:proofErr w:type="spellStart"/>
-      <w:r>
-        <w:rPr>
+          <w:rFonts w:ascii="Segoe UI" w:hAnsi="Segoe UI" w:cs="Segoe UI"/>
+          <w:sz w:val="24"/>
+          <w:lang w:val="en-US"/>
+        </w:rPr>
+        <w:t xml:space="preserve"> </w:t>
+      </w:r>
+      <w:proofErr w:type="spellStart"/>
+      <w:r>
+        <w:rPr>
+          <w:rFonts w:ascii="Segoe UI" w:hAnsi="Segoe UI" w:cs="Segoe UI"/>
           <w:sz w:val="24"/>
           <w:lang w:val="en-US"/>
         </w:rPr>
@@ -2102,6 +2349,7 @@
       <w:proofErr w:type="spellEnd"/>
       <w:r>
         <w:rPr>
+          <w:rFonts w:ascii="Segoe UI" w:hAnsi="Segoe UI" w:cs="Segoe UI"/>
           <w:sz w:val="24"/>
           <w:lang w:val="en-US"/>
         </w:rPr>
@@ -2110,6 +2358,7 @@
       <w:proofErr w:type="spellStart"/>
       <w:r>
         <w:rPr>
+          <w:rFonts w:ascii="Segoe UI" w:hAnsi="Segoe UI" w:cs="Segoe UI"/>
           <w:sz w:val="24"/>
           <w:lang w:val="en-US"/>
         </w:rPr>
@@ -2118,14 +2367,16 @@
       <w:proofErr w:type="spellEnd"/>
       <w:r>
         <w:rPr>
-          <w:sz w:val="24"/>
-          <w:lang w:val="en-US"/>
-        </w:rPr>
-        <w:t xml:space="preserve"> </w:t>
-      </w:r>
-      <w:proofErr w:type="spellStart"/>
-      <w:r>
-        <w:rPr>
+          <w:rFonts w:ascii="Segoe UI" w:hAnsi="Segoe UI" w:cs="Segoe UI"/>
+          <w:sz w:val="24"/>
+          <w:lang w:val="en-US"/>
+        </w:rPr>
+        <w:t xml:space="preserve"> </w:t>
+      </w:r>
+      <w:proofErr w:type="spellStart"/>
+      <w:r>
+        <w:rPr>
+          <w:rFonts w:ascii="Segoe UI" w:hAnsi="Segoe UI" w:cs="Segoe UI"/>
           <w:sz w:val="24"/>
           <w:lang w:val="en-US"/>
         </w:rPr>
@@ -2134,6 +2385,7 @@
       <w:proofErr w:type="spellEnd"/>
       <w:r>
         <w:rPr>
+          <w:rFonts w:ascii="Segoe UI" w:hAnsi="Segoe UI" w:cs="Segoe UI"/>
           <w:sz w:val="24"/>
           <w:lang w:val="en-US"/>
         </w:rPr>
@@ -2142,6 +2394,7 @@
       <w:proofErr w:type="spellStart"/>
       <w:r>
         <w:rPr>
+          <w:rFonts w:ascii="Segoe UI" w:hAnsi="Segoe UI" w:cs="Segoe UI"/>
           <w:sz w:val="24"/>
           <w:lang w:val="en-US"/>
         </w:rPr>
@@ -2150,14 +2403,16 @@
       <w:proofErr w:type="spellEnd"/>
       <w:r>
         <w:rPr>
-          <w:sz w:val="24"/>
-          <w:lang w:val="en-US"/>
-        </w:rPr>
-        <w:t xml:space="preserve"> </w:t>
-      </w:r>
-      <w:proofErr w:type="spellStart"/>
-      <w:r>
-        <w:rPr>
+          <w:rFonts w:ascii="Segoe UI" w:hAnsi="Segoe UI" w:cs="Segoe UI"/>
+          <w:sz w:val="24"/>
+          <w:lang w:val="en-US"/>
+        </w:rPr>
+        <w:t xml:space="preserve"> </w:t>
+      </w:r>
+      <w:proofErr w:type="spellStart"/>
+      <w:r>
+        <w:rPr>
+          <w:rFonts w:ascii="Segoe UI" w:hAnsi="Segoe UI" w:cs="Segoe UI"/>
           <w:sz w:val="24"/>
           <w:lang w:val="en-US"/>
         </w:rPr>
@@ -2166,6 +2421,7 @@
       <w:proofErr w:type="spellEnd"/>
       <w:r>
         <w:rPr>
+          <w:rFonts w:ascii="Segoe UI" w:hAnsi="Segoe UI" w:cs="Segoe UI"/>
           <w:sz w:val="24"/>
           <w:lang w:val="en-US"/>
         </w:rPr>
@@ -2175,6 +2431,7 @@
       <w:proofErr w:type="gramStart"/>
       <w:r>
         <w:rPr>
+          <w:rFonts w:ascii="Segoe UI" w:hAnsi="Segoe UI" w:cs="Segoe UI"/>
           <w:sz w:val="24"/>
           <w:lang w:val="en-US"/>
         </w:rPr>
@@ -2183,6 +2440,7 @@
       <w:proofErr w:type="spellEnd"/>
       <w:r>
         <w:rPr>
+          <w:rFonts w:ascii="Segoe UI" w:hAnsi="Segoe UI" w:cs="Segoe UI"/>
           <w:sz w:val="24"/>
           <w:lang w:val="en-US"/>
         </w:rPr>
@@ -2198,6 +2456,7 @@
           <w:numId w:val="4"/>
         </w:numPr>
         <w:rPr>
+          <w:rFonts w:ascii="Segoe UI" w:hAnsi="Segoe UI" w:cs="Segoe UI"/>
           <w:sz w:val="24"/>
           <w:u w:val="single"/>
           <w:lang w:val="en-US"/>
@@ -2206,6 +2465,7 @@
       <w:proofErr w:type="spellStart"/>
       <w:r>
         <w:rPr>
+          <w:rFonts w:ascii="Segoe UI" w:hAnsi="Segoe UI" w:cs="Segoe UI"/>
           <w:sz w:val="24"/>
           <w:lang w:val="en-US"/>
         </w:rPr>
@@ -2214,6 +2474,7 @@
       <w:proofErr w:type="spellEnd"/>
       <w:r>
         <w:rPr>
+          <w:rFonts w:ascii="Segoe UI" w:hAnsi="Segoe UI" w:cs="Segoe UI"/>
           <w:sz w:val="24"/>
           <w:lang w:val="en-US"/>
         </w:rPr>
@@ -2222,6 +2483,7 @@
       <w:proofErr w:type="spellStart"/>
       <w:r>
         <w:rPr>
+          <w:rFonts w:ascii="Segoe UI" w:hAnsi="Segoe UI" w:cs="Segoe UI"/>
           <w:sz w:val="24"/>
           <w:lang w:val="en-US"/>
         </w:rPr>
@@ -2230,14 +2492,16 @@
       <w:proofErr w:type="spellEnd"/>
       <w:r>
         <w:rPr>
-          <w:sz w:val="24"/>
-          <w:lang w:val="en-US"/>
-        </w:rPr>
-        <w:t xml:space="preserve"> </w:t>
-      </w:r>
-      <w:proofErr w:type="spellStart"/>
-      <w:r>
-        <w:rPr>
+          <w:rFonts w:ascii="Segoe UI" w:hAnsi="Segoe UI" w:cs="Segoe UI"/>
+          <w:sz w:val="24"/>
+          <w:lang w:val="en-US"/>
+        </w:rPr>
+        <w:t xml:space="preserve"> </w:t>
+      </w:r>
+      <w:proofErr w:type="spellStart"/>
+      <w:r>
+        <w:rPr>
+          <w:rFonts w:ascii="Segoe UI" w:hAnsi="Segoe UI" w:cs="Segoe UI"/>
           <w:sz w:val="24"/>
           <w:lang w:val="en-US"/>
         </w:rPr>
@@ -2246,14 +2510,16 @@
       <w:proofErr w:type="spellEnd"/>
       <w:r>
         <w:rPr>
-          <w:sz w:val="24"/>
-          <w:lang w:val="en-US"/>
-        </w:rPr>
-        <w:t xml:space="preserve"> </w:t>
-      </w:r>
-      <w:proofErr w:type="spellStart"/>
-      <w:r>
-        <w:rPr>
+          <w:rFonts w:ascii="Segoe UI" w:hAnsi="Segoe UI" w:cs="Segoe UI"/>
+          <w:sz w:val="24"/>
+          <w:lang w:val="en-US"/>
+        </w:rPr>
+        <w:t xml:space="preserve"> </w:t>
+      </w:r>
+      <w:proofErr w:type="spellStart"/>
+      <w:r>
+        <w:rPr>
+          <w:rFonts w:ascii="Segoe UI" w:hAnsi="Segoe UI" w:cs="Segoe UI"/>
           <w:sz w:val="24"/>
           <w:lang w:val="en-US"/>
         </w:rPr>
@@ -2262,14 +2528,16 @@
       <w:proofErr w:type="spellEnd"/>
       <w:r>
         <w:rPr>
-          <w:sz w:val="24"/>
-          <w:lang w:val="en-US"/>
-        </w:rPr>
-        <w:t xml:space="preserve"> </w:t>
-      </w:r>
-      <w:proofErr w:type="spellStart"/>
-      <w:r>
-        <w:rPr>
+          <w:rFonts w:ascii="Segoe UI" w:hAnsi="Segoe UI" w:cs="Segoe UI"/>
+          <w:sz w:val="24"/>
+          <w:lang w:val="en-US"/>
+        </w:rPr>
+        <w:t xml:space="preserve"> </w:t>
+      </w:r>
+      <w:proofErr w:type="spellStart"/>
+      <w:r>
+        <w:rPr>
+          <w:rFonts w:ascii="Segoe UI" w:hAnsi="Segoe UI" w:cs="Segoe UI"/>
           <w:sz w:val="24"/>
           <w:lang w:val="en-US"/>
         </w:rPr>
@@ -2278,14 +2546,16 @@
       <w:proofErr w:type="spellEnd"/>
       <w:r>
         <w:rPr>
-          <w:sz w:val="24"/>
-          <w:lang w:val="en-US"/>
-        </w:rPr>
-        <w:t xml:space="preserve"> </w:t>
-      </w:r>
-      <w:proofErr w:type="spellStart"/>
-      <w:r>
-        <w:rPr>
+          <w:rFonts w:ascii="Segoe UI" w:hAnsi="Segoe UI" w:cs="Segoe UI"/>
+          <w:sz w:val="24"/>
+          <w:lang w:val="en-US"/>
+        </w:rPr>
+        <w:t xml:space="preserve"> </w:t>
+      </w:r>
+      <w:proofErr w:type="spellStart"/>
+      <w:r>
+        <w:rPr>
+          <w:rFonts w:ascii="Segoe UI" w:hAnsi="Segoe UI" w:cs="Segoe UI"/>
           <w:sz w:val="24"/>
           <w:lang w:val="en-US"/>
         </w:rPr>
@@ -2294,14 +2564,16 @@
       <w:proofErr w:type="spellEnd"/>
       <w:r>
         <w:rPr>
-          <w:sz w:val="24"/>
-          <w:lang w:val="en-US"/>
-        </w:rPr>
-        <w:t xml:space="preserve"> </w:t>
-      </w:r>
-      <w:proofErr w:type="spellStart"/>
-      <w:r>
-        <w:rPr>
+          <w:rFonts w:ascii="Segoe UI" w:hAnsi="Segoe UI" w:cs="Segoe UI"/>
+          <w:sz w:val="24"/>
+          <w:lang w:val="en-US"/>
+        </w:rPr>
+        <w:t xml:space="preserve"> </w:t>
+      </w:r>
+      <w:proofErr w:type="spellStart"/>
+      <w:r>
+        <w:rPr>
+          <w:rFonts w:ascii="Segoe UI" w:hAnsi="Segoe UI" w:cs="Segoe UI"/>
           <w:sz w:val="24"/>
           <w:lang w:val="en-US"/>
         </w:rPr>
@@ -2310,14 +2582,16 @@
       <w:proofErr w:type="spellEnd"/>
       <w:r>
         <w:rPr>
-          <w:sz w:val="24"/>
-          <w:lang w:val="en-US"/>
-        </w:rPr>
-        <w:t xml:space="preserve"> </w:t>
-      </w:r>
-      <w:proofErr w:type="spellStart"/>
-      <w:r>
-        <w:rPr>
+          <w:rFonts w:ascii="Segoe UI" w:hAnsi="Segoe UI" w:cs="Segoe UI"/>
+          <w:sz w:val="24"/>
+          <w:lang w:val="en-US"/>
+        </w:rPr>
+        <w:t xml:space="preserve"> </w:t>
+      </w:r>
+      <w:proofErr w:type="spellStart"/>
+      <w:r>
+        <w:rPr>
+          <w:rFonts w:ascii="Segoe UI" w:hAnsi="Segoe UI" w:cs="Segoe UI"/>
           <w:sz w:val="24"/>
           <w:lang w:val="en-US"/>
         </w:rPr>
@@ -2326,6 +2600,7 @@
       <w:proofErr w:type="spellEnd"/>
       <w:r>
         <w:rPr>
+          <w:rFonts w:ascii="Segoe UI" w:hAnsi="Segoe UI" w:cs="Segoe UI"/>
           <w:sz w:val="24"/>
           <w:lang w:val="en-US"/>
         </w:rPr>
@@ -2334,6 +2609,7 @@
       <w:proofErr w:type="spellStart"/>
       <w:r>
         <w:rPr>
+          <w:rFonts w:ascii="Segoe UI" w:hAnsi="Segoe UI" w:cs="Segoe UI"/>
           <w:sz w:val="24"/>
           <w:lang w:val="en-US"/>
         </w:rPr>
@@ -2342,14 +2618,16 @@
       <w:proofErr w:type="spellEnd"/>
       <w:r>
         <w:rPr>
-          <w:sz w:val="24"/>
-          <w:lang w:val="en-US"/>
-        </w:rPr>
-        <w:t xml:space="preserve"> </w:t>
-      </w:r>
-      <w:proofErr w:type="spellStart"/>
-      <w:r>
-        <w:rPr>
+          <w:rFonts w:ascii="Segoe UI" w:hAnsi="Segoe UI" w:cs="Segoe UI"/>
+          <w:sz w:val="24"/>
+          <w:lang w:val="en-US"/>
+        </w:rPr>
+        <w:t xml:space="preserve"> </w:t>
+      </w:r>
+      <w:proofErr w:type="spellStart"/>
+      <w:r>
+        <w:rPr>
+          <w:rFonts w:ascii="Segoe UI" w:hAnsi="Segoe UI" w:cs="Segoe UI"/>
           <w:sz w:val="24"/>
           <w:lang w:val="en-US"/>
         </w:rPr>
@@ -2358,6 +2636,7 @@
       <w:proofErr w:type="spellEnd"/>
       <w:r>
         <w:rPr>
+          <w:rFonts w:ascii="Segoe UI" w:hAnsi="Segoe UI" w:cs="Segoe UI"/>
           <w:sz w:val="24"/>
           <w:lang w:val="en-US"/>
         </w:rPr>
@@ -2366,6 +2645,7 @@
       <w:proofErr w:type="spellStart"/>
       <w:r>
         <w:rPr>
+          <w:rFonts w:ascii="Segoe UI" w:hAnsi="Segoe UI" w:cs="Segoe UI"/>
           <w:sz w:val="24"/>
           <w:lang w:val="en-US"/>
         </w:rPr>
@@ -2374,14 +2654,16 @@
       <w:proofErr w:type="spellEnd"/>
       <w:r>
         <w:rPr>
-          <w:sz w:val="24"/>
-          <w:lang w:val="en-US"/>
-        </w:rPr>
-        <w:t xml:space="preserve"> </w:t>
-      </w:r>
-      <w:proofErr w:type="spellStart"/>
-      <w:r>
-        <w:rPr>
+          <w:rFonts w:ascii="Segoe UI" w:hAnsi="Segoe UI" w:cs="Segoe UI"/>
+          <w:sz w:val="24"/>
+          <w:lang w:val="en-US"/>
+        </w:rPr>
+        <w:t xml:space="preserve"> </w:t>
+      </w:r>
+      <w:proofErr w:type="spellStart"/>
+      <w:r>
+        <w:rPr>
+          <w:rFonts w:ascii="Segoe UI" w:hAnsi="Segoe UI" w:cs="Segoe UI"/>
           <w:sz w:val="24"/>
           <w:lang w:val="en-US"/>
         </w:rPr>
@@ -2390,14 +2672,16 @@
       <w:proofErr w:type="spellEnd"/>
       <w:r>
         <w:rPr>
-          <w:sz w:val="24"/>
-          <w:lang w:val="en-US"/>
-        </w:rPr>
-        <w:t xml:space="preserve"> </w:t>
-      </w:r>
-      <w:proofErr w:type="spellStart"/>
-      <w:r>
-        <w:rPr>
+          <w:rFonts w:ascii="Segoe UI" w:hAnsi="Segoe UI" w:cs="Segoe UI"/>
+          <w:sz w:val="24"/>
+          <w:lang w:val="en-US"/>
+        </w:rPr>
+        <w:t xml:space="preserve"> </w:t>
+      </w:r>
+      <w:proofErr w:type="spellStart"/>
+      <w:r>
+        <w:rPr>
+          <w:rFonts w:ascii="Segoe UI" w:hAnsi="Segoe UI" w:cs="Segoe UI"/>
           <w:sz w:val="24"/>
           <w:lang w:val="en-US"/>
         </w:rPr>
@@ -2406,6 +2690,7 @@
       <w:proofErr w:type="spellEnd"/>
       <w:r>
         <w:rPr>
+          <w:rFonts w:ascii="Segoe UI" w:hAnsi="Segoe UI" w:cs="Segoe UI"/>
           <w:sz w:val="24"/>
           <w:lang w:val="en-US"/>
         </w:rPr>
@@ -2414,6 +2699,7 @@
       <w:proofErr w:type="spellStart"/>
       <w:r>
         <w:rPr>
+          <w:rFonts w:ascii="Segoe UI" w:hAnsi="Segoe UI" w:cs="Segoe UI"/>
           <w:sz w:val="24"/>
           <w:lang w:val="en-US"/>
         </w:rPr>
@@ -2422,14 +2708,16 @@
       <w:proofErr w:type="spellEnd"/>
       <w:r>
         <w:rPr>
-          <w:sz w:val="24"/>
-          <w:lang w:val="en-US"/>
-        </w:rPr>
-        <w:t xml:space="preserve"> </w:t>
-      </w:r>
-      <w:proofErr w:type="spellStart"/>
-      <w:r>
-        <w:rPr>
+          <w:rFonts w:ascii="Segoe UI" w:hAnsi="Segoe UI" w:cs="Segoe UI"/>
+          <w:sz w:val="24"/>
+          <w:lang w:val="en-US"/>
+        </w:rPr>
+        <w:t xml:space="preserve"> </w:t>
+      </w:r>
+      <w:proofErr w:type="spellStart"/>
+      <w:r>
+        <w:rPr>
+          <w:rFonts w:ascii="Segoe UI" w:hAnsi="Segoe UI" w:cs="Segoe UI"/>
           <w:sz w:val="24"/>
           <w:lang w:val="en-US"/>
         </w:rPr>
@@ -2438,14 +2726,16 @@
       <w:proofErr w:type="spellEnd"/>
       <w:r>
         <w:rPr>
-          <w:sz w:val="24"/>
-          <w:lang w:val="en-US"/>
-        </w:rPr>
-        <w:t xml:space="preserve"> </w:t>
-      </w:r>
-      <w:proofErr w:type="spellStart"/>
-      <w:r>
-        <w:rPr>
+          <w:rFonts w:ascii="Segoe UI" w:hAnsi="Segoe UI" w:cs="Segoe UI"/>
+          <w:sz w:val="24"/>
+          <w:lang w:val="en-US"/>
+        </w:rPr>
+        <w:t xml:space="preserve"> </w:t>
+      </w:r>
+      <w:proofErr w:type="spellStart"/>
+      <w:r>
+        <w:rPr>
+          <w:rFonts w:ascii="Segoe UI" w:hAnsi="Segoe UI" w:cs="Segoe UI"/>
           <w:sz w:val="24"/>
           <w:lang w:val="en-US"/>
         </w:rPr>
@@ -2454,14 +2744,16 @@
       <w:proofErr w:type="spellEnd"/>
       <w:r>
         <w:rPr>
-          <w:sz w:val="24"/>
-          <w:lang w:val="en-US"/>
-        </w:rPr>
-        <w:t xml:space="preserve"> </w:t>
-      </w:r>
-      <w:proofErr w:type="spellStart"/>
-      <w:r>
-        <w:rPr>
+          <w:rFonts w:ascii="Segoe UI" w:hAnsi="Segoe UI" w:cs="Segoe UI"/>
+          <w:sz w:val="24"/>
+          <w:lang w:val="en-US"/>
+        </w:rPr>
+        <w:t xml:space="preserve"> </w:t>
+      </w:r>
+      <w:proofErr w:type="spellStart"/>
+      <w:r>
+        <w:rPr>
+          <w:rFonts w:ascii="Segoe UI" w:hAnsi="Segoe UI" w:cs="Segoe UI"/>
           <w:sz w:val="24"/>
           <w:lang w:val="en-US"/>
         </w:rPr>
@@ -2470,14 +2762,16 @@
       <w:proofErr w:type="spellEnd"/>
       <w:r>
         <w:rPr>
-          <w:sz w:val="24"/>
-          <w:lang w:val="en-US"/>
-        </w:rPr>
-        <w:t xml:space="preserve"> </w:t>
-      </w:r>
-      <w:proofErr w:type="spellStart"/>
-      <w:r>
-        <w:rPr>
+          <w:rFonts w:ascii="Segoe UI" w:hAnsi="Segoe UI" w:cs="Segoe UI"/>
+          <w:sz w:val="24"/>
+          <w:lang w:val="en-US"/>
+        </w:rPr>
+        <w:t xml:space="preserve"> </w:t>
+      </w:r>
+      <w:proofErr w:type="spellStart"/>
+      <w:r>
+        <w:rPr>
+          <w:rFonts w:ascii="Segoe UI" w:hAnsi="Segoe UI" w:cs="Segoe UI"/>
           <w:sz w:val="24"/>
           <w:lang w:val="en-US"/>
         </w:rPr>
@@ -2486,14 +2780,16 @@
       <w:proofErr w:type="spellEnd"/>
       <w:r>
         <w:rPr>
-          <w:sz w:val="24"/>
-          <w:lang w:val="en-US"/>
-        </w:rPr>
-        <w:t xml:space="preserve"> </w:t>
-      </w:r>
-      <w:proofErr w:type="spellStart"/>
-      <w:r>
-        <w:rPr>
+          <w:rFonts w:ascii="Segoe UI" w:hAnsi="Segoe UI" w:cs="Segoe UI"/>
+          <w:sz w:val="24"/>
+          <w:lang w:val="en-US"/>
+        </w:rPr>
+        <w:t xml:space="preserve"> </w:t>
+      </w:r>
+      <w:proofErr w:type="spellStart"/>
+      <w:r>
+        <w:rPr>
+          <w:rFonts w:ascii="Segoe UI" w:hAnsi="Segoe UI" w:cs="Segoe UI"/>
           <w:sz w:val="24"/>
           <w:lang w:val="en-US"/>
         </w:rPr>
@@ -2502,6 +2798,7 @@
       <w:proofErr w:type="spellEnd"/>
       <w:r>
         <w:rPr>
+          <w:rFonts w:ascii="Segoe UI" w:hAnsi="Segoe UI" w:cs="Segoe UI"/>
           <w:sz w:val="24"/>
           <w:lang w:val="en-US"/>
         </w:rPr>
@@ -2510,6 +2807,7 @@
       <w:proofErr w:type="spellStart"/>
       <w:r>
         <w:rPr>
+          <w:rFonts w:ascii="Segoe UI" w:hAnsi="Segoe UI" w:cs="Segoe UI"/>
           <w:sz w:val="24"/>
           <w:lang w:val="en-US"/>
         </w:rPr>
@@ -2518,14 +2816,16 @@
       <w:proofErr w:type="spellEnd"/>
       <w:r>
         <w:rPr>
-          <w:sz w:val="24"/>
-          <w:lang w:val="en-US"/>
-        </w:rPr>
-        <w:t xml:space="preserve"> </w:t>
-      </w:r>
-      <w:proofErr w:type="spellStart"/>
-      <w:r>
-        <w:rPr>
+          <w:rFonts w:ascii="Segoe UI" w:hAnsi="Segoe UI" w:cs="Segoe UI"/>
+          <w:sz w:val="24"/>
+          <w:lang w:val="en-US"/>
+        </w:rPr>
+        <w:t xml:space="preserve"> </w:t>
+      </w:r>
+      <w:proofErr w:type="spellStart"/>
+      <w:r>
+        <w:rPr>
+          <w:rFonts w:ascii="Segoe UI" w:hAnsi="Segoe UI" w:cs="Segoe UI"/>
           <w:sz w:val="24"/>
           <w:lang w:val="en-US"/>
         </w:rPr>
@@ -2534,6 +2834,7 @@
       <w:proofErr w:type="spellEnd"/>
       <w:r>
         <w:rPr>
+          <w:rFonts w:ascii="Segoe UI" w:hAnsi="Segoe UI" w:cs="Segoe UI"/>
           <w:sz w:val="24"/>
           <w:lang w:val="en-US"/>
         </w:rPr>
@@ -2542,6 +2843,7 @@
       <w:proofErr w:type="spellStart"/>
       <w:r>
         <w:rPr>
+          <w:rFonts w:ascii="Segoe UI" w:hAnsi="Segoe UI" w:cs="Segoe UI"/>
           <w:sz w:val="24"/>
           <w:lang w:val="en-US"/>
         </w:rPr>
@@ -2550,14 +2852,16 @@
       <w:proofErr w:type="spellEnd"/>
       <w:r>
         <w:rPr>
-          <w:sz w:val="24"/>
-          <w:lang w:val="en-US"/>
-        </w:rPr>
-        <w:t xml:space="preserve"> </w:t>
-      </w:r>
-      <w:proofErr w:type="spellStart"/>
-      <w:r>
-        <w:rPr>
+          <w:rFonts w:ascii="Segoe UI" w:hAnsi="Segoe UI" w:cs="Segoe UI"/>
+          <w:sz w:val="24"/>
+          <w:lang w:val="en-US"/>
+        </w:rPr>
+        <w:t xml:space="preserve"> </w:t>
+      </w:r>
+      <w:proofErr w:type="spellStart"/>
+      <w:r>
+        <w:rPr>
+          <w:rFonts w:ascii="Segoe UI" w:hAnsi="Segoe UI" w:cs="Segoe UI"/>
           <w:sz w:val="24"/>
           <w:lang w:val="en-US"/>
         </w:rPr>
@@ -2566,6 +2870,7 @@
       <w:proofErr w:type="spellEnd"/>
       <w:r>
         <w:rPr>
+          <w:rFonts w:ascii="Segoe UI" w:hAnsi="Segoe UI" w:cs="Segoe UI"/>
           <w:sz w:val="24"/>
           <w:lang w:val="en-US"/>
         </w:rPr>
@@ -2574,6 +2879,7 @@
       <w:proofErr w:type="spellStart"/>
       <w:r>
         <w:rPr>
+          <w:rFonts w:ascii="Segoe UI" w:hAnsi="Segoe UI" w:cs="Segoe UI"/>
           <w:sz w:val="24"/>
           <w:lang w:val="en-US"/>
         </w:rPr>
@@ -2582,14 +2888,16 @@
       <w:proofErr w:type="spellEnd"/>
       <w:r>
         <w:rPr>
-          <w:sz w:val="24"/>
-          <w:lang w:val="en-US"/>
-        </w:rPr>
-        <w:t xml:space="preserve"> </w:t>
-      </w:r>
-      <w:proofErr w:type="spellStart"/>
-      <w:r>
-        <w:rPr>
+          <w:rFonts w:ascii="Segoe UI" w:hAnsi="Segoe UI" w:cs="Segoe UI"/>
+          <w:sz w:val="24"/>
+          <w:lang w:val="en-US"/>
+        </w:rPr>
+        <w:t xml:space="preserve"> </w:t>
+      </w:r>
+      <w:proofErr w:type="spellStart"/>
+      <w:r>
+        <w:rPr>
+          <w:rFonts w:ascii="Segoe UI" w:hAnsi="Segoe UI" w:cs="Segoe UI"/>
           <w:sz w:val="24"/>
           <w:lang w:val="en-US"/>
         </w:rPr>
@@ -2598,14 +2906,16 @@
       <w:proofErr w:type="spellEnd"/>
       <w:r>
         <w:rPr>
-          <w:sz w:val="24"/>
-          <w:lang w:val="en-US"/>
-        </w:rPr>
-        <w:t xml:space="preserve"> </w:t>
-      </w:r>
-      <w:proofErr w:type="spellStart"/>
-      <w:r>
-        <w:rPr>
+          <w:rFonts w:ascii="Segoe UI" w:hAnsi="Segoe UI" w:cs="Segoe UI"/>
+          <w:sz w:val="24"/>
+          <w:lang w:val="en-US"/>
+        </w:rPr>
+        <w:t xml:space="preserve"> </w:t>
+      </w:r>
+      <w:proofErr w:type="spellStart"/>
+      <w:r>
+        <w:rPr>
+          <w:rFonts w:ascii="Segoe UI" w:hAnsi="Segoe UI" w:cs="Segoe UI"/>
           <w:sz w:val="24"/>
           <w:lang w:val="en-US"/>
         </w:rPr>
@@ -2614,6 +2924,7 @@
       <w:proofErr w:type="spellEnd"/>
       <w:r>
         <w:rPr>
+          <w:rFonts w:ascii="Segoe UI" w:hAnsi="Segoe UI" w:cs="Segoe UI"/>
           <w:sz w:val="24"/>
           <w:lang w:val="en-US"/>
         </w:rPr>
@@ -2628,6 +2939,7 @@
           <w:numId w:val="4"/>
         </w:numPr>
         <w:rPr>
+          <w:rFonts w:ascii="Segoe UI" w:hAnsi="Segoe UI" w:cs="Segoe UI"/>
           <w:sz w:val="24"/>
           <w:u w:val="single"/>
           <w:lang w:val="en-US"/>
@@ -2636,6 +2948,7 @@
       <w:proofErr w:type="spellStart"/>
       <w:r>
         <w:rPr>
+          <w:rFonts w:ascii="Segoe UI" w:hAnsi="Segoe UI" w:cs="Segoe UI"/>
           <w:sz w:val="24"/>
           <w:lang w:val="en-US"/>
         </w:rPr>
@@ -2644,14 +2957,16 @@
       <w:proofErr w:type="spellEnd"/>
       <w:r>
         <w:rPr>
-          <w:sz w:val="24"/>
-          <w:lang w:val="en-US"/>
-        </w:rPr>
-        <w:t xml:space="preserve"> </w:t>
-      </w:r>
-      <w:proofErr w:type="spellStart"/>
-      <w:r>
-        <w:rPr>
+          <w:rFonts w:ascii="Segoe UI" w:hAnsi="Segoe UI" w:cs="Segoe UI"/>
+          <w:sz w:val="24"/>
+          <w:lang w:val="en-US"/>
+        </w:rPr>
+        <w:t xml:space="preserve"> </w:t>
+      </w:r>
+      <w:proofErr w:type="spellStart"/>
+      <w:r>
+        <w:rPr>
+          <w:rFonts w:ascii="Segoe UI" w:hAnsi="Segoe UI" w:cs="Segoe UI"/>
           <w:sz w:val="24"/>
           <w:lang w:val="en-US"/>
         </w:rPr>
@@ -2660,6 +2975,7 @@
       <w:proofErr w:type="spellEnd"/>
       <w:r>
         <w:rPr>
+          <w:rFonts w:ascii="Segoe UI" w:hAnsi="Segoe UI" w:cs="Segoe UI"/>
           <w:sz w:val="24"/>
           <w:lang w:val="en-US"/>
         </w:rPr>
@@ -2668,6 +2984,7 @@
       <w:proofErr w:type="spellStart"/>
       <w:r>
         <w:rPr>
+          <w:rFonts w:ascii="Segoe UI" w:hAnsi="Segoe UI" w:cs="Segoe UI"/>
           <w:sz w:val="24"/>
           <w:lang w:val="en-US"/>
         </w:rPr>
@@ -2676,14 +2993,16 @@
       <w:proofErr w:type="spellEnd"/>
       <w:r>
         <w:rPr>
-          <w:sz w:val="24"/>
-          <w:lang w:val="en-US"/>
-        </w:rPr>
-        <w:t xml:space="preserve"> </w:t>
-      </w:r>
-      <w:proofErr w:type="spellStart"/>
-      <w:r>
-        <w:rPr>
+          <w:rFonts w:ascii="Segoe UI" w:hAnsi="Segoe UI" w:cs="Segoe UI"/>
+          <w:sz w:val="24"/>
+          <w:lang w:val="en-US"/>
+        </w:rPr>
+        <w:t xml:space="preserve"> </w:t>
+      </w:r>
+      <w:proofErr w:type="spellStart"/>
+      <w:r>
+        <w:rPr>
+          <w:rFonts w:ascii="Segoe UI" w:hAnsi="Segoe UI" w:cs="Segoe UI"/>
           <w:sz w:val="24"/>
           <w:lang w:val="en-US"/>
         </w:rPr>
@@ -2692,14 +3011,16 @@
       <w:proofErr w:type="spellEnd"/>
       <w:r>
         <w:rPr>
-          <w:sz w:val="24"/>
-          <w:lang w:val="en-US"/>
-        </w:rPr>
-        <w:t xml:space="preserve"> </w:t>
-      </w:r>
-      <w:proofErr w:type="spellStart"/>
-      <w:r>
-        <w:rPr>
+          <w:rFonts w:ascii="Segoe UI" w:hAnsi="Segoe UI" w:cs="Segoe UI"/>
+          <w:sz w:val="24"/>
+          <w:lang w:val="en-US"/>
+        </w:rPr>
+        <w:t xml:space="preserve"> </w:t>
+      </w:r>
+      <w:proofErr w:type="spellStart"/>
+      <w:r>
+        <w:rPr>
+          <w:rFonts w:ascii="Segoe UI" w:hAnsi="Segoe UI" w:cs="Segoe UI"/>
           <w:sz w:val="24"/>
           <w:lang w:val="en-US"/>
         </w:rPr>
@@ -2708,14 +3029,16 @@
       <w:proofErr w:type="spellEnd"/>
       <w:r>
         <w:rPr>
-          <w:sz w:val="24"/>
-          <w:lang w:val="en-US"/>
-        </w:rPr>
-        <w:t xml:space="preserve"> </w:t>
-      </w:r>
-      <w:proofErr w:type="spellStart"/>
-      <w:r>
-        <w:rPr>
+          <w:rFonts w:ascii="Segoe UI" w:hAnsi="Segoe UI" w:cs="Segoe UI"/>
+          <w:sz w:val="24"/>
+          <w:lang w:val="en-US"/>
+        </w:rPr>
+        <w:t xml:space="preserve"> </w:t>
+      </w:r>
+      <w:proofErr w:type="spellStart"/>
+      <w:r>
+        <w:rPr>
+          <w:rFonts w:ascii="Segoe UI" w:hAnsi="Segoe UI" w:cs="Segoe UI"/>
           <w:sz w:val="24"/>
           <w:lang w:val="en-US"/>
         </w:rPr>
@@ -2724,14 +3047,16 @@
       <w:proofErr w:type="spellEnd"/>
       <w:r>
         <w:rPr>
-          <w:sz w:val="24"/>
-          <w:lang w:val="en-US"/>
-        </w:rPr>
-        <w:t xml:space="preserve"> </w:t>
-      </w:r>
-      <w:proofErr w:type="spellStart"/>
-      <w:r>
-        <w:rPr>
+          <w:rFonts w:ascii="Segoe UI" w:hAnsi="Segoe UI" w:cs="Segoe UI"/>
+          <w:sz w:val="24"/>
+          <w:lang w:val="en-US"/>
+        </w:rPr>
+        <w:t xml:space="preserve"> </w:t>
+      </w:r>
+      <w:proofErr w:type="spellStart"/>
+      <w:r>
+        <w:rPr>
+          <w:rFonts w:ascii="Segoe UI" w:hAnsi="Segoe UI" w:cs="Segoe UI"/>
           <w:sz w:val="24"/>
           <w:lang w:val="en-US"/>
         </w:rPr>
@@ -2747,6 +3072,7 @@
           <w:numId w:val="4"/>
         </w:numPr>
         <w:rPr>
+          <w:rFonts w:ascii="Segoe UI" w:hAnsi="Segoe UI" w:cs="Segoe UI"/>
           <w:sz w:val="24"/>
           <w:u w:val="single"/>
           <w:lang w:val="en-US"/>
@@ -2755,6 +3081,7 @@
       <w:proofErr w:type="spellStart"/>
       <w:r>
         <w:rPr>
+          <w:rFonts w:ascii="Segoe UI" w:hAnsi="Segoe UI" w:cs="Segoe UI"/>
           <w:sz w:val="24"/>
           <w:lang w:val="en-US"/>
         </w:rPr>
@@ -2763,14 +3090,16 @@
       <w:proofErr w:type="spellEnd"/>
       <w:r>
         <w:rPr>
-          <w:sz w:val="24"/>
-          <w:lang w:val="en-US"/>
-        </w:rPr>
-        <w:t xml:space="preserve"> </w:t>
-      </w:r>
-      <w:proofErr w:type="spellStart"/>
-      <w:r>
-        <w:rPr>
+          <w:rFonts w:ascii="Segoe UI" w:hAnsi="Segoe UI" w:cs="Segoe UI"/>
+          <w:sz w:val="24"/>
+          <w:lang w:val="en-US"/>
+        </w:rPr>
+        <w:t xml:space="preserve"> </w:t>
+      </w:r>
+      <w:proofErr w:type="spellStart"/>
+      <w:r>
+        <w:rPr>
+          <w:rFonts w:ascii="Segoe UI" w:hAnsi="Segoe UI" w:cs="Segoe UI"/>
           <w:sz w:val="24"/>
           <w:lang w:val="en-US"/>
         </w:rPr>
@@ -2779,14 +3108,16 @@
       <w:proofErr w:type="spellEnd"/>
       <w:r>
         <w:rPr>
-          <w:sz w:val="24"/>
-          <w:lang w:val="en-US"/>
-        </w:rPr>
-        <w:t xml:space="preserve"> </w:t>
-      </w:r>
-      <w:proofErr w:type="spellStart"/>
-      <w:r>
-        <w:rPr>
+          <w:rFonts w:ascii="Segoe UI" w:hAnsi="Segoe UI" w:cs="Segoe UI"/>
+          <w:sz w:val="24"/>
+          <w:lang w:val="en-US"/>
+        </w:rPr>
+        <w:t xml:space="preserve"> </w:t>
+      </w:r>
+      <w:proofErr w:type="spellStart"/>
+      <w:r>
+        <w:rPr>
+          <w:rFonts w:ascii="Segoe UI" w:hAnsi="Segoe UI" w:cs="Segoe UI"/>
           <w:sz w:val="24"/>
           <w:lang w:val="en-US"/>
         </w:rPr>
@@ -2795,14 +3126,16 @@
       <w:proofErr w:type="spellEnd"/>
       <w:r>
         <w:rPr>
-          <w:sz w:val="24"/>
-          <w:lang w:val="en-US"/>
-        </w:rPr>
-        <w:t xml:space="preserve"> </w:t>
-      </w:r>
-      <w:proofErr w:type="spellStart"/>
-      <w:r>
-        <w:rPr>
+          <w:rFonts w:ascii="Segoe UI" w:hAnsi="Segoe UI" w:cs="Segoe UI"/>
+          <w:sz w:val="24"/>
+          <w:lang w:val="en-US"/>
+        </w:rPr>
+        <w:t xml:space="preserve"> </w:t>
+      </w:r>
+      <w:proofErr w:type="spellStart"/>
+      <w:r>
+        <w:rPr>
+          <w:rFonts w:ascii="Segoe UI" w:hAnsi="Segoe UI" w:cs="Segoe UI"/>
           <w:sz w:val="24"/>
           <w:lang w:val="en-US"/>
         </w:rPr>
@@ -2811,14 +3144,16 @@
       <w:proofErr w:type="spellEnd"/>
       <w:r>
         <w:rPr>
-          <w:sz w:val="24"/>
-          <w:lang w:val="en-US"/>
-        </w:rPr>
-        <w:t xml:space="preserve"> </w:t>
-      </w:r>
-      <w:proofErr w:type="spellStart"/>
-      <w:r>
-        <w:rPr>
+          <w:rFonts w:ascii="Segoe UI" w:hAnsi="Segoe UI" w:cs="Segoe UI"/>
+          <w:sz w:val="24"/>
+          <w:lang w:val="en-US"/>
+        </w:rPr>
+        <w:t xml:space="preserve"> </w:t>
+      </w:r>
+      <w:proofErr w:type="spellStart"/>
+      <w:r>
+        <w:rPr>
+          <w:rFonts w:ascii="Segoe UI" w:hAnsi="Segoe UI" w:cs="Segoe UI"/>
           <w:sz w:val="24"/>
           <w:lang w:val="en-US"/>
         </w:rPr>
@@ -2827,14 +3162,16 @@
       <w:proofErr w:type="spellEnd"/>
       <w:r>
         <w:rPr>
-          <w:sz w:val="24"/>
-          <w:lang w:val="en-US"/>
-        </w:rPr>
-        <w:t xml:space="preserve"> </w:t>
-      </w:r>
-      <w:proofErr w:type="spellStart"/>
-      <w:r>
-        <w:rPr>
+          <w:rFonts w:ascii="Segoe UI" w:hAnsi="Segoe UI" w:cs="Segoe UI"/>
+          <w:sz w:val="24"/>
+          <w:lang w:val="en-US"/>
+        </w:rPr>
+        <w:t xml:space="preserve"> </w:t>
+      </w:r>
+      <w:proofErr w:type="spellStart"/>
+      <w:r>
+        <w:rPr>
+          <w:rFonts w:ascii="Segoe UI" w:hAnsi="Segoe UI" w:cs="Segoe UI"/>
           <w:sz w:val="24"/>
           <w:lang w:val="en-US"/>
         </w:rPr>
@@ -2843,14 +3180,16 @@
       <w:proofErr w:type="spellEnd"/>
       <w:r>
         <w:rPr>
-          <w:sz w:val="24"/>
-          <w:lang w:val="en-US"/>
-        </w:rPr>
-        <w:t xml:space="preserve"> </w:t>
-      </w:r>
-      <w:proofErr w:type="spellStart"/>
-      <w:r>
-        <w:rPr>
+          <w:rFonts w:ascii="Segoe UI" w:hAnsi="Segoe UI" w:cs="Segoe UI"/>
+          <w:sz w:val="24"/>
+          <w:lang w:val="en-US"/>
+        </w:rPr>
+        <w:t xml:space="preserve"> </w:t>
+      </w:r>
+      <w:proofErr w:type="spellStart"/>
+      <w:r>
+        <w:rPr>
+          <w:rFonts w:ascii="Segoe UI" w:hAnsi="Segoe UI" w:cs="Segoe UI"/>
           <w:sz w:val="24"/>
           <w:lang w:val="en-US"/>
         </w:rPr>
@@ -2859,14 +3198,16 @@
       <w:proofErr w:type="spellEnd"/>
       <w:r>
         <w:rPr>
-          <w:sz w:val="24"/>
-          <w:lang w:val="en-US"/>
-        </w:rPr>
-        <w:t xml:space="preserve"> </w:t>
-      </w:r>
-      <w:proofErr w:type="spellStart"/>
-      <w:r>
-        <w:rPr>
+          <w:rFonts w:ascii="Segoe UI" w:hAnsi="Segoe UI" w:cs="Segoe UI"/>
+          <w:sz w:val="24"/>
+          <w:lang w:val="en-US"/>
+        </w:rPr>
+        <w:t xml:space="preserve"> </w:t>
+      </w:r>
+      <w:proofErr w:type="spellStart"/>
+      <w:r>
+        <w:rPr>
+          <w:rFonts w:ascii="Segoe UI" w:hAnsi="Segoe UI" w:cs="Segoe UI"/>
           <w:sz w:val="24"/>
           <w:lang w:val="en-US"/>
         </w:rPr>
@@ -2875,14 +3216,16 @@
       <w:proofErr w:type="spellEnd"/>
       <w:r>
         <w:rPr>
-          <w:sz w:val="24"/>
-          <w:lang w:val="en-US"/>
-        </w:rPr>
-        <w:t xml:space="preserve"> </w:t>
-      </w:r>
-      <w:proofErr w:type="spellStart"/>
-      <w:r>
-        <w:rPr>
+          <w:rFonts w:ascii="Segoe UI" w:hAnsi="Segoe UI" w:cs="Segoe UI"/>
+          <w:sz w:val="24"/>
+          <w:lang w:val="en-US"/>
+        </w:rPr>
+        <w:t xml:space="preserve"> </w:t>
+      </w:r>
+      <w:proofErr w:type="spellStart"/>
+      <w:r>
+        <w:rPr>
+          <w:rFonts w:ascii="Segoe UI" w:hAnsi="Segoe UI" w:cs="Segoe UI"/>
           <w:sz w:val="24"/>
           <w:lang w:val="en-US"/>
         </w:rPr>
@@ -2891,14 +3234,16 @@
       <w:proofErr w:type="spellEnd"/>
       <w:r>
         <w:rPr>
-          <w:sz w:val="24"/>
-          <w:lang w:val="en-US"/>
-        </w:rPr>
-        <w:t xml:space="preserve"> </w:t>
-      </w:r>
-      <w:proofErr w:type="spellStart"/>
-      <w:r>
-        <w:rPr>
+          <w:rFonts w:ascii="Segoe UI" w:hAnsi="Segoe UI" w:cs="Segoe UI"/>
+          <w:sz w:val="24"/>
+          <w:lang w:val="en-US"/>
+        </w:rPr>
+        <w:t xml:space="preserve"> </w:t>
+      </w:r>
+      <w:proofErr w:type="spellStart"/>
+      <w:r>
+        <w:rPr>
+          <w:rFonts w:ascii="Segoe UI" w:hAnsi="Segoe UI" w:cs="Segoe UI"/>
           <w:sz w:val="24"/>
           <w:lang w:val="en-US"/>
         </w:rPr>
@@ -2907,14 +3252,16 @@
       <w:proofErr w:type="spellEnd"/>
       <w:r>
         <w:rPr>
-          <w:sz w:val="24"/>
-          <w:lang w:val="en-US"/>
-        </w:rPr>
-        <w:t xml:space="preserve"> </w:t>
-      </w:r>
-      <w:proofErr w:type="spellStart"/>
-      <w:r>
-        <w:rPr>
+          <w:rFonts w:ascii="Segoe UI" w:hAnsi="Segoe UI" w:cs="Segoe UI"/>
+          <w:sz w:val="24"/>
+          <w:lang w:val="en-US"/>
+        </w:rPr>
+        <w:t xml:space="preserve"> </w:t>
+      </w:r>
+      <w:proofErr w:type="spellStart"/>
+      <w:r>
+        <w:rPr>
+          <w:rFonts w:ascii="Segoe UI" w:hAnsi="Segoe UI" w:cs="Segoe UI"/>
           <w:sz w:val="24"/>
           <w:lang w:val="en-US"/>
         </w:rPr>
@@ -2923,14 +3270,16 @@
       <w:proofErr w:type="spellEnd"/>
       <w:r>
         <w:rPr>
-          <w:sz w:val="24"/>
-          <w:lang w:val="en-US"/>
-        </w:rPr>
-        <w:t xml:space="preserve"> </w:t>
-      </w:r>
-      <w:proofErr w:type="spellStart"/>
-      <w:r>
-        <w:rPr>
+          <w:rFonts w:ascii="Segoe UI" w:hAnsi="Segoe UI" w:cs="Segoe UI"/>
+          <w:sz w:val="24"/>
+          <w:lang w:val="en-US"/>
+        </w:rPr>
+        <w:t xml:space="preserve"> </w:t>
+      </w:r>
+      <w:proofErr w:type="spellStart"/>
+      <w:r>
+        <w:rPr>
+          <w:rFonts w:ascii="Segoe UI" w:hAnsi="Segoe UI" w:cs="Segoe UI"/>
           <w:sz w:val="24"/>
           <w:lang w:val="en-US"/>
         </w:rPr>
@@ -2946,6 +3295,7 @@
           <w:numId w:val="4"/>
         </w:numPr>
         <w:rPr>
+          <w:rFonts w:ascii="Segoe UI" w:hAnsi="Segoe UI" w:cs="Segoe UI"/>
           <w:sz w:val="24"/>
           <w:u w:val="single"/>
           <w:lang w:val="en-US"/>
@@ -2954,6 +3304,7 @@
       <w:proofErr w:type="spellStart"/>
       <w:r>
         <w:rPr>
+          <w:rFonts w:ascii="Segoe UI" w:hAnsi="Segoe UI" w:cs="Segoe UI"/>
           <w:sz w:val="24"/>
           <w:lang w:val="en-US"/>
         </w:rPr>
@@ -2962,6 +3313,7 @@
       <w:proofErr w:type="spellEnd"/>
       <w:r>
         <w:rPr>
+          <w:rFonts w:ascii="Segoe UI" w:hAnsi="Segoe UI" w:cs="Segoe UI"/>
           <w:sz w:val="24"/>
           <w:lang w:val="en-US"/>
         </w:rPr>
@@ -2970,6 +3322,7 @@
       <w:proofErr w:type="spellStart"/>
       <w:r>
         <w:rPr>
+          <w:rFonts w:ascii="Segoe UI" w:hAnsi="Segoe UI" w:cs="Segoe UI"/>
           <w:sz w:val="24"/>
           <w:lang w:val="en-US"/>
         </w:rPr>
@@ -2978,14 +3331,16 @@
       <w:proofErr w:type="spellEnd"/>
       <w:r>
         <w:rPr>
-          <w:sz w:val="24"/>
-          <w:lang w:val="en-US"/>
-        </w:rPr>
-        <w:t xml:space="preserve"> </w:t>
-      </w:r>
-      <w:proofErr w:type="spellStart"/>
-      <w:r>
-        <w:rPr>
+          <w:rFonts w:ascii="Segoe UI" w:hAnsi="Segoe UI" w:cs="Segoe UI"/>
+          <w:sz w:val="24"/>
+          <w:lang w:val="en-US"/>
+        </w:rPr>
+        <w:t xml:space="preserve"> </w:t>
+      </w:r>
+      <w:proofErr w:type="spellStart"/>
+      <w:r>
+        <w:rPr>
+          <w:rFonts w:ascii="Segoe UI" w:hAnsi="Segoe UI" w:cs="Segoe UI"/>
           <w:sz w:val="24"/>
           <w:lang w:val="en-US"/>
         </w:rPr>
@@ -2994,14 +3349,16 @@
       <w:proofErr w:type="spellEnd"/>
       <w:r>
         <w:rPr>
-          <w:sz w:val="24"/>
-          <w:lang w:val="en-US"/>
-        </w:rPr>
-        <w:t xml:space="preserve"> </w:t>
-      </w:r>
-      <w:proofErr w:type="spellStart"/>
-      <w:r>
-        <w:rPr>
+          <w:rFonts w:ascii="Segoe UI" w:hAnsi="Segoe UI" w:cs="Segoe UI"/>
+          <w:sz w:val="24"/>
+          <w:lang w:val="en-US"/>
+        </w:rPr>
+        <w:t xml:space="preserve"> </w:t>
+      </w:r>
+      <w:proofErr w:type="spellStart"/>
+      <w:r>
+        <w:rPr>
+          <w:rFonts w:ascii="Segoe UI" w:hAnsi="Segoe UI" w:cs="Segoe UI"/>
           <w:sz w:val="24"/>
           <w:lang w:val="en-US"/>
         </w:rPr>
@@ -3010,6 +3367,7 @@
       <w:proofErr w:type="spellEnd"/>
       <w:r>
         <w:rPr>
+          <w:rFonts w:ascii="Segoe UI" w:hAnsi="Segoe UI" w:cs="Segoe UI"/>
           <w:sz w:val="24"/>
           <w:lang w:val="en-US"/>
         </w:rPr>
@@ -3018,6 +3376,7 @@
       <w:proofErr w:type="spellStart"/>
       <w:r>
         <w:rPr>
+          <w:rFonts w:ascii="Segoe UI" w:hAnsi="Segoe UI" w:cs="Segoe UI"/>
           <w:sz w:val="24"/>
           <w:lang w:val="en-US"/>
         </w:rPr>
@@ -3026,14 +3385,16 @@
       <w:proofErr w:type="spellEnd"/>
       <w:r>
         <w:rPr>
-          <w:sz w:val="24"/>
-          <w:lang w:val="en-US"/>
-        </w:rPr>
-        <w:t xml:space="preserve"> </w:t>
-      </w:r>
-      <w:proofErr w:type="spellStart"/>
-      <w:r>
-        <w:rPr>
+          <w:rFonts w:ascii="Segoe UI" w:hAnsi="Segoe UI" w:cs="Segoe UI"/>
+          <w:sz w:val="24"/>
+          <w:lang w:val="en-US"/>
+        </w:rPr>
+        <w:t xml:space="preserve"> </w:t>
+      </w:r>
+      <w:proofErr w:type="spellStart"/>
+      <w:r>
+        <w:rPr>
+          <w:rFonts w:ascii="Segoe UI" w:hAnsi="Segoe UI" w:cs="Segoe UI"/>
           <w:sz w:val="24"/>
           <w:lang w:val="en-US"/>
         </w:rPr>
@@ -3049,6 +3410,7 @@
           <w:numId w:val="3"/>
         </w:numPr>
         <w:rPr>
+          <w:rFonts w:ascii="Segoe UI" w:hAnsi="Segoe UI" w:cs="Segoe UI"/>
           <w:sz w:val="24"/>
           <w:u w:val="single"/>
           <w:lang w:val="en-US"/>
@@ -3057,6 +3419,7 @@
       <w:proofErr w:type="spellStart"/>
       <w:r>
         <w:rPr>
+          <w:rFonts w:ascii="Segoe UI" w:hAnsi="Segoe UI" w:cs="Segoe UI"/>
           <w:sz w:val="24"/>
           <w:u w:val="single"/>
           <w:lang w:val="en-US"/>
@@ -3066,6 +3429,7 @@
       <w:proofErr w:type="spellEnd"/>
       <w:r>
         <w:rPr>
+          <w:rFonts w:ascii="Segoe UI" w:hAnsi="Segoe UI" w:cs="Segoe UI"/>
           <w:sz w:val="24"/>
           <w:u w:val="single"/>
           <w:lang w:val="en-US"/>
@@ -3075,6 +3439,7 @@
       <w:proofErr w:type="spellStart"/>
       <w:r>
         <w:rPr>
+          <w:rFonts w:ascii="Segoe UI" w:hAnsi="Segoe UI" w:cs="Segoe UI"/>
           <w:sz w:val="24"/>
           <w:u w:val="single"/>
           <w:lang w:val="en-US"/>
@@ -3084,6 +3449,7 @@
       <w:proofErr w:type="spellEnd"/>
       <w:r>
         <w:rPr>
+          <w:rFonts w:ascii="Segoe UI" w:hAnsi="Segoe UI" w:cs="Segoe UI"/>
           <w:sz w:val="24"/>
           <w:u w:val="single"/>
           <w:lang w:val="en-US"/>
@@ -3093,6 +3459,7 @@
       <w:proofErr w:type="spellStart"/>
       <w:r>
         <w:rPr>
+          <w:rFonts w:ascii="Segoe UI" w:hAnsi="Segoe UI" w:cs="Segoe UI"/>
           <w:sz w:val="24"/>
           <w:u w:val="single"/>
           <w:lang w:val="en-US"/>
@@ -3102,6 +3469,7 @@
       <w:proofErr w:type="spellEnd"/>
       <w:r>
         <w:rPr>
+          <w:rFonts w:ascii="Segoe UI" w:hAnsi="Segoe UI" w:cs="Segoe UI"/>
           <w:sz w:val="24"/>
           <w:u w:val="single"/>
           <w:lang w:val="en-US"/>
@@ -3111,6 +3479,7 @@
       <w:proofErr w:type="spellStart"/>
       <w:r>
         <w:rPr>
+          <w:rFonts w:ascii="Segoe UI" w:hAnsi="Segoe UI" w:cs="Segoe UI"/>
           <w:sz w:val="24"/>
           <w:u w:val="single"/>
           <w:lang w:val="en-US"/>
@@ -3120,6 +3489,7 @@
       <w:proofErr w:type="spellEnd"/>
       <w:r>
         <w:rPr>
+          <w:rFonts w:ascii="Segoe UI" w:hAnsi="Segoe UI" w:cs="Segoe UI"/>
           <w:sz w:val="24"/>
           <w:u w:val="single"/>
           <w:lang w:val="en-US"/>
@@ -3129,6 +3499,7 @@
       <w:proofErr w:type="spellStart"/>
       <w:r>
         <w:rPr>
+          <w:rFonts w:ascii="Segoe UI" w:hAnsi="Segoe UI" w:cs="Segoe UI"/>
           <w:sz w:val="24"/>
           <w:u w:val="single"/>
           <w:lang w:val="en-US"/>
@@ -3138,6 +3509,7 @@
       <w:proofErr w:type="spellEnd"/>
       <w:r>
         <w:rPr>
+          <w:rFonts w:ascii="Segoe UI" w:hAnsi="Segoe UI" w:cs="Segoe UI"/>
           <w:sz w:val="24"/>
           <w:u w:val="single"/>
           <w:lang w:val="en-US"/>
@@ -3147,6 +3519,7 @@
       <w:proofErr w:type="spellStart"/>
       <w:r>
         <w:rPr>
+          <w:rFonts w:ascii="Segoe UI" w:hAnsi="Segoe UI" w:cs="Segoe UI"/>
           <w:sz w:val="24"/>
           <w:u w:val="single"/>
           <w:lang w:val="en-US"/>
@@ -3156,6 +3529,7 @@
       <w:proofErr w:type="spellEnd"/>
       <w:r>
         <w:rPr>
+          <w:rFonts w:ascii="Segoe UI" w:hAnsi="Segoe UI" w:cs="Segoe UI"/>
           <w:sz w:val="24"/>
           <w:u w:val="single"/>
           <w:lang w:val="en-US"/>
@@ -3171,6 +3545,7 @@
           <w:numId w:val="6"/>
         </w:numPr>
         <w:rPr>
+          <w:rFonts w:ascii="Segoe UI" w:hAnsi="Segoe UI" w:cs="Segoe UI"/>
           <w:sz w:val="24"/>
           <w:u w:val="single"/>
           <w:lang w:val="en-US"/>
@@ -3179,6 +3554,7 @@
       <w:proofErr w:type="spellStart"/>
       <w:r>
         <w:rPr>
+          <w:rFonts w:ascii="Segoe UI" w:hAnsi="Segoe UI" w:cs="Segoe UI"/>
           <w:sz w:val="24"/>
           <w:lang w:val="en-US"/>
         </w:rPr>
@@ -3187,14 +3563,16 @@
       <w:proofErr w:type="spellEnd"/>
       <w:r>
         <w:rPr>
-          <w:sz w:val="24"/>
-          <w:lang w:val="en-US"/>
-        </w:rPr>
-        <w:t xml:space="preserve"> </w:t>
-      </w:r>
-      <w:proofErr w:type="spellStart"/>
-      <w:r>
-        <w:rPr>
+          <w:rFonts w:ascii="Segoe UI" w:hAnsi="Segoe UI" w:cs="Segoe UI"/>
+          <w:sz w:val="24"/>
+          <w:lang w:val="en-US"/>
+        </w:rPr>
+        <w:t xml:space="preserve"> </w:t>
+      </w:r>
+      <w:proofErr w:type="spellStart"/>
+      <w:r>
+        <w:rPr>
+          <w:rFonts w:ascii="Segoe UI" w:hAnsi="Segoe UI" w:cs="Segoe UI"/>
           <w:sz w:val="24"/>
           <w:lang w:val="en-US"/>
         </w:rPr>
@@ -3203,14 +3581,16 @@
       <w:proofErr w:type="spellEnd"/>
       <w:r>
         <w:rPr>
-          <w:sz w:val="24"/>
-          <w:lang w:val="en-US"/>
-        </w:rPr>
-        <w:t xml:space="preserve"> </w:t>
-      </w:r>
-      <w:proofErr w:type="spellStart"/>
-      <w:r>
-        <w:rPr>
+          <w:rFonts w:ascii="Segoe UI" w:hAnsi="Segoe UI" w:cs="Segoe UI"/>
+          <w:sz w:val="24"/>
+          <w:lang w:val="en-US"/>
+        </w:rPr>
+        <w:t xml:space="preserve"> </w:t>
+      </w:r>
+      <w:proofErr w:type="spellStart"/>
+      <w:r>
+        <w:rPr>
+          <w:rFonts w:ascii="Segoe UI" w:hAnsi="Segoe UI" w:cs="Segoe UI"/>
           <w:sz w:val="24"/>
           <w:lang w:val="en-US"/>
         </w:rPr>
@@ -3219,14 +3599,16 @@
       <w:proofErr w:type="spellEnd"/>
       <w:r>
         <w:rPr>
-          <w:sz w:val="24"/>
-          <w:lang w:val="en-US"/>
-        </w:rPr>
-        <w:t xml:space="preserve"> </w:t>
-      </w:r>
-      <w:proofErr w:type="spellStart"/>
-      <w:r>
-        <w:rPr>
+          <w:rFonts w:ascii="Segoe UI" w:hAnsi="Segoe UI" w:cs="Segoe UI"/>
+          <w:sz w:val="24"/>
+          <w:lang w:val="en-US"/>
+        </w:rPr>
+        <w:t xml:space="preserve"> </w:t>
+      </w:r>
+      <w:proofErr w:type="spellStart"/>
+      <w:r>
+        <w:rPr>
+          <w:rFonts w:ascii="Segoe UI" w:hAnsi="Segoe UI" w:cs="Segoe UI"/>
           <w:sz w:val="24"/>
           <w:lang w:val="en-US"/>
         </w:rPr>
@@ -3235,14 +3617,16 @@
       <w:proofErr w:type="spellEnd"/>
       <w:r>
         <w:rPr>
-          <w:sz w:val="24"/>
-          <w:lang w:val="en-US"/>
-        </w:rPr>
-        <w:t xml:space="preserve"> </w:t>
-      </w:r>
-      <w:proofErr w:type="spellStart"/>
-      <w:r>
-        <w:rPr>
+          <w:rFonts w:ascii="Segoe UI" w:hAnsi="Segoe UI" w:cs="Segoe UI"/>
+          <w:sz w:val="24"/>
+          <w:lang w:val="en-US"/>
+        </w:rPr>
+        <w:t xml:space="preserve"> </w:t>
+      </w:r>
+      <w:proofErr w:type="spellStart"/>
+      <w:r>
+        <w:rPr>
+          <w:rFonts w:ascii="Segoe UI" w:hAnsi="Segoe UI" w:cs="Segoe UI"/>
           <w:sz w:val="24"/>
           <w:lang w:val="en-US"/>
         </w:rPr>
@@ -3251,6 +3635,7 @@
       <w:proofErr w:type="spellEnd"/>
       <w:r>
         <w:rPr>
+          <w:rFonts w:ascii="Segoe UI" w:hAnsi="Segoe UI" w:cs="Segoe UI"/>
           <w:sz w:val="24"/>
           <w:lang w:val="en-US"/>
         </w:rPr>
@@ -3265,6 +3650,7 @@
           <w:numId w:val="6"/>
         </w:numPr>
         <w:rPr>
+          <w:rFonts w:ascii="Segoe UI" w:hAnsi="Segoe UI" w:cs="Segoe UI"/>
           <w:sz w:val="24"/>
           <w:u w:val="single"/>
           <w:lang w:val="en-US"/>
@@ -3273,6 +3659,7 @@
       <w:proofErr w:type="spellStart"/>
       <w:r>
         <w:rPr>
+          <w:rFonts w:ascii="Segoe UI" w:hAnsi="Segoe UI" w:cs="Segoe UI"/>
           <w:sz w:val="24"/>
           <w:lang w:val="en-US"/>
         </w:rPr>
@@ -3281,14 +3668,16 @@
       <w:proofErr w:type="spellEnd"/>
       <w:r>
         <w:rPr>
-          <w:sz w:val="24"/>
-          <w:lang w:val="en-US"/>
-        </w:rPr>
-        <w:t xml:space="preserve"> </w:t>
-      </w:r>
-      <w:proofErr w:type="spellStart"/>
-      <w:r>
-        <w:rPr>
+          <w:rFonts w:ascii="Segoe UI" w:hAnsi="Segoe UI" w:cs="Segoe UI"/>
+          <w:sz w:val="24"/>
+          <w:lang w:val="en-US"/>
+        </w:rPr>
+        <w:t xml:space="preserve"> </w:t>
+      </w:r>
+      <w:proofErr w:type="spellStart"/>
+      <w:r>
+        <w:rPr>
+          <w:rFonts w:ascii="Segoe UI" w:hAnsi="Segoe UI" w:cs="Segoe UI"/>
           <w:sz w:val="24"/>
           <w:lang w:val="en-US"/>
         </w:rPr>
@@ -3297,14 +3686,16 @@
       <w:proofErr w:type="spellEnd"/>
       <w:r>
         <w:rPr>
-          <w:sz w:val="24"/>
-          <w:lang w:val="en-US"/>
-        </w:rPr>
-        <w:t xml:space="preserve"> </w:t>
-      </w:r>
-      <w:proofErr w:type="spellStart"/>
-      <w:r>
-        <w:rPr>
+          <w:rFonts w:ascii="Segoe UI" w:hAnsi="Segoe UI" w:cs="Segoe UI"/>
+          <w:sz w:val="24"/>
+          <w:lang w:val="en-US"/>
+        </w:rPr>
+        <w:t xml:space="preserve"> </w:t>
+      </w:r>
+      <w:proofErr w:type="spellStart"/>
+      <w:r>
+        <w:rPr>
+          <w:rFonts w:ascii="Segoe UI" w:hAnsi="Segoe UI" w:cs="Segoe UI"/>
           <w:sz w:val="24"/>
           <w:lang w:val="en-US"/>
         </w:rPr>
@@ -3313,14 +3704,16 @@
       <w:proofErr w:type="spellEnd"/>
       <w:r>
         <w:rPr>
-          <w:sz w:val="24"/>
-          <w:lang w:val="en-US"/>
-        </w:rPr>
-        <w:t xml:space="preserve"> </w:t>
-      </w:r>
-      <w:proofErr w:type="spellStart"/>
-      <w:r>
-        <w:rPr>
+          <w:rFonts w:ascii="Segoe UI" w:hAnsi="Segoe UI" w:cs="Segoe UI"/>
+          <w:sz w:val="24"/>
+          <w:lang w:val="en-US"/>
+        </w:rPr>
+        <w:t xml:space="preserve"> </w:t>
+      </w:r>
+      <w:proofErr w:type="spellStart"/>
+      <w:r>
+        <w:rPr>
+          <w:rFonts w:ascii="Segoe UI" w:hAnsi="Segoe UI" w:cs="Segoe UI"/>
           <w:sz w:val="24"/>
           <w:lang w:val="en-US"/>
         </w:rPr>
@@ -3329,14 +3722,16 @@
       <w:proofErr w:type="spellEnd"/>
       <w:r>
         <w:rPr>
-          <w:sz w:val="24"/>
-          <w:lang w:val="en-US"/>
-        </w:rPr>
-        <w:t xml:space="preserve"> </w:t>
-      </w:r>
-      <w:proofErr w:type="spellStart"/>
-      <w:r>
-        <w:rPr>
+          <w:rFonts w:ascii="Segoe UI" w:hAnsi="Segoe UI" w:cs="Segoe UI"/>
+          <w:sz w:val="24"/>
+          <w:lang w:val="en-US"/>
+        </w:rPr>
+        <w:t xml:space="preserve"> </w:t>
+      </w:r>
+      <w:proofErr w:type="spellStart"/>
+      <w:r>
+        <w:rPr>
+          <w:rFonts w:ascii="Segoe UI" w:hAnsi="Segoe UI" w:cs="Segoe UI"/>
           <w:sz w:val="24"/>
           <w:lang w:val="en-US"/>
         </w:rPr>
@@ -3345,14 +3740,16 @@
       <w:proofErr w:type="spellEnd"/>
       <w:r>
         <w:rPr>
-          <w:sz w:val="24"/>
-          <w:lang w:val="en-US"/>
-        </w:rPr>
-        <w:t xml:space="preserve"> </w:t>
-      </w:r>
-      <w:proofErr w:type="spellStart"/>
-      <w:r>
-        <w:rPr>
+          <w:rFonts w:ascii="Segoe UI" w:hAnsi="Segoe UI" w:cs="Segoe UI"/>
+          <w:sz w:val="24"/>
+          <w:lang w:val="en-US"/>
+        </w:rPr>
+        <w:t xml:space="preserve"> </w:t>
+      </w:r>
+      <w:proofErr w:type="spellStart"/>
+      <w:r>
+        <w:rPr>
+          <w:rFonts w:ascii="Segoe UI" w:hAnsi="Segoe UI" w:cs="Segoe UI"/>
           <w:sz w:val="24"/>
           <w:lang w:val="en-US"/>
         </w:rPr>
@@ -3361,14 +3758,16 @@
       <w:proofErr w:type="spellEnd"/>
       <w:r>
         <w:rPr>
-          <w:sz w:val="24"/>
-          <w:lang w:val="en-US"/>
-        </w:rPr>
-        <w:t xml:space="preserve"> </w:t>
-      </w:r>
-      <w:proofErr w:type="spellStart"/>
-      <w:r>
-        <w:rPr>
+          <w:rFonts w:ascii="Segoe UI" w:hAnsi="Segoe UI" w:cs="Segoe UI"/>
+          <w:sz w:val="24"/>
+          <w:lang w:val="en-US"/>
+        </w:rPr>
+        <w:t xml:space="preserve"> </w:t>
+      </w:r>
+      <w:proofErr w:type="spellStart"/>
+      <w:r>
+        <w:rPr>
+          <w:rFonts w:ascii="Segoe UI" w:hAnsi="Segoe UI" w:cs="Segoe UI"/>
           <w:sz w:val="24"/>
           <w:lang w:val="en-US"/>
         </w:rPr>
@@ -3377,14 +3776,16 @@
       <w:proofErr w:type="spellEnd"/>
       <w:r>
         <w:rPr>
-          <w:sz w:val="24"/>
-          <w:lang w:val="en-US"/>
-        </w:rPr>
-        <w:t xml:space="preserve"> </w:t>
-      </w:r>
-      <w:proofErr w:type="spellStart"/>
-      <w:r>
-        <w:rPr>
+          <w:rFonts w:ascii="Segoe UI" w:hAnsi="Segoe UI" w:cs="Segoe UI"/>
+          <w:sz w:val="24"/>
+          <w:lang w:val="en-US"/>
+        </w:rPr>
+        <w:t xml:space="preserve"> </w:t>
+      </w:r>
+      <w:proofErr w:type="spellStart"/>
+      <w:r>
+        <w:rPr>
+          <w:rFonts w:ascii="Segoe UI" w:hAnsi="Segoe UI" w:cs="Segoe UI"/>
           <w:sz w:val="24"/>
           <w:lang w:val="en-US"/>
         </w:rPr>
@@ -3393,14 +3794,16 @@
       <w:proofErr w:type="spellEnd"/>
       <w:r>
         <w:rPr>
-          <w:sz w:val="24"/>
-          <w:lang w:val="en-US"/>
-        </w:rPr>
-        <w:t xml:space="preserve"> </w:t>
-      </w:r>
-      <w:proofErr w:type="spellStart"/>
-      <w:r>
-        <w:rPr>
+          <w:rFonts w:ascii="Segoe UI" w:hAnsi="Segoe UI" w:cs="Segoe UI"/>
+          <w:sz w:val="24"/>
+          <w:lang w:val="en-US"/>
+        </w:rPr>
+        <w:t xml:space="preserve"> </w:t>
+      </w:r>
+      <w:proofErr w:type="spellStart"/>
+      <w:r>
+        <w:rPr>
+          <w:rFonts w:ascii="Segoe UI" w:hAnsi="Segoe UI" w:cs="Segoe UI"/>
           <w:sz w:val="24"/>
           <w:lang w:val="en-US"/>
         </w:rPr>
@@ -3416,6 +3819,7 @@
           <w:numId w:val="6"/>
         </w:numPr>
         <w:rPr>
+          <w:rFonts w:ascii="Segoe UI" w:hAnsi="Segoe UI" w:cs="Segoe UI"/>
           <w:sz w:val="24"/>
           <w:u w:val="single"/>
           <w:lang w:val="en-US"/>
@@ -3424,6 +3828,7 @@
       <w:proofErr w:type="spellStart"/>
       <w:r>
         <w:rPr>
+          <w:rFonts w:ascii="Segoe UI" w:hAnsi="Segoe UI" w:cs="Segoe UI"/>
           <w:sz w:val="24"/>
           <w:lang w:val="en-US"/>
         </w:rPr>
@@ -3432,14 +3837,16 @@
       <w:proofErr w:type="spellEnd"/>
       <w:r>
         <w:rPr>
-          <w:sz w:val="24"/>
-          <w:lang w:val="en-US"/>
-        </w:rPr>
-        <w:t xml:space="preserve"> </w:t>
-      </w:r>
-      <w:proofErr w:type="spellStart"/>
-      <w:r>
-        <w:rPr>
+          <w:rFonts w:ascii="Segoe UI" w:hAnsi="Segoe UI" w:cs="Segoe UI"/>
+          <w:sz w:val="24"/>
+          <w:lang w:val="en-US"/>
+        </w:rPr>
+        <w:t xml:space="preserve"> </w:t>
+      </w:r>
+      <w:proofErr w:type="spellStart"/>
+      <w:r>
+        <w:rPr>
+          <w:rFonts w:ascii="Segoe UI" w:hAnsi="Segoe UI" w:cs="Segoe UI"/>
           <w:sz w:val="24"/>
           <w:lang w:val="en-US"/>
         </w:rPr>
@@ -3448,6 +3855,7 @@
       <w:proofErr w:type="spellEnd"/>
       <w:r>
         <w:rPr>
+          <w:rFonts w:ascii="Segoe UI" w:hAnsi="Segoe UI" w:cs="Segoe UI"/>
           <w:sz w:val="24"/>
           <w:lang w:val="en-US"/>
         </w:rPr>
@@ -3462,6 +3870,7 @@
           <w:numId w:val="6"/>
         </w:numPr>
         <w:rPr>
+          <w:rFonts w:ascii="Segoe UI" w:hAnsi="Segoe UI" w:cs="Segoe UI"/>
           <w:sz w:val="24"/>
           <w:u w:val="single"/>
           <w:lang w:val="en-US"/>
@@ -3470,6 +3879,7 @@
       <w:proofErr w:type="spellStart"/>
       <w:r>
         <w:rPr>
+          <w:rFonts w:ascii="Segoe UI" w:hAnsi="Segoe UI" w:cs="Segoe UI"/>
           <w:sz w:val="24"/>
           <w:lang w:val="en-US"/>
         </w:rPr>
@@ -3478,14 +3888,16 @@
       <w:proofErr w:type="spellEnd"/>
       <w:r>
         <w:rPr>
-          <w:sz w:val="24"/>
-          <w:lang w:val="en-US"/>
-        </w:rPr>
-        <w:t xml:space="preserve"> </w:t>
-      </w:r>
-      <w:proofErr w:type="spellStart"/>
-      <w:r>
-        <w:rPr>
+          <w:rFonts w:ascii="Segoe UI" w:hAnsi="Segoe UI" w:cs="Segoe UI"/>
+          <w:sz w:val="24"/>
+          <w:lang w:val="en-US"/>
+        </w:rPr>
+        <w:t xml:space="preserve"> </w:t>
+      </w:r>
+      <w:proofErr w:type="spellStart"/>
+      <w:r>
+        <w:rPr>
+          <w:rFonts w:ascii="Segoe UI" w:hAnsi="Segoe UI" w:cs="Segoe UI"/>
           <w:sz w:val="24"/>
           <w:lang w:val="en-US"/>
         </w:rPr>
@@ -3494,14 +3906,16 @@
       <w:proofErr w:type="spellEnd"/>
       <w:r>
         <w:rPr>
-          <w:sz w:val="24"/>
-          <w:lang w:val="en-US"/>
-        </w:rPr>
-        <w:t xml:space="preserve"> </w:t>
-      </w:r>
-      <w:proofErr w:type="spellStart"/>
-      <w:r>
-        <w:rPr>
+          <w:rFonts w:ascii="Segoe UI" w:hAnsi="Segoe UI" w:cs="Segoe UI"/>
+          <w:sz w:val="24"/>
+          <w:lang w:val="en-US"/>
+        </w:rPr>
+        <w:t xml:space="preserve"> </w:t>
+      </w:r>
+      <w:proofErr w:type="spellStart"/>
+      <w:r>
+        <w:rPr>
+          <w:rFonts w:ascii="Segoe UI" w:hAnsi="Segoe UI" w:cs="Segoe UI"/>
           <w:sz w:val="24"/>
           <w:lang w:val="en-US"/>
         </w:rPr>
@@ -3510,14 +3924,16 @@
       <w:proofErr w:type="spellEnd"/>
       <w:r>
         <w:rPr>
-          <w:sz w:val="24"/>
-          <w:lang w:val="en-US"/>
-        </w:rPr>
-        <w:t xml:space="preserve"> </w:t>
-      </w:r>
-      <w:proofErr w:type="spellStart"/>
-      <w:r>
-        <w:rPr>
+          <w:rFonts w:ascii="Segoe UI" w:hAnsi="Segoe UI" w:cs="Segoe UI"/>
+          <w:sz w:val="24"/>
+          <w:lang w:val="en-US"/>
+        </w:rPr>
+        <w:t xml:space="preserve"> </w:t>
+      </w:r>
+      <w:proofErr w:type="spellStart"/>
+      <w:r>
+        <w:rPr>
+          <w:rFonts w:ascii="Segoe UI" w:hAnsi="Segoe UI" w:cs="Segoe UI"/>
           <w:sz w:val="24"/>
           <w:lang w:val="en-US"/>
         </w:rPr>
@@ -3526,14 +3942,16 @@
       <w:proofErr w:type="spellEnd"/>
       <w:r>
         <w:rPr>
-          <w:sz w:val="24"/>
-          <w:lang w:val="en-US"/>
-        </w:rPr>
-        <w:t xml:space="preserve"> </w:t>
-      </w:r>
-      <w:proofErr w:type="spellStart"/>
-      <w:r>
-        <w:rPr>
+          <w:rFonts w:ascii="Segoe UI" w:hAnsi="Segoe UI" w:cs="Segoe UI"/>
+          <w:sz w:val="24"/>
+          <w:lang w:val="en-US"/>
+        </w:rPr>
+        <w:t xml:space="preserve"> </w:t>
+      </w:r>
+      <w:proofErr w:type="spellStart"/>
+      <w:r>
+        <w:rPr>
+          <w:rFonts w:ascii="Segoe UI" w:hAnsi="Segoe UI" w:cs="Segoe UI"/>
           <w:sz w:val="24"/>
           <w:lang w:val="en-US"/>
         </w:rPr>
@@ -3542,6 +3960,7 @@
       <w:proofErr w:type="spellEnd"/>
       <w:r>
         <w:rPr>
+          <w:rFonts w:ascii="Segoe UI" w:hAnsi="Segoe UI" w:cs="Segoe UI"/>
           <w:sz w:val="24"/>
           <w:lang w:val="en-US"/>
         </w:rPr>
@@ -3550,6 +3969,7 @@
       <w:proofErr w:type="spellStart"/>
       <w:r>
         <w:rPr>
+          <w:rFonts w:ascii="Segoe UI" w:hAnsi="Segoe UI" w:cs="Segoe UI"/>
           <w:sz w:val="24"/>
           <w:lang w:val="en-US"/>
         </w:rPr>
@@ -3558,14 +3978,16 @@
       <w:proofErr w:type="spellEnd"/>
       <w:r>
         <w:rPr>
-          <w:sz w:val="24"/>
-          <w:lang w:val="en-US"/>
-        </w:rPr>
-        <w:t xml:space="preserve"> </w:t>
-      </w:r>
-      <w:proofErr w:type="spellStart"/>
-      <w:r>
-        <w:rPr>
+          <w:rFonts w:ascii="Segoe UI" w:hAnsi="Segoe UI" w:cs="Segoe UI"/>
+          <w:sz w:val="24"/>
+          <w:lang w:val="en-US"/>
+        </w:rPr>
+        <w:t xml:space="preserve"> </w:t>
+      </w:r>
+      <w:proofErr w:type="spellStart"/>
+      <w:r>
+        <w:rPr>
+          <w:rFonts w:ascii="Segoe UI" w:hAnsi="Segoe UI" w:cs="Segoe UI"/>
           <w:sz w:val="24"/>
           <w:lang w:val="en-US"/>
         </w:rPr>
@@ -3574,14 +3996,16 @@
       <w:proofErr w:type="spellEnd"/>
       <w:r>
         <w:rPr>
-          <w:sz w:val="24"/>
-          <w:lang w:val="en-US"/>
-        </w:rPr>
-        <w:t xml:space="preserve"> </w:t>
-      </w:r>
-      <w:proofErr w:type="spellStart"/>
-      <w:r>
-        <w:rPr>
+          <w:rFonts w:ascii="Segoe UI" w:hAnsi="Segoe UI" w:cs="Segoe UI"/>
+          <w:sz w:val="24"/>
+          <w:lang w:val="en-US"/>
+        </w:rPr>
+        <w:t xml:space="preserve"> </w:t>
+      </w:r>
+      <w:proofErr w:type="spellStart"/>
+      <w:r>
+        <w:rPr>
+          <w:rFonts w:ascii="Segoe UI" w:hAnsi="Segoe UI" w:cs="Segoe UI"/>
           <w:sz w:val="24"/>
           <w:lang w:val="en-US"/>
         </w:rPr>
@@ -3590,14 +4014,16 @@
       <w:proofErr w:type="spellEnd"/>
       <w:r>
         <w:rPr>
-          <w:sz w:val="24"/>
-          <w:lang w:val="en-US"/>
-        </w:rPr>
-        <w:t xml:space="preserve"> </w:t>
-      </w:r>
-      <w:proofErr w:type="spellStart"/>
-      <w:r>
-        <w:rPr>
+          <w:rFonts w:ascii="Segoe UI" w:hAnsi="Segoe UI" w:cs="Segoe UI"/>
+          <w:sz w:val="24"/>
+          <w:lang w:val="en-US"/>
+        </w:rPr>
+        <w:t xml:space="preserve"> </w:t>
+      </w:r>
+      <w:proofErr w:type="spellStart"/>
+      <w:r>
+        <w:rPr>
+          <w:rFonts w:ascii="Segoe UI" w:hAnsi="Segoe UI" w:cs="Segoe UI"/>
           <w:sz w:val="24"/>
           <w:lang w:val="en-US"/>
         </w:rPr>
@@ -3606,14 +4032,16 @@
       <w:proofErr w:type="spellEnd"/>
       <w:r>
         <w:rPr>
-          <w:sz w:val="24"/>
-          <w:lang w:val="en-US"/>
-        </w:rPr>
-        <w:t xml:space="preserve"> </w:t>
-      </w:r>
-      <w:proofErr w:type="spellStart"/>
-      <w:r>
-        <w:rPr>
+          <w:rFonts w:ascii="Segoe UI" w:hAnsi="Segoe UI" w:cs="Segoe UI"/>
+          <w:sz w:val="24"/>
+          <w:lang w:val="en-US"/>
+        </w:rPr>
+        <w:t xml:space="preserve"> </w:t>
+      </w:r>
+      <w:proofErr w:type="spellStart"/>
+      <w:r>
+        <w:rPr>
+          <w:rFonts w:ascii="Segoe UI" w:hAnsi="Segoe UI" w:cs="Segoe UI"/>
           <w:sz w:val="24"/>
           <w:lang w:val="en-US"/>
         </w:rPr>
@@ -3622,14 +4050,16 @@
       <w:proofErr w:type="spellEnd"/>
       <w:r>
         <w:rPr>
-          <w:sz w:val="24"/>
-          <w:lang w:val="en-US"/>
-        </w:rPr>
-        <w:t xml:space="preserve"> </w:t>
-      </w:r>
-      <w:proofErr w:type="spellStart"/>
-      <w:r>
-        <w:rPr>
+          <w:rFonts w:ascii="Segoe UI" w:hAnsi="Segoe UI" w:cs="Segoe UI"/>
+          <w:sz w:val="24"/>
+          <w:lang w:val="en-US"/>
+        </w:rPr>
+        <w:t xml:space="preserve"> </w:t>
+      </w:r>
+      <w:proofErr w:type="spellStart"/>
+      <w:r>
+        <w:rPr>
+          <w:rFonts w:ascii="Segoe UI" w:hAnsi="Segoe UI" w:cs="Segoe UI"/>
           <w:sz w:val="24"/>
           <w:lang w:val="en-US"/>
         </w:rPr>
@@ -3638,14 +4068,16 @@
       <w:proofErr w:type="spellEnd"/>
       <w:r>
         <w:rPr>
-          <w:sz w:val="24"/>
-          <w:lang w:val="en-US"/>
-        </w:rPr>
-        <w:t xml:space="preserve"> </w:t>
-      </w:r>
-      <w:proofErr w:type="spellStart"/>
-      <w:r>
-        <w:rPr>
+          <w:rFonts w:ascii="Segoe UI" w:hAnsi="Segoe UI" w:cs="Segoe UI"/>
+          <w:sz w:val="24"/>
+          <w:lang w:val="en-US"/>
+        </w:rPr>
+        <w:t xml:space="preserve"> </w:t>
+      </w:r>
+      <w:proofErr w:type="spellStart"/>
+      <w:r>
+        <w:rPr>
+          <w:rFonts w:ascii="Segoe UI" w:hAnsi="Segoe UI" w:cs="Segoe UI"/>
           <w:sz w:val="24"/>
           <w:lang w:val="en-US"/>
         </w:rPr>
@@ -3654,14 +4086,16 @@
       <w:proofErr w:type="spellEnd"/>
       <w:r>
         <w:rPr>
-          <w:sz w:val="24"/>
-          <w:lang w:val="en-US"/>
-        </w:rPr>
-        <w:t xml:space="preserve"> </w:t>
-      </w:r>
-      <w:proofErr w:type="spellStart"/>
-      <w:r>
-        <w:rPr>
+          <w:rFonts w:ascii="Segoe UI" w:hAnsi="Segoe UI" w:cs="Segoe UI"/>
+          <w:sz w:val="24"/>
+          <w:lang w:val="en-US"/>
+        </w:rPr>
+        <w:t xml:space="preserve"> </w:t>
+      </w:r>
+      <w:proofErr w:type="spellStart"/>
+      <w:r>
+        <w:rPr>
+          <w:rFonts w:ascii="Segoe UI" w:hAnsi="Segoe UI" w:cs="Segoe UI"/>
           <w:sz w:val="24"/>
           <w:lang w:val="en-US"/>
         </w:rPr>
@@ -3672,6 +4106,7 @@
     <w:p>
       <w:pPr>
         <w:rPr>
+          <w:rFonts w:ascii="Segoe UI" w:hAnsi="Segoe UI" w:cs="Segoe UI"/>
           <w:lang w:val="en-US"/>
         </w:rPr>
       </w:pPr>

</xml_diff>

<commit_message>
adding Customer Usecase.vsdx, SRS Tham khao.pdf, SRS.docx
</commit_message>
<xml_diff>
--- a/Documents/Features List.docx
+++ b/Documents/Features List.docx
@@ -4,136 +4,65 @@
   <w:body>
     <w:p>
       <w:pPr>
+        <w:pStyle w:val="Title"/>
         <w:jc w:val="center"/>
-        <w:rPr>
-          <w:rFonts w:ascii="Segoe UI" w:hAnsi="Segoe UI" w:cs="Segoe UI"/>
-          <w:sz w:val="40"/>
-          <w:lang w:val="en-US"/>
-        </w:rPr>
-      </w:pPr>
-      <w:proofErr w:type="spellStart"/>
-      <w:r>
-        <w:rPr>
-          <w:rFonts w:ascii="Segoe UI" w:hAnsi="Segoe UI" w:cs="Segoe UI"/>
-          <w:sz w:val="40"/>
-          <w:lang w:val="en-US"/>
-        </w:rPr>
-        <w:t>Đồ</w:t>
-      </w:r>
-      <w:proofErr w:type="spellEnd"/>
-      <w:r>
-        <w:rPr>
-          <w:rFonts w:ascii="Segoe UI" w:hAnsi="Segoe UI" w:cs="Segoe UI"/>
-          <w:sz w:val="40"/>
-          <w:lang w:val="en-US"/>
-        </w:rPr>
-        <w:t xml:space="preserve"> </w:t>
-      </w:r>
-      <w:proofErr w:type="spellStart"/>
-      <w:proofErr w:type="gramStart"/>
-      <w:r>
-        <w:rPr>
-          <w:rFonts w:ascii="Segoe UI" w:hAnsi="Segoe UI" w:cs="Segoe UI"/>
-          <w:sz w:val="40"/>
-          <w:lang w:val="en-US"/>
-        </w:rPr>
-        <w:t>án</w:t>
-      </w:r>
-      <w:proofErr w:type="spellEnd"/>
-      <w:proofErr w:type="gramEnd"/>
-      <w:r>
-        <w:rPr>
-          <w:rFonts w:ascii="Segoe UI" w:hAnsi="Segoe UI" w:cs="Segoe UI"/>
-          <w:sz w:val="40"/>
-          <w:lang w:val="en-US"/>
-        </w:rPr>
-        <w:t xml:space="preserve"> </w:t>
-      </w:r>
-      <w:proofErr w:type="spellStart"/>
-      <w:r>
-        <w:rPr>
-          <w:rFonts w:ascii="Segoe UI" w:hAnsi="Segoe UI" w:cs="Segoe UI"/>
-          <w:sz w:val="40"/>
-          <w:lang w:val="en-US"/>
-        </w:rPr>
-        <w:t>chuyên</w:t>
-      </w:r>
-      <w:proofErr w:type="spellEnd"/>
-      <w:r>
-        <w:rPr>
-          <w:rFonts w:ascii="Segoe UI" w:hAnsi="Segoe UI" w:cs="Segoe UI"/>
-          <w:sz w:val="40"/>
-          <w:lang w:val="en-US"/>
-        </w:rPr>
-        <w:t xml:space="preserve"> </w:t>
-      </w:r>
-      <w:proofErr w:type="spellStart"/>
-      <w:r>
-        <w:rPr>
-          <w:rFonts w:ascii="Segoe UI" w:hAnsi="Segoe UI" w:cs="Segoe UI"/>
-          <w:sz w:val="40"/>
-          <w:lang w:val="en-US"/>
-        </w:rPr>
-        <w:t>nghành</w:t>
-      </w:r>
-      <w:proofErr w:type="spellEnd"/>
+      </w:pPr>
+      <w:r>
+        <w:t>Đồ án chuyên nghành</w:t>
+      </w:r>
     </w:p>
     <w:p>
       <w:pPr>
+        <w:pStyle w:val="Title"/>
         <w:jc w:val="center"/>
         <w:rPr>
+          <w:sz w:val="50"/>
+          <w:lang w:val="en-US"/>
+        </w:rPr>
+      </w:pPr>
+      <w:bookmarkStart w:id="0" w:name="_GoBack"/>
+      <w:proofErr w:type="spellStart"/>
+      <w:r>
+        <w:rPr>
+          <w:sz w:val="50"/>
+          <w:lang w:val="en-US"/>
+        </w:rPr>
+        <w:t>Đặt</w:t>
+      </w:r>
+      <w:proofErr w:type="spellEnd"/>
+      <w:r>
+        <w:rPr>
+          <w:sz w:val="50"/>
+          <w:lang w:val="en-US"/>
+        </w:rPr>
+        <w:t xml:space="preserve"> </w:t>
+      </w:r>
+      <w:proofErr w:type="spellStart"/>
+      <w:r>
+        <w:rPr>
+          <w:sz w:val="50"/>
+          <w:lang w:val="en-US"/>
+        </w:rPr>
+        <w:t>món</w:t>
+      </w:r>
+      <w:proofErr w:type="spellEnd"/>
+      <w:r>
+        <w:rPr>
+          <w:sz w:val="50"/>
+          <w:lang w:val="en-US"/>
+        </w:rPr>
+        <w:t xml:space="preserve"> online</w:t>
+      </w:r>
+    </w:p>
+    <w:bookmarkEnd w:id="0"/>
+    <w:p>
+      <w:pPr>
+        <w:rPr>
           <w:rFonts w:ascii="Segoe UI" w:hAnsi="Segoe UI" w:cs="Segoe UI"/>
           <w:sz w:val="34"/>
           <w:lang w:val="en-US"/>
         </w:rPr>
       </w:pPr>
-      <w:proofErr w:type="spellStart"/>
-      <w:r>
-        <w:rPr>
-          <w:rFonts w:ascii="Segoe UI" w:hAnsi="Segoe UI" w:cs="Segoe UI"/>
-          <w:sz w:val="34"/>
-          <w:lang w:val="en-US"/>
-        </w:rPr>
-        <w:t>Đặt</w:t>
-      </w:r>
-      <w:proofErr w:type="spellEnd"/>
-      <w:r>
-        <w:rPr>
-          <w:rFonts w:ascii="Segoe UI" w:hAnsi="Segoe UI" w:cs="Segoe UI"/>
-          <w:sz w:val="34"/>
-          <w:lang w:val="en-US"/>
-        </w:rPr>
-        <w:t xml:space="preserve"> </w:t>
-      </w:r>
-      <w:proofErr w:type="spellStart"/>
-      <w:r>
-        <w:rPr>
-          <w:rFonts w:ascii="Segoe UI" w:hAnsi="Segoe UI" w:cs="Segoe UI"/>
-          <w:sz w:val="34"/>
-          <w:lang w:val="en-US"/>
-        </w:rPr>
-        <w:t>món</w:t>
-      </w:r>
-      <w:proofErr w:type="spellEnd"/>
-      <w:r>
-        <w:rPr>
-          <w:rFonts w:ascii="Segoe UI" w:hAnsi="Segoe UI" w:cs="Segoe UI"/>
-          <w:sz w:val="34"/>
-          <w:lang w:val="en-US"/>
-        </w:rPr>
-        <w:t xml:space="preserve"> online</w:t>
-      </w:r>
-    </w:p>
-    <w:p>
-      <w:pPr>
-        <w:rPr>
-          <w:rFonts w:ascii="Segoe UI" w:hAnsi="Segoe UI" w:cs="Segoe UI"/>
-          <w:sz w:val="34"/>
-          <w:lang w:val="en-US"/>
-        </w:rPr>
-      </w:pPr>
-      <w:bookmarkStart w:id="0" w:name="_GoBack"/>
-      <w:bookmarkEnd w:id="0"/>
     </w:p>
     <w:p>
       <w:pPr>
@@ -1891,17 +1820,16 @@
           <w:lang w:val="en-US"/>
         </w:rPr>
       </w:pPr>
-      <w:proofErr w:type="spellStart"/>
-      <w:r>
-        <w:rPr>
-          <w:rFonts w:ascii="Segoe UI" w:hAnsi="Segoe UI" w:cs="Segoe UI"/>
+      <w:r>
+        <w:rPr>
+          <w:rFonts w:ascii="Segoe UI" w:hAnsi="Segoe UI" w:cs="Segoe UI"/>
+          <w:noProof/>
           <w:sz w:val="24"/>
           <w:u w:val="single"/>
           <w:lang w:val="en-US"/>
         </w:rPr>
         <w:t>Phần</w:t>
       </w:r>
-      <w:proofErr w:type="spellEnd"/>
       <w:r>
         <w:rPr>
           <w:rFonts w:ascii="Segoe UI" w:hAnsi="Segoe UI" w:cs="Segoe UI"/>
@@ -3186,16 +3114,13 @@
         </w:rPr>
         <w:t xml:space="preserve"> </w:t>
       </w:r>
-      <w:proofErr w:type="spellStart"/>
-      <w:r>
-        <w:rPr>
-          <w:rFonts w:ascii="Segoe UI" w:hAnsi="Segoe UI" w:cs="Segoe UI"/>
-          <w:sz w:val="24"/>
-          <w:lang w:val="en-US"/>
+      <w:r>
+        <w:rPr>
+          <w:rFonts w:ascii="Segoe UI" w:hAnsi="Segoe UI" w:cs="Segoe UI"/>
+          <w:sz w:val="24"/>
         </w:rPr>
         <w:t>ăn</w:t>
       </w:r>
-      <w:proofErr w:type="spellEnd"/>
       <w:r>
         <w:rPr>
           <w:rFonts w:ascii="Segoe UI" w:hAnsi="Segoe UI" w:cs="Segoe UI"/>
@@ -5200,6 +5125,75 @@
       <w:contextualSpacing/>
     </w:pPr>
   </w:style>
+  <w:style w:type="paragraph" w:styleId="IntenseQuote">
+    <w:name w:val="Intense Quote"/>
+    <w:basedOn w:val="Normal"/>
+    <w:next w:val="Normal"/>
+    <w:link w:val="IntenseQuoteChar"/>
+    <w:uiPriority w:val="30"/>
+    <w:qFormat/>
+    <w:rsid w:val="00343D39"/>
+    <w:pPr>
+      <w:pBdr>
+        <w:top w:val="single" w:sz="4" w:space="10" w:color="5B9BD5" w:themeColor="accent1"/>
+        <w:bottom w:val="single" w:sz="4" w:space="10" w:color="5B9BD5" w:themeColor="accent1"/>
+      </w:pBdr>
+      <w:spacing w:before="360" w:after="360"/>
+      <w:ind w:left="864" w:right="864"/>
+      <w:jc w:val="center"/>
+    </w:pPr>
+    <w:rPr>
+      <w:i/>
+      <w:iCs/>
+      <w:color w:val="5B9BD5" w:themeColor="accent1"/>
+    </w:rPr>
+  </w:style>
+  <w:style w:type="character" w:customStyle="1" w:styleId="IntenseQuoteChar">
+    <w:name w:val="Intense Quote Char"/>
+    <w:basedOn w:val="DefaultParagraphFont"/>
+    <w:link w:val="IntenseQuote"/>
+    <w:uiPriority w:val="30"/>
+    <w:rsid w:val="00343D39"/>
+    <w:rPr>
+      <w:i/>
+      <w:iCs/>
+      <w:color w:val="5B9BD5" w:themeColor="accent1"/>
+    </w:rPr>
+  </w:style>
+  <w:style w:type="paragraph" w:styleId="Title">
+    <w:name w:val="Title"/>
+    <w:basedOn w:val="Normal"/>
+    <w:next w:val="Normal"/>
+    <w:link w:val="TitleChar"/>
+    <w:uiPriority w:val="10"/>
+    <w:qFormat/>
+    <w:rsid w:val="00343D39"/>
+    <w:pPr>
+      <w:spacing w:after="0" w:line="240" w:lineRule="auto"/>
+      <w:contextualSpacing/>
+    </w:pPr>
+    <w:rPr>
+      <w:rFonts w:asciiTheme="majorHAnsi" w:eastAsiaTheme="majorEastAsia" w:hAnsiTheme="majorHAnsi" w:cstheme="majorBidi"/>
+      <w:spacing w:val="-10"/>
+      <w:kern w:val="28"/>
+      <w:sz w:val="56"/>
+      <w:szCs w:val="56"/>
+    </w:rPr>
+  </w:style>
+  <w:style w:type="character" w:customStyle="1" w:styleId="TitleChar">
+    <w:name w:val="Title Char"/>
+    <w:basedOn w:val="DefaultParagraphFont"/>
+    <w:link w:val="Title"/>
+    <w:uiPriority w:val="10"/>
+    <w:rsid w:val="00343D39"/>
+    <w:rPr>
+      <w:rFonts w:asciiTheme="majorHAnsi" w:eastAsiaTheme="majorEastAsia" w:hAnsiTheme="majorHAnsi" w:cstheme="majorBidi"/>
+      <w:spacing w:val="-10"/>
+      <w:kern w:val="28"/>
+      <w:sz w:val="56"/>
+      <w:szCs w:val="56"/>
+    </w:rPr>
+  </w:style>
 </w:styles>
 </file>
 

</xml_diff>